<commit_message>
Sync camera sketch with release; fix methodology edition and OT section
- examples/HalowVideoP2P_STA: now identical to the release source
  (ROLE_SWAP 1, PWRCTL 20-30 dB, TX_POWER_DBM 3, VAR_SWEEP_NS)
- economics: methodology cited as 6th ed., IVAKO Analitik, 2008, 44 p.
  (as in the department samples; the 26.2 % norm is from 2008 tariffs)
- labour protection: noise norm 50 dBA for research/programming work
  (SanPiN 1.2.3685-21) instead of 80; PUE clause 1.1.13 for the
  electrical class; fire hazard class F1.3 and why SP 12.13130
  categories do not apply to a residential room
- both docx rebuilt from the scripts

Co-Authored-By: Claude Opus 5.5 <noreply@anthropic.com>
Claude-Session: https://claude.ai/code/session_01F7zWgPWK1QF4RLkRPrjcGv
</commit_message>
<xml_diff>
--- a/docs/ekonomika/Ekonomicheskaya_chast_HaLow.docx
+++ b/docs/ekonomika/Ekonomicheskaya_chast_HaLow.docx
@@ -23210,7 +23210,7 @@
     </w:tbl>
     <w:p>
       <w:r>
-        <w:t>Норматив 26,2 %, приведённый в методических указаниях [Э4], соответствовал тарифам 2008 г.; в расчёте применены тарифы, действующие в 2026 г.</w:t>
+        <w:t>Норматив 26,2 %, приведённый в методических указаниях [Э4], соответствует тарифам на момент их издания (2008 г.); в расчёте применены тарифы, действующие в 2026 г.</w:t>
       </w:r>
     </w:p>
     <w:p>
@@ -29535,7 +29535,7 @@
         <w:jc w:val="left"/>
       </w:pPr>
       <w:r>
-        <w:t>[Э4] Панагушин В. П., Ковалева Т. С., Малютина О. А., Михайловская Н. М., Прозорова В. С., Чайка Н. К. Экономическое обоснование дипломных проектов (работ) по приборо- и радиоприборостроению: методические указания / под ред. В. П. Панагушина. – 7-е изд., испр. и доп. – М.: ИВАКО Аналитик, 2024. – 43 с.</w:t>
+        <w:t>[Э4] Панагушин В. П., Ковалева Т. С., Малютина О. А., Михайловская Н. М., Прозорова В. С., Чайка Н. К. Экономическое обоснование дипломных проектов (работ) по приборо- и радиоприборостроению: методические указания / под ред. В. П. Панагушина. – 6-е изд., испр. и доп. – М.: ИВАКО Аналитик, 2008. – 44 с.</w:t>
       </w:r>
     </w:p>
     <w:p>

</xml_diff>

<commit_message>
Thesis: GKRCh per decision text, why-experiment, plain wording, comparison charts
- GKRCh: 866-868 MHz is annex 11 (added by 18-46-03-1): 25 mW ERP and
  1000 mW/MHz, 1 % or LBT, banned within aerodromes; 2.4 GHz annex 2:
  100 mW EIRP at <=10 mW/MHz; edition of 24.12.2018
- 50 m altitude stated as an example; breakpoint +17.4 m per metre
- sixth reason for the experiment (published data taken under other
  conditions, effects proven only by paired runs); why-experiment slide
  rebuilt as six cards; "a week without link" removed
- no "release", "run", "table-top", start window, host, rainbow etc.;
  lab stage described as indoors up to 5 m; 3 m -> 5 m margin
- new figures: rate vs range (HaLow, Wi-Fi 2.4 GHz ESP32-S3, LoRa),
  rate-by-distance heatmap for free space / ground / 50 m, concrete wall
  loss; in section 3.7 and on two slides (deck: 18 slides)

Co-Authored-By: Claude Opus 5.5 <noreply@anthropic.com>
Claude-Session: https://claude.ai/code/session_01F7zWgPWK1QF4RLkRPrjcGv
</commit_message>
<xml_diff>
--- a/docs/ekonomika/Ekonomicheskaya_chast_HaLow.docx
+++ b/docs/ekonomika/Ekonomicheskaya_chast_HaLow.docx
@@ -35,7 +35,7 @@
     </w:p>
     <w:p>
       <w:r>
-        <w:t>Помимо используемой в работе платы LilyGO T-HaLow на чипсете Taixin стоимостью 3 198 руб. [27] на рынке представлены платы и оценочные комплекты на чипсетах Newracom, требующие внешнего хост-компьютера или поставляемые по запросу [28, 29, 30], и Morse Micro. Единственный оценочный комплект производителя чипсета с открытой ценой и поставкой в Российскую Федерацию — Morse Micro MM6108-EKH05 стоимостью 39 620 руб. [31]. За базу для сравнения принят распространённый подход к оценке Wi-Fi HaLow — испытания по методике производителя на таких комплектах: измерение дальности и пропускной способности без сопоставления с теоретической оценкой и без сравнения с IEEE 802.11 в идентичных условиях.</w:t>
+        <w:t>Помимо используемой в работе платы LilyGO T-HaLow на чипсете Taixin стоимостью 3 198 руб. [28] на рынке представлены платы и оценочные комплекты на чипсетах Newracom, требующие внешнего управляющего компьютера или поставляемые по запросу [29, 30, 31], и Morse Micro. Единственный оценочный комплект производителя чипсета с открытой ценой и поставкой в Российскую Федерацию — Morse Micro MM6108-EKH05 стоимостью 39 620 руб. [32]. За базу для сравнения принят распространённый подход к оценке Wi-Fi HaLow — испытания по методике производителя на таких комплектах: измерение дальности и пропускной способности без сопоставления с теоретической оценкой и без сравнения с IEEE 802.11 в идентичных условиях.</w:t>
       </w:r>
     </w:p>
     <w:p>
@@ -6314,7 +6314,7 @@
     </w:p>
     <w:p>
       <w:r>
-        <w:t>Материальные затраты включают покупные комплектующие изделия для экспериментального стенда и канцелярские товары (таблица 4.5), а также электроэнергию. Две платы LilyGO T-HaLow образуют канал «точка — точка»: передающая плата с камерой OV5640 работает в режиме точки доступа, приёмная — в режиме станции. Цена платы 37,98 долл. США [27] по курсу Банка России 84,1975 руб./долл. на 20.09.2026 [44] составляет 3 198 руб. Микросхемы флеш-памяти и программатор нужны для резервного копирования и восстановления встроенного программного обеспечения радиомодуля TX-AH [45], аккумуляторы — для автономного питания плат на полевой площадке, штативы — для фиксации высоты антенн. Цены остальных позиций — средние розничные на сентябрь 2026 г.; канцелярские товары рассчитаны на печать около 2 500 листов.</w:t>
+        <w:t>Материальные затраты включают покупные комплектующие изделия для экспериментального стенда и канцелярские товары (таблица 4.5), а также электроэнергию. Две платы LilyGO T-HaLow образуют канал «точка — точка»: передающая плата с камерой OV5640 работает в режиме точки доступа, приёмная — в режиме станции. Цена платы 37,98 долл. США [28] по курсу Банка России 84,1975 руб./долл. на 20.09.2026 [44] составляет 3 198 руб. Микросхемы флеш-памяти и программатор нужны для резервного копирования и восстановления встроенного программного обеспечения радиомодуля TX-AH [45], аккумуляторы — для автономного питания плат на полевой площадке, штативы — для фиксации высоты антенн. Цены остальных позиций — средние розничные на сентябрь 2026 г.; канцелярские товары рассчитаны на печать около 2 500 листов.</w:t>
       </w:r>
     </w:p>
     <w:p>
@@ -10244,7 +10244,7 @@
         </m:r>
       </m:oMath>
       <w:r>
-        <w:t xml:space="preserve"> руб. Срок поставки комплектов 7–8 недель [31] в денежном выражении не учитывается, что идёт в запас оценки. Экономический эффект:</w:t>
+        <w:t xml:space="preserve"> руб. Срок поставки комплектов 7–8 недель [32] в денежном выражении не учитывается, что идёт в запас оценки. Экономический эффект:</w:t>
       </w:r>
     </w:p>
     <w:p>

</xml_diff>

<commit_message>
Thesis: sources per GOST R 7.0.100-2018, proofreading, slides in line with text
- 63 of 71 references reformatted (author heading, ' : ', full city names,
  content type, '// Site : [site]'); CH341A programmer restored as its own
  source
- ~65 text fixes: duplicate sentence, number mismatches (MCS floor 1.5-2x
  speed and 1.7-5x lower loss; RTS 1.8-2.2x; price 1.8-12.4x), colloquial
  wording, terms, unexplained formula symbols, frequency wording
- slides synced with the proofread numbers and wording

Co-Authored-By: Claude Opus 5.5 <noreply@anthropic.com>
Claude-Session: https://claude.ai/code/session_01F7zWgPWK1QF4RLkRPrjcGv
</commit_message>
<xml_diff>
--- a/docs/ekonomika/Ekonomicheskaya_chast_HaLow.docx
+++ b/docs/ekonomika/Ekonomicheskaya_chast_HaLow.docx
@@ -40,7 +40,7 @@
     </w:p>
     <w:p>
       <w:r>
-        <w:t>Базовый вариант воспроизводит известные испытания, его результаты привязаны к конкретному комплекту и применимы на уровне отдельного предприятия после адаптации в срок 3–5 лет: новизна — 3 балла («приближается к мировым достижениям»), перспективность — 5 («важная»), возможность применения — 3. В настоящей работе теоретические модели распространения радиоволн проверяются натурно с определением их параметров и границ применимости, а Wi-Fi HaLow сравнивается с IEEE 802.11 на одной аппаратной платформе (ESP32-S3 имеет собственный радиотракт 2,4 ГГц), что исключает влияние различий оборудования, — 5 баллов; более высокая оценка не принята, так как исследована статичная конфигурация «точка — точка». Результаты непосредственно используются при проектировании каналов связи с БПЛА, а натурных данных для серийных модулей Wi-Fi HaLow, появившихся в 2024–2025 гг., немного, — 7 баллов. Результаты получены на серийной платформе и применимы разработчиками систем связи БПЛА на уровне отрасли в срок до 3 лет — 8 баллов. Значимость признаков принята по [39], результаты оценки сведены в таблицу 4.1.</w:t>
+        <w:t>Базовый вариант воспроизводит известные испытания, его результаты привязаны к конкретному комплекту и применимы на уровне отдельного предприятия после адаптации в срок 3–5 лет: новизна — 3 балла («приближается к мировым достижениям»), перспективность — 5 («важная»), возможность применения — 3. В настоящей работе теоретические модели распространения радиоволн проверяются экспериментально с определением их параметров и границ применимости, а Wi-Fi HaLow сравнивается с IEEE 802.11 на одной аппаратной платформе (ESP32-S3 имеет собственный радиотракт 2,4 ГГц), что исключает влияние различий оборудования, — 5 баллов; более высокая оценка не принята, так как исследована статичная конфигурация «точка — точка». Результаты непосредственно используются при проектировании каналов связи с БПЛА, а натурных данных для серийных модулей Wi-Fi HaLow, появившихся в 2024–2025 гг., немного, — 7 баллов. Результаты получены на серийной платформе и применимы разработчиками систем связи БПЛА на уровне отрасли в срок до 3 лет — 8 баллов. Значимость признаков принята по [39], результаты оценки сведены в таблицу 4.1.</w:t>
       </w:r>
     </w:p>
     <w:p>
@@ -1920,7 +1920,7 @@
     </w:p>
     <w:p>
       <w:r>
-        <w:t>Состав работ определён по разделам и этапам задания на ВКР, удельный вес трудоёмкости стадий принят по заданию. Общая трудоёмкость НИР T = 800 чел.-ч определена экспертно как сумма трудоёмкостей работ исполнителей: Р — руководитель НИР, И — инженер-исследователь, П — инженер-программист, Т — техник. Во вторую стадию входят теоретическая оценка канала, разработка программы и методики экспериментов, обновление встроенного программного обеспечения радиомодуля TX-AH, разработка программного обеспечения передатчика и приёмника и отладка стенда; в третью — измерения характеристик Wi-Fi HaLow и IEEE 802.11 на одной аппаратной платформе и обработка результатов.</w:t>
+        <w:t>Состав работ определён по разделам и этапам задания на ВКР, удельный вес трудоёмкости стадий принят по заданию. Общая трудоёмкость НИР T = 800 чел.-ч определена экспертно как сумма трудоёмкостей работ исполнителей: Р — руководитель НИР, И — инженер-исследователь, П — инженер-программист, Т — техник. Во вторую стадию входят теоретическая оценка канала, разработка программы и методики экспериментов, обновление встроенного программного обеспечения радиомодуля TX-AH, разработка программного обеспечения передатчика и приёмника и отладка стенда; в третью — измерения характеристик Wi-Fi HaLow, их сравнение с IEEE 802.11 на одной аппаратной платформе и обработка результатов.</w:t>
       </w:r>
     </w:p>
     <w:p>
@@ -6314,7 +6314,7 @@
     </w:p>
     <w:p>
       <w:r>
-        <w:t>Материальные затраты включают покупные комплектующие изделия для экспериментального стенда и канцелярские товары (таблица 4.5), а также электроэнергию. Две платы LilyGO T-HaLow образуют канал «точка — точка»: передающая плата с камерой OV5640 работает в режиме точки доступа, приёмная — в режиме станции. Цена платы 37,98 долл. США [28] по курсу Банка России 84,1975 руб./долл. на 20.09.2026 [44] составляет 3 198 руб. Микросхемы флеш-памяти и программатор нужны для резервного копирования и восстановления встроенного программного обеспечения радиомодуля TX-AH [45], аккумуляторы — для автономного питания плат на полевой площадке, штативы — для фиксации высоты антенн. Цены остальных позиций — средние розничные на сентябрь 2026 г.; канцелярские товары рассчитаны на печать около 2 500 листов.</w:t>
+        <w:t>Материальные затраты включают покупные комплектующие изделия для экспериментального стенда и канцелярские товары (таблица 4.5), а также электроэнергию. Две платы LilyGO T-HaLow образуют канал «точка — точка»: передающая плата с камерой OV5640 работает в режиме точки доступа, приёмная — в режиме станции. Цена платы 37,98 долл. США [28] по курсу Банка России 84,1975 руб./долл. на 20.09.2026 [44] составляет 3 198 руб. Микросхемы флеш-памяти и программатор нужны для резервного копирования и восстановления встроенного программного обеспечения радиомодуля TX-AH [45, 46], аккумуляторы — для автономного питания плат на полевой площадке, штативы — для фиксации высоты антенн. Цены остальных позиций — средние розничные на сентябрь 2026 г.; канцелярские товары рассчитаны на печать около 2 500 листов.</w:t>
       </w:r>
     </w:p>
     <w:p>
@@ -8066,7 +8066,7 @@
         </m:sSub>
       </m:oMath>
       <w:r>
-        <w:t xml:space="preserve"> – тариф в г. Москве с 01.10.2026, руб./(кВт·ч) [46]. Материальные затраты составляют 15 910 + 11 650 + 929 = 28 489 руб.</w:t>
+        <w:t xml:space="preserve"> – тариф в г. Москве с 01.10.2026, руб./(кВт·ч) [47]. Материальные затраты составляют 15 910 + 11 650 + 929 = 28 489 руб.</w:t>
       </w:r>
     </w:p>
     <w:p>
@@ -8109,7 +8109,7 @@
         </m:r>
       </m:oMath>
       <w:r>
-        <w:t xml:space="preserve"> руб., срок полезного использования 3 года — вторая амортизационная группа [47]) начисляется линейным способом пропорционально времени работы:</w:t>
+        <w:t xml:space="preserve"> руб., срок полезного использования 3 года — вторая амортизационная группа [48]) начисляется линейным способом пропорционально времени работы:</w:t>
       </w:r>
     </w:p>
     <w:p>

</xml_diff>

<commit_message>
Thesis: full publication data for normative references, methodology 7th ed. 2024, drop unused LoRa source, rebuild
Co-Authored-By: Claude Opus 5.5 <noreply@anthropic.com>
Claude-Session: https://claude.ai/code/session_01F7zWgPWK1QF4RLkRPrjcGv
</commit_message>
<xml_diff>
--- a/docs/ekonomika/Ekonomicheskaya_chast_HaLow.docx
+++ b/docs/ekonomika/Ekonomicheskaya_chast_HaLow.docx
@@ -12,12 +12,12 @@
     </w:p>
     <w:p>
       <w:r>
-        <w:t>Тема ВКР — «Разработка предложений по увеличению дальности и надежности передачи данных с борта беспилотного летательного аппарата». Цель работы — анализ эффективности технологии Wi-Fi HaLow (IEEE 802.11ah) [6] на платформе LilyGO T-HaLow (микроконтроллер ESP32-S3 и радиомодуль TX-AH-R900P) по сравнению с традиционными протоколами Wi-Fi по дальности, уровню сигнала, задержке и потерям пакетов; исследование выполняется на экспериментальной системе передачи видео по каналу «точка — точка» из двух таких плат. По характеру работ ВКР является научно-исследовательской работой (НИР). Её научно-технической продукцией (НТПр) являются экспериментально определённые характеристики канала Wi-Fi HaLow (уровень сигнала, пропускная способность, задержка и потери пакетов), их сопоставление с теоретической оценкой и с IEEE 802.11 на той же аппаратной платформе, а также рекомендации по применению технологии для связи с БПЛА.</w:t>
+        <w:t>Тема ВКР — «Разработка предложений по увеличению дальности и надежности передачи данных с борта беспилотного летательного аппарата». Цель работы — анализ эффективности технологии Wi-Fi HaLow (IEEE 802.11ah) [7] на платформе LilyGO T-HaLow (микроконтроллер ESP32-S3 и радиомодуль TX-AH-R900P) по сравнению с традиционными протоколами Wi-Fi по дальности, уровню сигнала, задержке и потерям пакетов; исследование выполняется на экспериментальной системе передачи видео по каналу «точка — точка» из двух таких плат. По характеру работ ВКР является научно-исследовательской работой (НИР). Её научно-технической продукцией (НТПр) являются экспериментально определённые характеристики канала Wi-Fi HaLow (уровень сигнала, пропускная способность, задержка и потери пакетов), их сопоставление с теоретической оценкой и с IEEE 802.11 на той же аппаратной платформе, а также рекомендации по применению технологии для связи с БПЛА. Программы, написанные в ходе работы (доработка встроенного программного обеспечения плат, программа приёма и записи видео), служат средствами проведения эксперимента и самостоятельным программным продуктом не являются.</w:t>
       </w:r>
     </w:p>
     <w:p>
       <w:r>
-        <w:t>Целью экономической части является технико-экономическое обоснование НИР по методике [39]: оценка её целесообразности по индексу научно-технической прогрессивности, планирование работ, определение затрат, себестоимости, цены и рентабельности, оценка экономической эффективности и срока окупаемости. Расчёты выполнены в ценах сентября 2026 г. для работы, выполняемой в г. Москве.</w:t>
+        <w:t>Целью экономической части является технико-экономическое обоснование НИР по методике [38]: оценка её целесообразности по индексу научно-технической прогрессивности, планирование работ, определение затрат, себестоимости, цены и рентабельности, оценка экономической эффективности и срока окупаемости. Расчёты выполнены в ценах сентября 2026 г. для работы, выполняемой в г. Москве.</w:t>
       </w:r>
     </w:p>
     <w:p>
@@ -30,17 +30,17 @@
     </w:p>
     <w:p>
       <w:r>
-        <w:t>Целесообразность НИР оценивается индексом научно-технической прогрессивности, который определяется сравнением НТПр с аналогом, выбранным за базу для сравнения. Сравнение выполняется методом балльных оценок по трём признакам: научно-технический уровень (новизна), перспективность и возможность применения результатов; баллы назначаются по нормативным шкалам [39].</w:t>
+        <w:t>Целесообразность НИР оценивается индексом научно-технической прогрессивности, который определяется сравнением НТПр с аналогом, выбранным за базу для сравнения. Сравнение выполняется методом балльных оценок по трём признакам: научно-технический уровень (новизна), перспективность и возможность применения результатов; баллы назначаются по нормативным шкалам [38].</w:t>
       </w:r>
     </w:p>
     <w:p>
       <w:r>
-        <w:t>Помимо используемой в работе платы LilyGO T-HaLow на чипсете Taixin стоимостью 3 198 руб. [28] на рынке представлены платы и оценочные комплекты на чипсетах Newracom, требующие внешнего управляющего компьютера или поставляемые по запросу [29, 30, 31], и Morse Micro. Единственный оценочный комплект производителя чипсета с открытой ценой и поставкой в Российскую Федерацию — Morse Micro MM6108-EKH05 стоимостью 39 620 руб. [32]. За базу для сравнения принят распространённый подход к оценке Wi-Fi HaLow — испытания по методике производителя на таких комплектах: измерение дальности и пропускной способности без сопоставления с теоретической оценкой и без сравнения с IEEE 802.11 в идентичных условиях.</w:t>
+        <w:t>Помимо используемой в работе платы LilyGO T-HaLow на чипсете Taixin стоимостью 3 198 руб. [27] на рынке представлены платы и оценочные комплекты на чипсетах Newracom, требующие внешнего управляющего компьютера или поставляемые по запросу [28, 29, 30], и Morse Micro. Единственный оценочный комплект производителя чипсета с открытой ценой и поставкой в Российскую Федерацию — Morse Micro MM6108-EKH05 стоимостью 39 620 руб. [31]. За базу для сравнения принят распространённый подход к оценке Wi-Fi HaLow — испытания по методике производителя на таких комплектах: измерение дальности и пропускной способности без сопоставления с теоретической оценкой и без сравнения с IEEE 802.11 в идентичных условиях.</w:t>
       </w:r>
     </w:p>
     <w:p>
       <w:r>
-        <w:t>Базовый вариант воспроизводит известные испытания, его результаты привязаны к конкретному комплекту и применимы на уровне отдельного предприятия после адаптации в срок 3–5 лет: новизна — 3 балла («приближается к мировым достижениям»), перспективность — 5 («важная»), возможность применения — 3. В настоящей работе теоретические модели распространения радиоволн проверяются экспериментально с определением их параметров и границ применимости, а Wi-Fi HaLow сравнивается с IEEE 802.11 на одной аппаратной платформе (ESP32-S3 имеет собственный радиотракт 2,4 ГГц), что исключает влияние различий оборудования, — 5 баллов; более высокая оценка не принята, так как исследована статичная конфигурация «точка — точка». Результаты непосредственно используются при проектировании каналов связи с БПЛА, а натурных данных для серийных модулей Wi-Fi HaLow, появившихся в 2024–2025 гг., немного, — 7 баллов. Результаты получены на серийной платформе и применимы разработчиками систем связи БПЛА на уровне отрасли в срок до 3 лет — 8 баллов. Значимость признаков принята по [39], результаты оценки сведены в таблицу 4.1.</w:t>
+        <w:t>Базовый вариант воспроизводит известные испытания, его результаты привязаны к конкретному комплекту и применимы на уровне отдельного предприятия после адаптации в срок 3–5 лет: новизна — 3 балла («приближается к мировым достижениям»), перспективность — 5 («важная»), возможность применения — 3. В настоящей работе теоретические модели распространения радиоволн проверяются экспериментально с определением их параметров и границ применимости, а Wi-Fi HaLow сравнивается с IEEE 802.11 на одной аппаратной платформе (ESP32-S3 имеет собственный радиотракт 2,4 ГГц), что исключает влияние различий оборудования, — 5 баллов; более высокая оценка не принята, так как исследована статичная конфигурация «точка — точка». Результаты непосредственно используются при проектировании каналов связи с БПЛА, а натурных данных для серийных модулей Wi-Fi HaLow, появившихся в 2024–2025 гг., немного, — 7 баллов. Результаты получены на серийной платформе и применимы разработчиками систем связи БПЛА на уровне отрасли в срок до 3 лет — 8 баллов. Значимость признаков принята по [38], результаты оценки сведены в таблицу 4.1.</w:t>
       </w:r>
     </w:p>
     <w:p>
@@ -1098,7 +1098,7 @@
     </w:p>
     <w:p>
       <w:r>
-        <w:t>Новизна НТПр оценивается по пяти критериям: принципиально новое — 5 баллов, новое — 3, улучшенное — 2, существующего уровня — 1, устаревшее — 0 [39] (таблица 4.2).</w:t>
+        <w:t>Новизна НТПр оценивается по пяти критериям: принципиально новое — 5 баллов, новое — 3, улучшенное — 2, существующего уровня — 1, устаревшее — 0 [38] (таблица 4.2).</w:t>
       </w:r>
     </w:p>
     <w:p>
@@ -1907,7 +1907,7 @@
     </w:p>
     <w:p>
       <w:r>
-        <w:t>Результат НИР является новым по функциональному критерию и улучшенным по технологическому и производственному; период эффективности новых технологий 2–3 года [39] согласуется с принятым периодом применения результатов — до 3 лет.</w:t>
+        <w:t>Результат НИР является новым по функциональному критерию и улучшенным по технологическому и производственному; период эффективности новых технологий 2–3 года [38] согласуется с принятым периодом применения результатов — до 3 лет.</w:t>
       </w:r>
     </w:p>
     <w:p>
@@ -1928,7 +1928,7 @@
         <w:keepNext/>
       </w:pPr>
       <w:r>
-        <w:t>Производственный цикл j-й стадии в рабочих днях [39]:</w:t>
+        <w:t>Производственный цикл j-й стадии в рабочих днях [38]:</w:t>
       </w:r>
     </w:p>
     <w:tbl>
@@ -2255,7 +2255,7 @@
         </m:sSub>
       </m:oMath>
       <w:r>
-        <w:t xml:space="preserve"> [39]. При начале работ 09.10.2026 и суммарной длительности 73 календарных дня НИР завершается 20.12.2026, каждая стадия — не позднее срока по заданию на ВКР (таблица 4.3).</w:t>
+        <w:t xml:space="preserve"> [38]. При начале работ 09.10.2026 и суммарной длительности 73 календарных дня НИР завершается 20.12.2026, каждая стадия — не позднее срока по заданию на ВКР (таблица 4.3).</w:t>
       </w:r>
     </w:p>
     <w:p>
@@ -3993,7 +3993,7 @@
     </w:p>
     <w:p>
       <w:r>
-        <w:t>Основной статьёй затрат НИР является оплата труда. Месячные оклады приняты по медианам предложений работодателей г. Москвы на портале hh.ru [40]; суммы «на руки» пересчитаны в начисленные делением на 0,87 [41]. Оклад инженера-исследователя и инженера-программиста составляет 102 900 руб. (медиана 11 предложений для инженеров без опыта работы), техника — 90 000 руб. (4 предложения для техников без опыта), руководителя НИР — 175 000 руб. (9 предложений для специалистов с опытом 3–6 лет). Часовая ставка равна окладу, делённому на среднемесячный фонд рабочего времени 1 972/12 = 164,33 ч [42]: 626, 548 и 1 065 руб./ч соответственно.</w:t>
+        <w:t>Основной статьёй затрат НИР является оплата труда. Месячные оклады приняты по медианам предложений работодателей г. Москвы на портале hh.ru [39]; суммы «на руки» пересчитаны в начисленные делением на 0,87 [40]. Оклад инженера-исследователя и инженера-программиста составляет 102 900 руб. (медиана 11 предложений для инженеров без опыта работы), техника — 90 000 руб. (4 предложения для техников без опыта), руководителя НИР — 175 000 руб. (9 предложений для специалистов с опытом 3–6 лет). Часовая ставка равна окладу, делённому на среднемесячный фонд рабочего времени 1 972/12 = 164,33 ч [41]: 626, 548 и 1 065 руб./ч соответственно.</w:t>
       </w:r>
     </w:p>
     <w:p>
@@ -4001,7 +4001,7 @@
         <w:keepNext/>
       </w:pPr>
       <w:r>
-        <w:t>Заработная плата по стадиям работ [39]:</w:t>
+        <w:t>Заработная плата по стадиям работ [38]:</w:t>
       </w:r>
     </w:p>
     <w:tbl>
@@ -6011,7 +6011,7 @@
         <w:keepNext/>
       </w:pPr>
       <w:r>
-        <w:t>С учётом премиальных выплат 20 % [39] основная заработная плата</w:t>
+        <w:t>С учётом премиальных выплат 20 % [38] основная заработная плата</w:t>
       </w:r>
     </w:p>
     <w:tbl>
@@ -6203,7 +6203,7 @@
         <w:keepNext/>
       </w:pPr>
       <w:r>
-        <w:t>Дополнительная заработная плата — оплата ежегодного отпуска 28 календарных (20 рабочих) дней при 247 рабочих днях в 2026 г. [42]:</w:t>
+        <w:t>Дополнительная заработная плата — оплата ежегодного отпуска 28 календарных (20 рабочих) дней при 247 рабочих днях в 2026 г. [41]:</w:t>
       </w:r>
     </w:p>
     <w:p>
@@ -6309,12 +6309,12 @@
     </w:p>
     <w:p>
       <w:r>
-        <w:t>Фонд оплаты труда (ФОТ) составляет 612 298 + 53 882 = 666 180 руб. Отчисления на социальные нужды включают страховые взносы по единому тарифу 30 % (выплаты исполнителям не превышают предельной базы 2 979 000 руб. на 2026 г. [41, 43]) и взносы на страхование от несчастных случаев 0,2 % (I класс профессионального риска): 0,302·666 180 = 201 186 руб.</w:t>
+        <w:t>Фонд оплаты труда (ФОТ) составляет 612 298 + 53 882 = 666 180 руб. Отчисления на социальные нужды включают страховые взносы по единому тарифу 30 % (выплаты исполнителям не превышают предельной базы 2 979 000 руб. на 2026 г. [40, 42]) и взносы на страхование от несчастных случаев 0,2 % (I класс профессионального риска): 0,302·666 180 = 201 186 руб.</w:t>
       </w:r>
     </w:p>
     <w:p>
       <w:r>
-        <w:t>Материальные затраты включают покупные комплектующие изделия для экспериментального стенда и канцелярские товары (таблица 4.5), а также электроэнергию. Две платы LilyGO T-HaLow образуют канал «точка — точка»: передающая плата с камерой OV5640 работает в режиме точки доступа, приёмная — в режиме станции. Цена платы 37,98 долл. США [28] по курсу Банка России 84,1975 руб./долл. на 20.09.2026 [44] составляет 3 198 руб. Микросхемы флеш-памяти и программатор нужны для резервного копирования и восстановления встроенного программного обеспечения радиомодуля TX-AH [45, 46], аккумуляторы — для автономного питания плат на полевой площадке, штативы — для фиксации высоты антенн. Цены остальных позиций — средние розничные на сентябрь 2026 г.; канцелярские товары рассчитаны на печать около 2 500 листов.</w:t>
+        <w:t>Материальные затраты включают покупные комплектующие изделия для экспериментального стенда и канцелярские товары (таблица 4.5), а также электроэнергию. Две платы LilyGO T-HaLow образуют канал «точка — точка»: передающая плата с камерой OV5640 работает в режиме точки доступа, приёмная — в режиме станции. Цена платы 37,98 долл. США [27] по курсу Банка России 84,1975 руб./долл. на 20.09.2026 [43] составляет 3 198 руб. Микросхемы флеш-памяти и программатор нужны для резервного копирования и восстановления встроенного программного обеспечения радиомодуля TX-AH [44, 45], аккумуляторы — для автономного питания плат на полевой площадке. Цены остальных позиций — средние розничные на сентябрь 2026 г.; канцелярские товары рассчитаны на печать около 2 500 листов.</w:t>
       </w:r>
     </w:p>
     <w:p>
@@ -7343,7 +7343,7 @@
               <w:rPr>
                 <w:sz w:val="22"/>
               </w:rPr>
-              <w:t>Штатив для установки плат на заданной высоте</w:t>
+              <w:t>Бумага офисная А4, 500 листов</w:t>
             </w:r>
           </w:p>
         </w:tc>
@@ -7362,7 +7362,7 @@
               <w:rPr>
                 <w:sz w:val="22"/>
               </w:rPr>
-              <w:t>шт.</w:t>
+              <w:t>пачка</w:t>
             </w:r>
           </w:p>
         </w:tc>
@@ -7381,7 +7381,7 @@
               <w:rPr>
                 <w:sz w:val="22"/>
               </w:rPr>
-              <w:t>2</w:t>
+              <w:t>5</w:t>
             </w:r>
           </w:p>
         </w:tc>
@@ -7400,7 +7400,7 @@
               <w:rPr>
                 <w:sz w:val="22"/>
               </w:rPr>
-              <w:t>1 500</w:t>
+              <w:t>550</w:t>
             </w:r>
           </w:p>
         </w:tc>
@@ -7419,7 +7419,7 @@
               <w:rPr>
                 <w:sz w:val="22"/>
               </w:rPr>
-              <w:t>3 000</w:t>
+              <w:t>2 750</w:t>
             </w:r>
           </w:p>
         </w:tc>
@@ -7462,7 +7462,7 @@
               <w:rPr>
                 <w:sz w:val="22"/>
               </w:rPr>
-              <w:t>Бумага офисная А4, 500 листов</w:t>
+              <w:t>Картридж для лазерного принтера</w:t>
             </w:r>
           </w:p>
         </w:tc>
@@ -7481,7 +7481,7 @@
               <w:rPr>
                 <w:sz w:val="22"/>
               </w:rPr>
-              <w:t>пачка</w:t>
+              <w:t>шт.</w:t>
             </w:r>
           </w:p>
         </w:tc>
@@ -7500,7 +7500,7 @@
               <w:rPr>
                 <w:sz w:val="22"/>
               </w:rPr>
-              <w:t>5</w:t>
+              <w:t>2</w:t>
             </w:r>
           </w:p>
         </w:tc>
@@ -7519,7 +7519,7 @@
               <w:rPr>
                 <w:sz w:val="22"/>
               </w:rPr>
-              <w:t>550</w:t>
+              <w:t>3 200</w:t>
             </w:r>
           </w:p>
         </w:tc>
@@ -7538,7 +7538,7 @@
               <w:rPr>
                 <w:sz w:val="22"/>
               </w:rPr>
-              <w:t>2 750</w:t>
+              <w:t>6 400</w:t>
             </w:r>
           </w:p>
         </w:tc>
@@ -7581,7 +7581,7 @@
               <w:rPr>
                 <w:sz w:val="22"/>
               </w:rPr>
-              <w:t>Картридж для лазерного принтера</w:t>
+              <w:t>Канцелярские принадлежности: ручки, карандаши, скрепки, скобы, файлы, папки, тетради для журналов полевых измерений, маркеры</w:t>
             </w:r>
           </w:p>
         </w:tc>
@@ -7600,7 +7600,7 @@
               <w:rPr>
                 <w:sz w:val="22"/>
               </w:rPr>
-              <w:t>шт.</w:t>
+              <w:t>компл.</w:t>
             </w:r>
           </w:p>
         </w:tc>
@@ -7619,7 +7619,7 @@
               <w:rPr>
                 <w:sz w:val="22"/>
               </w:rPr>
-              <w:t>2</w:t>
+              <w:t>1</w:t>
             </w:r>
           </w:p>
         </w:tc>
@@ -7638,7 +7638,7 @@
               <w:rPr>
                 <w:sz w:val="22"/>
               </w:rPr>
-              <w:t>3 200</w:t>
+              <w:t>2 500</w:t>
             </w:r>
           </w:p>
         </w:tc>
@@ -7657,7 +7657,7 @@
               <w:rPr>
                 <w:sz w:val="22"/>
               </w:rPr>
-              <w:t>6 400</w:t>
+              <w:t>2 500</w:t>
             </w:r>
           </w:p>
         </w:tc>
@@ -7674,120 +7674,19 @@
           <w:p>
             <w:pPr>
               <w:pStyle w:val="TableText"/>
-              <w:keepNext/>
               <w:jc w:val="left"/>
             </w:pPr>
             <w:r>
               <w:rPr>
+                <w:b/>
                 <w:sz w:val="22"/>
               </w:rPr>
-              <w:t>11</w:t>
             </w:r>
           </w:p>
         </w:tc>
         <w:tc>
           <w:tcPr>
             <w:tcW w:type="dxa" w:w="4876"/>
-            <w:vAlign w:val="center"/>
-          </w:tcPr>
-          <w:p>
-            <w:pPr>
-              <w:pStyle w:val="TableText"/>
-              <w:keepNext/>
-              <w:jc w:val="left"/>
-            </w:pPr>
-            <w:r>
-              <w:rPr>
-                <w:sz w:val="22"/>
-              </w:rPr>
-              <w:t>Канцелярские принадлежности: ручки, карандаши, скрепки, скобы, файлы, папки, тетради для журналов полевых измерений, маркеры</w:t>
-            </w:r>
-          </w:p>
-        </w:tc>
-        <w:tc>
-          <w:tcPr>
-            <w:tcW w:type="dxa" w:w="907"/>
-            <w:vAlign w:val="center"/>
-          </w:tcPr>
-          <w:p>
-            <w:pPr>
-              <w:pStyle w:val="TableText"/>
-              <w:keepNext/>
-              <w:jc w:val="center"/>
-            </w:pPr>
-            <w:r>
-              <w:rPr>
-                <w:sz w:val="22"/>
-              </w:rPr>
-              <w:t>компл.</w:t>
-            </w:r>
-          </w:p>
-        </w:tc>
-        <w:tc>
-          <w:tcPr>
-            <w:tcW w:type="dxa" w:w="907"/>
-            <w:vAlign w:val="center"/>
-          </w:tcPr>
-          <w:p>
-            <w:pPr>
-              <w:pStyle w:val="TableText"/>
-              <w:keepNext/>
-              <w:jc w:val="center"/>
-            </w:pPr>
-            <w:r>
-              <w:rPr>
-                <w:sz w:val="22"/>
-              </w:rPr>
-              <w:t>1</w:t>
-            </w:r>
-          </w:p>
-        </w:tc>
-        <w:tc>
-          <w:tcPr>
-            <w:tcW w:type="dxa" w:w="1020"/>
-            <w:vAlign w:val="center"/>
-          </w:tcPr>
-          <w:p>
-            <w:pPr>
-              <w:pStyle w:val="TableText"/>
-              <w:keepNext/>
-              <w:jc w:val="right"/>
-            </w:pPr>
-            <w:r>
-              <w:rPr>
-                <w:sz w:val="22"/>
-              </w:rPr>
-              <w:t>2 500</w:t>
-            </w:r>
-          </w:p>
-        </w:tc>
-        <w:tc>
-          <w:tcPr>
-            <w:tcW w:type="dxa" w:w="1134"/>
-            <w:vAlign w:val="center"/>
-          </w:tcPr>
-          <w:p>
-            <w:pPr>
-              <w:pStyle w:val="TableText"/>
-              <w:keepNext/>
-              <w:jc w:val="right"/>
-            </w:pPr>
-            <w:r>
-              <w:rPr>
-                <w:sz w:val="22"/>
-              </w:rPr>
-              <w:t>2 500</w:t>
-            </w:r>
-          </w:p>
-        </w:tc>
-      </w:tr>
-      <w:tr>
-        <w:trPr>
-          <w:cantSplit/>
-        </w:trPr>
-        <w:tc>
-          <w:tcPr>
-            <w:tcW w:type="dxa" w:w="510"/>
             <w:vAlign w:val="center"/>
           </w:tcPr>
           <w:p>
@@ -7800,25 +7699,25 @@
                 <w:b/>
                 <w:sz w:val="22"/>
               </w:rPr>
+              <w:t>Итого</w:t>
             </w:r>
           </w:p>
         </w:tc>
         <w:tc>
           <w:tcPr>
-            <w:tcW w:type="dxa" w:w="4876"/>
+            <w:tcW w:type="dxa" w:w="907"/>
             <w:vAlign w:val="center"/>
           </w:tcPr>
           <w:p>
             <w:pPr>
               <w:pStyle w:val="TableText"/>
-              <w:jc w:val="left"/>
+              <w:jc w:val="center"/>
             </w:pPr>
             <w:r>
               <w:rPr>
                 <w:b/>
                 <w:sz w:val="22"/>
               </w:rPr>
-              <w:t>Итого</w:t>
             </w:r>
           </w:p>
         </w:tc>
@@ -7842,13 +7741,13 @@
         </w:tc>
         <w:tc>
           <w:tcPr>
-            <w:tcW w:type="dxa" w:w="907"/>
+            <w:tcW w:type="dxa" w:w="1020"/>
             <w:vAlign w:val="center"/>
           </w:tcPr>
           <w:p>
             <w:pPr>
               <w:pStyle w:val="TableText"/>
-              <w:jc w:val="center"/>
+              <w:jc w:val="right"/>
             </w:pPr>
             <w:r>
               <w:rPr>
@@ -7860,7 +7759,7 @@
         </w:tc>
         <w:tc>
           <w:tcPr>
-            <w:tcW w:type="dxa" w:w="1020"/>
+            <w:tcW w:type="dxa" w:w="1134"/>
             <w:vAlign w:val="center"/>
           </w:tcPr>
           <w:p>
@@ -7873,25 +7772,7 @@
                 <w:b/>
                 <w:sz w:val="22"/>
               </w:rPr>
-            </w:r>
-          </w:p>
-        </w:tc>
-        <w:tc>
-          <w:tcPr>
-            <w:tcW w:type="dxa" w:w="1134"/>
-            <w:vAlign w:val="center"/>
-          </w:tcPr>
-          <w:p>
-            <w:pPr>
-              <w:pStyle w:val="TableText"/>
-              <w:jc w:val="right"/>
-            </w:pPr>
-            <w:r>
-              <w:rPr>
-                <w:b/>
-                <w:sz w:val="22"/>
-              </w:rPr>
-              <w:t>27 560</w:t>
+              <w:t>24 560</w:t>
             </w:r>
           </w:p>
         </w:tc>
@@ -8066,7 +7947,7 @@
         </m:sSub>
       </m:oMath>
       <w:r>
-        <w:t xml:space="preserve"> – тариф в г. Москве с 01.10.2026, руб./(кВт·ч) [47]. Материальные затраты составляют 15 910 + 11 650 + 929 = 28 489 руб.</w:t>
+        <w:t xml:space="preserve"> – тариф в г. Москве с 01.10.2026, руб./(кВт·ч) [46]. Материальные затраты составляют 12 910 + 11 650 + 929 = 25 489 руб.</w:t>
       </w:r>
     </w:p>
     <w:p>
@@ -8109,7 +7990,7 @@
         </m:r>
       </m:oMath>
       <w:r>
-        <w:t xml:space="preserve"> руб., срок полезного использования 3 года — вторая амортизационная группа [48]) начисляется линейным способом пропорционально времени работы:</w:t>
+        <w:t xml:space="preserve"> руб., срок полезного использования 3 года — вторая амортизационная группа [47]) начисляется линейным способом пропорционально времени работы:</w:t>
       </w:r>
     </w:p>
     <w:p>
@@ -8287,7 +8168,7 @@
     </w:p>
     <w:p>
       <w:r>
-        <w:t>Накладные расходы приняты в размере 100 % от ФОТ, поскольку работа выполняется на базе кафедры; в типовой структуре затрат на НИР накладные расходы и заработная плата имеют одинаковый удельный вес — 34 % [39]. Прочие расходы (поездки на полевую площадку, связь, научно-техническая информация) — 10 % от ФОТ.</w:t>
+        <w:t>Накладные расходы приняты в размере 100 % от ФОТ, поскольку работа выполняется на базе кафедры; в типовой структуре затрат на НИР накладные расходы и заработная плата имеют одинаковый удельный вес — 34 % [38]. Прочие расходы (поездки на полевую площадку, связь, научно-техническая информация) — 10 % от ФОТ.</w:t>
       </w:r>
     </w:p>
     <w:p>
@@ -8546,7 +8427,7 @@
               <w:rPr>
                 <w:sz w:val="24"/>
               </w:rPr>
-              <w:t>15 910</w:t>
+              <w:t>12 910</w:t>
             </w:r>
           </w:p>
         </w:tc>
@@ -8565,7 +8446,7 @@
               <w:rPr>
                 <w:sz w:val="24"/>
               </w:rPr>
-              <w:t>1,0</w:t>
+              <w:t>0,8</w:t>
             </w:r>
           </w:p>
         </w:tc>
@@ -9193,7 +9074,7 @@
                 <w:b/>
                 <w:sz w:val="24"/>
               </w:rPr>
-              <w:t>1 638 653</w:t>
+              <w:t>1 635 653</w:t>
             </w:r>
           </w:p>
         </w:tc>
@@ -9225,7 +9106,7 @@
     </w:p>
     <w:p>
       <w:r>
-        <w:t>Затраты, связанные с оплатой труда (заработная плата, отчисления, накладные и прочие расходы), составляют 97,7 % себестоимости, что характерно для НИР; материальные затраты — лишь 1,7 % благодаря недорогим серийным платам.</w:t>
+        <w:t>Затраты, связанные с оплатой труда (заработная плата, отчисления, накладные и прочие расходы), составляют 97,8 % себестоимости, что характерно для НИР; материальные затраты — лишь 1,6 % благодаря недорогим серийным платам.</w:t>
       </w:r>
     </w:p>
     <w:p>
@@ -9233,7 +9114,7 @@
         <w:keepNext/>
       </w:pPr>
       <w:r>
-        <w:t>Цена НИР определяется исходя из обеспечения безубыточности деятельности организации [39]:</w:t>
+        <w:t>Цена НИР определяется исходя из обеспечения безубыточности деятельности организации [38]:</w:t>
       </w:r>
     </w:p>
     <w:tbl>
@@ -9517,7 +9398,7 @@
         </m:sSub>
       </m:oMath>
       <w:r>
-        <w:t xml:space="preserve"> – уровень рентабельности по отношению к оплате труда, 200–400 % [39].</w:t>
+        <w:t xml:space="preserve"> – уровень рентабельности по отношению к оплате труда, 200–400 % [38].</w:t>
       </w:r>
     </w:p>
     <w:p>
@@ -9597,7 +9478,7 @@
           <w:rPr>
             <w:rFonts w:ascii="Cambria Math" w:hAnsi="Cambria Math"/>
           </w:rPr>
-          <m:t xml:space="preserve"> = 1 638 653 + 666 180·</m:t>
+          <m:t xml:space="preserve"> = 1 635 653 + 666 180·</m:t>
         </m:r>
         <m:f>
           <m:num>
@@ -9630,7 +9511,7 @@
           <w:rPr>
             <w:rFonts w:ascii="Cambria Math" w:hAnsi="Cambria Math"/>
           </w:rPr>
-          <m:t xml:space="preserve"> = 2 971 013 руб.</m:t>
+          <m:t xml:space="preserve"> = 2 968 013 руб.</m:t>
         </m:r>
       </m:oMath>
     </w:p>
@@ -9639,7 +9520,7 @@
         <w:keepNext/>
       </w:pPr>
       <w:r>
-        <w:t>Прибыль П = 2 971 013 − 1 638 653 = 1 332 360 руб. Рентабельность НИР по себестоимости:</w:t>
+        <w:t>Прибыль П = 2 968 013 − 1 635 653 = 1 332 360 руб. Рентабельность НИР по себестоимости:</w:t>
       </w:r>
     </w:p>
     <w:tbl>
@@ -9762,7 +9643,7 @@
                     <w:rPr>
                       <w:rFonts w:ascii="Cambria Math" w:hAnsi="Cambria Math"/>
                     </w:rPr>
-                    <m:t xml:space="preserve">1 638 653</m:t>
+                    <m:t xml:space="preserve">1 635 653</m:t>
                   </m:r>
                 </m:den>
               </m:f>
@@ -9773,7 +9654,7 @@
                 <w:rPr>
                   <w:rFonts w:ascii="Cambria Math" w:hAnsi="Cambria Math"/>
                 </w:rPr>
-                <m:t xml:space="preserve">·100 % = 81,3 %.</m:t>
+                <m:t xml:space="preserve">·100 % = 81,5 %.</m:t>
               </m:r>
             </m:oMath>
           </w:p>
@@ -9797,7 +9678,7 @@
     </w:tbl>
     <w:p>
       <w:r>
-        <w:t>Рентабельность продаж составляет 44,8 %. Цена НИР покрывает все затраты на её выполнение и обеспечивает безубыточность деятельности организации.</w:t>
+        <w:t>Рентабельность продаж составляет 44,9 %. Цена НИР покрывает все затраты на её выполнение и обеспечивает безубыточность деятельности организации.</w:t>
       </w:r>
     </w:p>
     <w:p>
@@ -9839,7 +9720,7 @@
         </m:sSub>
       </m:oMath>
       <w:r>
-        <w:t xml:space="preserve"> [39]. Результаты НИР используются при проектировании каналов связи с БПЛА, то есть НИР связана с повышением качества проектирования, и годовой экономический эффект определяется по формуле [39]</w:t>
+        <w:t xml:space="preserve"> [38]. Результаты НИР используются при проектировании каналов связи с БПЛА, то есть НИР связана с повышением качества проектирования, и годовой экономический эффект определяется по формуле [38]</w:t>
       </w:r>
     </w:p>
     <w:tbl>
@@ -10185,7 +10066,7 @@
           <w:rPr>
             <w:rFonts w:ascii="Cambria Math" w:hAnsi="Cambria Math"/>
           </w:rPr>
-          <m:t xml:space="preserve"> = 1 638 653</m:t>
+          <m:t xml:space="preserve"> = 1 635 653</m:t>
         </m:r>
       </m:oMath>
       <w:r>
@@ -10240,11 +10121,11 @@
           <w:rPr>
             <w:rFonts w:ascii="Cambria Math" w:hAnsi="Cambria Math"/>
           </w:rPr>
-          <m:t xml:space="preserve"> = 1 711 497</m:t>
+          <m:t xml:space="preserve"> = 1 708 497</m:t>
         </m:r>
       </m:oMath>
       <w:r>
-        <w:t xml:space="preserve"> руб. Срок поставки комплектов 7–8 недель [32] в денежном выражении не учитывается, что идёт в запас оценки. Экономический эффект:</w:t>
+        <w:t xml:space="preserve"> руб. Срок поставки комплектов 7–8 недель [31] в денежном выражении не учитывается, что идёт в запас оценки. Экономический эффект:</w:t>
       </w:r>
     </w:p>
     <w:p>
@@ -10277,7 +10158,7 @@
               <w:rPr>
                 <w:rFonts w:ascii="Cambria Math" w:hAnsi="Cambria Math"/>
               </w:rPr>
-              <m:t xml:space="preserve">1 711 497·1,68 − 1 638 653</m:t>
+              <m:t xml:space="preserve">1 708 497·1,68 − 1 635 653</m:t>
             </m:r>
           </m:num>
           <m:den>
@@ -10299,7 +10180,7 @@
           <w:rPr>
             <w:rFonts w:ascii="Cambria Math" w:hAnsi="Cambria Math"/>
           </w:rPr>
-          <m:t xml:space="preserve"> = 6 183 310 руб./год.</m:t>
+          <m:t xml:space="preserve"> = 6 173 110 руб./год.</m:t>
         </m:r>
       </m:oMath>
     </w:p>
@@ -10308,7 +10189,7 @@
         <w:keepNext/>
       </w:pPr>
       <w:r>
-        <w:t>Уровень экономической эффективности затрат на НИР [39]:</w:t>
+        <w:t>Уровень экономической эффективности затрат на НИР [38]:</w:t>
       </w:r>
     </w:p>
     <w:tbl>
@@ -10435,7 +10316,7 @@
                     <w:rPr>
                       <w:rFonts w:ascii="Cambria Math" w:hAnsi="Cambria Math"/>
                     </w:rPr>
-                    <m:t xml:space="preserve">6 183 310·1</m:t>
+                    <m:t xml:space="preserve">6 173 110·1</m:t>
                   </m:r>
                 </m:num>
                 <m:den>
@@ -10446,7 +10327,7 @@
                     <w:rPr>
                       <w:rFonts w:ascii="Cambria Math" w:hAnsi="Cambria Math"/>
                     </w:rPr>
-                    <m:t xml:space="preserve">2 971 013</m:t>
+                    <m:t xml:space="preserve">2 968 013</m:t>
                   </m:r>
                 </m:den>
               </m:f>
@@ -10710,7 +10591,7 @@
     </w:tbl>
     <w:p>
       <w:r>
-        <w:t xml:space="preserve">Срок окупаемости составляет около 6 месяцев. Для наукоёмкой продукции уровень экономической эффективности должен быть не менее 0,5, то есть вложения должны окупаться в пределах двух лет [39]; полученные значения Е = 2,08 и </w:t>
+        <w:t xml:space="preserve">Срок окупаемости составляет около 6 месяцев. Для наукоёмкой продукции уровень экономической эффективности должен быть не менее 0,5, то есть вложения должны окупаться в пределах двух лет [38]; полученные значения Е = 2,08 и </w:t>
       </w:r>
       <m:oMath>
         <m:sSub>
@@ -10782,7 +10663,7 @@
         <w:t xml:space="preserve">– </w:t>
       </w:r>
       <w:r>
-        <w:t>себестоимость НИР 1 638 653 руб., цена 2 971 013 руб., рентабельность по себестоимости 81,3 %;</w:t>
+        <w:t>себестоимость НИР 1 635 653 руб., цена 2 968 013 руб., рентабельность по себестоимости 81,5 %;</w:t>
       </w:r>
     </w:p>
     <w:p>
@@ -10790,7 +10671,7 @@
         <w:t xml:space="preserve">– </w:t>
       </w:r>
       <w:r>
-        <w:t>годовой экономический эффект 6 183 310 руб., уровень экономической эффективности 2,08 при нормативе не менее 0,5, срок окупаемости 0,48 года (около 6 месяцев).</w:t>
+        <w:t>годовой экономический эффект 6 173 110 руб., уровень экономической эффективности 2,08 при нормативе не менее 0,5, срок окупаемости 0,48 года (около 6 месяцев).</w:t>
       </w:r>
     </w:p>
     <w:p>

</xml_diff>

<commit_message>
Economics: restore the network graph as in the accepted sample, keep its size
- works list with t_min/t_max/t_exp and network figure (73 cal. days, matches the plan)
- purchased parts table folded into a paragraph: 6 tables and 1 figure as in the sample, 12 pages

Co-Authored-By: Claude Opus 5.5 <noreply@anthropic.com>
Claude-Session: https://claude.ai/code/session_01F7zWgPWK1QF4RLkRPrjcGv
</commit_message>
<xml_diff>
--- a/docs/ekonomika/Ekonomicheskaya_chast_HaLow.docx
+++ b/docs/ekonomika/Ekonomicheskaya_chast_HaLow.docx
@@ -3985,6 +3985,2456 @@
     </w:p>
     <w:p>
       <w:pPr>
+        <w:keepNext/>
+      </w:pPr>
+      <w:r>
+        <w:t xml:space="preserve">Для наглядного представления структуры работ и их сроков построен сетевой график [38]. Перечень работ и событий приведён в таблице 4.4; продолжительность работ указана в календарных днях. Поскольку продолжительность работ НИР заранее точно не известна, для каждой работы экспертно заданы минимальная оценка </w:t>
+      </w:r>
+      <m:oMath>
+        <m:sSub>
+          <m:e>
+            <m:r>
+              <w:rPr>
+                <w:rFonts w:ascii="Cambria Math" w:hAnsi="Cambria Math"/>
+              </w:rPr>
+              <m:t xml:space="preserve">t</m:t>
+            </m:r>
+          </m:e>
+          <m:sub>
+            <m:r>
+              <m:rPr>
+                <m:sty m:val="p"/>
+              </m:rPr>
+              <w:rPr>
+                <w:rFonts w:ascii="Cambria Math" w:hAnsi="Cambria Math"/>
+              </w:rPr>
+              <m:t xml:space="preserve">min</m:t>
+            </m:r>
+          </m:sub>
+        </m:sSub>
+      </m:oMath>
+      <w:r>
+        <w:t xml:space="preserve"> — при наиболее благоприятном стечении обстоятельств — и максимальная </w:t>
+      </w:r>
+      <m:oMath>
+        <m:sSub>
+          <m:e>
+            <m:r>
+              <w:rPr>
+                <w:rFonts w:ascii="Cambria Math" w:hAnsi="Cambria Math"/>
+              </w:rPr>
+              <m:t xml:space="preserve">t</m:t>
+            </m:r>
+          </m:e>
+          <m:sub>
+            <m:r>
+              <m:rPr>
+                <m:sty m:val="p"/>
+              </m:rPr>
+              <w:rPr>
+                <w:rFonts w:ascii="Cambria Math" w:hAnsi="Cambria Math"/>
+              </w:rPr>
+              <m:t xml:space="preserve">max</m:t>
+            </m:r>
+          </m:sub>
+        </m:sSub>
+      </m:oMath>
+      <w:r>
+        <w:t xml:space="preserve"> — при наиболее неблагоприятном; ожидаемая продолжительность [38]:</w:t>
+      </w:r>
+    </w:p>
+    <w:tbl>
+      <w:tblPr>
+        <w:tblW w:type="auto" w:w="0"/>
+        <w:jc w:val="center"/>
+        <w:tblLayout w:type="fixed"/>
+        <w:tblLook w:firstColumn="1" w:firstRow="1" w:lastColumn="0" w:lastRow="0" w:noHBand="0" w:noVBand="1" w:val="04A0"/>
+        <w:tblBorders>
+          <w:top w:val="nil"/>
+          <w:left w:val="nil"/>
+          <w:bottom w:val="nil"/>
+          <w:right w:val="nil"/>
+          <w:insideH w:val="nil"/>
+          <w:insideV w:val="nil"/>
+        </w:tblBorders>
+      </w:tblPr>
+      <w:tblGrid>
+        <w:gridCol w:w="1020"/>
+        <w:gridCol w:w="7313"/>
+        <w:gridCol w:w="1020"/>
+      </w:tblGrid>
+      <w:tr>
+        <w:tc>
+          <w:tcPr>
+            <w:tcW w:type="dxa" w:w="1020"/>
+            <w:vAlign w:val="center"/>
+          </w:tcPr>
+          <w:p>
+            <w:pPr>
+              <w:pStyle w:val="Formula"/>
+            </w:pPr>
+          </w:p>
+        </w:tc>
+        <w:tc>
+          <w:tcPr>
+            <w:tcW w:type="dxa" w:w="7313"/>
+            <w:vAlign w:val="center"/>
+          </w:tcPr>
+          <w:p>
+            <w:pPr>
+              <w:pStyle w:val="Formula"/>
+              <w:jc w:val="center"/>
+            </w:pPr>
+            <m:oMath>
+              <m:sSub>
+                <m:e>
+                  <m:r>
+                    <w:rPr>
+                      <w:rFonts w:ascii="Cambria Math" w:hAnsi="Cambria Math"/>
+                    </w:rPr>
+                    <m:t xml:space="preserve">t</m:t>
+                  </m:r>
+                </m:e>
+                <m:sub>
+                  <m:r>
+                    <m:rPr>
+                      <m:sty m:val="p"/>
+                    </m:rPr>
+                    <w:rPr>
+                      <w:rFonts w:ascii="Cambria Math" w:hAnsi="Cambria Math"/>
+                    </w:rPr>
+                    <m:t xml:space="preserve">ож</m:t>
+                  </m:r>
+                </m:sub>
+              </m:sSub>
+              <m:r>
+                <m:rPr>
+                  <m:sty m:val="p"/>
+                </m:rPr>
+                <w:rPr>
+                  <w:rFonts w:ascii="Cambria Math" w:hAnsi="Cambria Math"/>
+                </w:rPr>
+                <m:t xml:space="preserve"> = </m:t>
+              </m:r>
+              <m:f>
+                <m:num>
+                  <m:r>
+                    <m:rPr>
+                      <m:sty m:val="p"/>
+                    </m:rPr>
+                    <w:rPr>
+                      <w:rFonts w:ascii="Cambria Math" w:hAnsi="Cambria Math"/>
+                    </w:rPr>
+                    <m:t xml:space="preserve">3</m:t>
+                  </m:r>
+                  <m:sSub>
+                    <m:e>
+                      <m:r>
+                        <w:rPr>
+                          <w:rFonts w:ascii="Cambria Math" w:hAnsi="Cambria Math"/>
+                        </w:rPr>
+                        <m:t xml:space="preserve">t</m:t>
+                      </m:r>
+                    </m:e>
+                    <m:sub>
+                      <m:r>
+                        <m:rPr>
+                          <m:sty m:val="p"/>
+                        </m:rPr>
+                        <w:rPr>
+                          <w:rFonts w:ascii="Cambria Math" w:hAnsi="Cambria Math"/>
+                        </w:rPr>
+                        <m:t xml:space="preserve">min</m:t>
+                      </m:r>
+                    </m:sub>
+                  </m:sSub>
+                  <m:r>
+                    <m:rPr>
+                      <m:sty m:val="p"/>
+                    </m:rPr>
+                    <w:rPr>
+                      <w:rFonts w:ascii="Cambria Math" w:hAnsi="Cambria Math"/>
+                    </w:rPr>
+                    <m:t xml:space="preserve"> + 2</m:t>
+                  </m:r>
+                  <m:sSub>
+                    <m:e>
+                      <m:r>
+                        <w:rPr>
+                          <w:rFonts w:ascii="Cambria Math" w:hAnsi="Cambria Math"/>
+                        </w:rPr>
+                        <m:t xml:space="preserve">t</m:t>
+                      </m:r>
+                    </m:e>
+                    <m:sub>
+                      <m:r>
+                        <m:rPr>
+                          <m:sty m:val="p"/>
+                        </m:rPr>
+                        <w:rPr>
+                          <w:rFonts w:ascii="Cambria Math" w:hAnsi="Cambria Math"/>
+                        </w:rPr>
+                        <m:t xml:space="preserve">max</m:t>
+                      </m:r>
+                    </m:sub>
+                  </m:sSub>
+                </m:num>
+                <m:den>
+                  <m:r>
+                    <m:rPr>
+                      <m:sty m:val="p"/>
+                    </m:rPr>
+                    <w:rPr>
+                      <w:rFonts w:ascii="Cambria Math" w:hAnsi="Cambria Math"/>
+                    </w:rPr>
+                    <m:t xml:space="preserve">5</m:t>
+                  </m:r>
+                </m:den>
+              </m:f>
+              <m:r>
+                <m:rPr>
+                  <m:sty m:val="p"/>
+                </m:rPr>
+                <w:rPr>
+                  <w:rFonts w:ascii="Cambria Math" w:hAnsi="Cambria Math"/>
+                </w:rPr>
+                <m:t xml:space="preserve">.</m:t>
+              </m:r>
+            </m:oMath>
+          </w:p>
+        </w:tc>
+        <w:tc>
+          <w:tcPr>
+            <w:tcW w:type="dxa" w:w="1020"/>
+            <w:vAlign w:val="center"/>
+          </w:tcPr>
+          <w:p>
+            <w:pPr>
+              <w:pStyle w:val="Formula"/>
+              <w:jc w:val="right"/>
+            </w:pPr>
+            <w:r>
+              <w:t>(4.5)</w:t>
+            </w:r>
+          </w:p>
+        </w:tc>
+      </w:tr>
+    </w:tbl>
+    <w:p>
+      <w:pPr>
+        <w:pStyle w:val="TableCaption"/>
+        <w:ind w:firstLine="0"/>
+      </w:pPr>
+      <w:r>
+        <w:t>Таблица 4.4 – Перечень работ сетевого графика, кал. дн.</w:t>
+      </w:r>
+    </w:p>
+    <w:tbl>
+      <w:tblPr>
+        <w:tblStyle w:val="TableGrid"/>
+        <w:tblW w:type="auto" w:w="0"/>
+        <w:jc w:val="center"/>
+        <w:tblLayout w:type="fixed"/>
+        <w:tblLook w:firstColumn="1" w:firstRow="1" w:lastColumn="0" w:lastRow="0" w:noHBand="0" w:noVBand="1" w:val="04A0"/>
+        <w:tblCellMar>
+          <w:left w:w="57" w:type="dxa"/>
+          <w:right w:w="57" w:type="dxa"/>
+        </w:tblCellMar>
+      </w:tblPr>
+      <w:tblGrid>
+        <w:gridCol w:w="453"/>
+        <w:gridCol w:w="5215"/>
+        <w:gridCol w:w="963"/>
+        <w:gridCol w:w="963"/>
+        <w:gridCol w:w="623"/>
+        <w:gridCol w:w="623"/>
+        <w:gridCol w:w="623"/>
+      </w:tblGrid>
+      <w:tr>
+        <w:trPr>
+          <w:cantSplit/>
+          <w:tblHeader w:val="true"/>
+        </w:trPr>
+        <w:tc>
+          <w:tcPr>
+            <w:tcW w:type="dxa" w:w="454"/>
+            <w:vAlign w:val="center"/>
+          </w:tcPr>
+          <w:p>
+            <w:pPr>
+              <w:pStyle w:val="TableText"/>
+              <w:jc w:val="center"/>
+            </w:pPr>
+            <w:r>
+              <w:rPr>
+                <w:b/>
+                <w:sz w:val="20"/>
+              </w:rPr>
+              <w:t>№</w:t>
+            </w:r>
+          </w:p>
+        </w:tc>
+        <w:tc>
+          <w:tcPr>
+            <w:tcW w:type="dxa" w:w="5216"/>
+            <w:vAlign w:val="center"/>
+          </w:tcPr>
+          <w:p>
+            <w:pPr>
+              <w:pStyle w:val="TableText"/>
+              <w:jc w:val="center"/>
+            </w:pPr>
+            <w:r>
+              <w:rPr>
+                <w:b/>
+                <w:sz w:val="20"/>
+              </w:rPr>
+              <w:t>Наименование работы</w:t>
+            </w:r>
+          </w:p>
+        </w:tc>
+        <w:tc>
+          <w:tcPr>
+            <w:tcW w:type="dxa" w:w="964"/>
+            <w:vAlign w:val="center"/>
+          </w:tcPr>
+          <w:p>
+            <w:pPr>
+              <w:pStyle w:val="TableText"/>
+              <w:jc w:val="center"/>
+            </w:pPr>
+            <w:r>
+              <w:rPr>
+                <w:b/>
+                <w:sz w:val="20"/>
+              </w:rPr>
+              <w:t>Код (i–j)</w:t>
+            </w:r>
+          </w:p>
+        </w:tc>
+        <w:tc>
+          <w:tcPr>
+            <w:tcW w:type="dxa" w:w="964"/>
+            <w:vAlign w:val="center"/>
+          </w:tcPr>
+          <w:p>
+            <w:pPr>
+              <w:pStyle w:val="TableText"/>
+              <w:jc w:val="center"/>
+            </w:pPr>
+            <w:r>
+              <w:rPr>
+                <w:b/>
+                <w:sz w:val="20"/>
+              </w:rPr>
+              <w:t>Исполни-</w:t>
+            </w:r>
+          </w:p>
+          <w:p>
+            <w:pPr>
+              <w:pStyle w:val="TableText"/>
+              <w:jc w:val="center"/>
+            </w:pPr>
+            <w:r>
+              <w:rPr>
+                <w:b/>
+                <w:sz w:val="20"/>
+              </w:rPr>
+              <w:t>тели</w:t>
+            </w:r>
+          </w:p>
+        </w:tc>
+        <w:tc>
+          <w:tcPr>
+            <w:tcW w:type="dxa" w:w="624"/>
+            <w:vAlign w:val="center"/>
+          </w:tcPr>
+          <w:p>
+            <w:pPr>
+              <w:pStyle w:val="TableText"/>
+              <w:jc w:val="center"/>
+            </w:pPr>
+            <w:r>
+              <w:rPr>
+                <w:b/>
+                <w:sz w:val="20"/>
+              </w:rPr>
+              <w:t>tmin</w:t>
+            </w:r>
+          </w:p>
+        </w:tc>
+        <w:tc>
+          <w:tcPr>
+            <w:tcW w:type="dxa" w:w="624"/>
+            <w:vAlign w:val="center"/>
+          </w:tcPr>
+          <w:p>
+            <w:pPr>
+              <w:pStyle w:val="TableText"/>
+              <w:jc w:val="center"/>
+            </w:pPr>
+            <w:r>
+              <w:rPr>
+                <w:b/>
+                <w:sz w:val="20"/>
+              </w:rPr>
+              <w:t>tmax</w:t>
+            </w:r>
+          </w:p>
+        </w:tc>
+        <w:tc>
+          <w:tcPr>
+            <w:tcW w:type="dxa" w:w="624"/>
+            <w:vAlign w:val="center"/>
+          </w:tcPr>
+          <w:p>
+            <w:pPr>
+              <w:pStyle w:val="TableText"/>
+              <w:jc w:val="center"/>
+            </w:pPr>
+            <w:r>
+              <w:rPr>
+                <w:b/>
+                <w:sz w:val="20"/>
+              </w:rPr>
+              <w:t>tож</w:t>
+            </w:r>
+          </w:p>
+        </w:tc>
+      </w:tr>
+      <w:tr>
+        <w:trPr>
+          <w:cantSplit/>
+        </w:trPr>
+        <w:tc>
+          <w:tcPr>
+            <w:tcW w:type="dxa" w:w="454"/>
+            <w:vAlign w:val="center"/>
+          </w:tcPr>
+          <w:p>
+            <w:pPr>
+              <w:pStyle w:val="TableText"/>
+              <w:jc w:val="center"/>
+            </w:pPr>
+            <w:r>
+              <w:rPr>
+                <w:sz w:val="20"/>
+              </w:rPr>
+              <w:t>1</w:t>
+            </w:r>
+          </w:p>
+        </w:tc>
+        <w:tc>
+          <w:tcPr>
+            <w:tcW w:type="dxa" w:w="5216"/>
+            <w:vAlign w:val="center"/>
+          </w:tcPr>
+          <w:p>
+            <w:pPr>
+              <w:pStyle w:val="TableText"/>
+              <w:jc w:val="left"/>
+            </w:pPr>
+            <w:r>
+              <w:rPr>
+                <w:sz w:val="20"/>
+              </w:rPr>
+              <w:t>Анализ задач применения БПЛА и требований к каналу связи</w:t>
+            </w:r>
+          </w:p>
+        </w:tc>
+        <w:tc>
+          <w:tcPr>
+            <w:tcW w:type="dxa" w:w="964"/>
+            <w:vAlign w:val="center"/>
+          </w:tcPr>
+          <w:p>
+            <w:pPr>
+              <w:pStyle w:val="TableText"/>
+              <w:jc w:val="center"/>
+            </w:pPr>
+            <w:r>
+              <w:rPr>
+                <w:sz w:val="20"/>
+              </w:rPr>
+              <w:t>1–2</w:t>
+            </w:r>
+          </w:p>
+        </w:tc>
+        <w:tc>
+          <w:tcPr>
+            <w:tcW w:type="dxa" w:w="964"/>
+            <w:vAlign w:val="center"/>
+          </w:tcPr>
+          <w:p>
+            <w:pPr>
+              <w:pStyle w:val="TableText"/>
+              <w:jc w:val="center"/>
+            </w:pPr>
+            <w:r>
+              <w:rPr>
+                <w:sz w:val="20"/>
+              </w:rPr>
+              <w:t>И</w:t>
+            </w:r>
+          </w:p>
+        </w:tc>
+        <w:tc>
+          <w:tcPr>
+            <w:tcW w:type="dxa" w:w="624"/>
+            <w:vAlign w:val="center"/>
+          </w:tcPr>
+          <w:p>
+            <w:pPr>
+              <w:pStyle w:val="TableText"/>
+              <w:jc w:val="center"/>
+            </w:pPr>
+            <w:r>
+              <w:rPr>
+                <w:sz w:val="20"/>
+              </w:rPr>
+              <w:t>2</w:t>
+            </w:r>
+          </w:p>
+        </w:tc>
+        <w:tc>
+          <w:tcPr>
+            <w:tcW w:type="dxa" w:w="624"/>
+            <w:vAlign w:val="center"/>
+          </w:tcPr>
+          <w:p>
+            <w:pPr>
+              <w:pStyle w:val="TableText"/>
+              <w:jc w:val="center"/>
+            </w:pPr>
+            <w:r>
+              <w:rPr>
+                <w:sz w:val="20"/>
+              </w:rPr>
+              <w:t>7</w:t>
+            </w:r>
+          </w:p>
+        </w:tc>
+        <w:tc>
+          <w:tcPr>
+            <w:tcW w:type="dxa" w:w="624"/>
+            <w:vAlign w:val="center"/>
+          </w:tcPr>
+          <w:p>
+            <w:pPr>
+              <w:pStyle w:val="TableText"/>
+              <w:jc w:val="center"/>
+            </w:pPr>
+            <w:r>
+              <w:rPr>
+                <w:sz w:val="20"/>
+              </w:rPr>
+              <w:t>4</w:t>
+            </w:r>
+          </w:p>
+        </w:tc>
+      </w:tr>
+      <w:tr>
+        <w:trPr>
+          <w:cantSplit/>
+        </w:trPr>
+        <w:tc>
+          <w:tcPr>
+            <w:tcW w:type="dxa" w:w="454"/>
+            <w:vAlign w:val="center"/>
+          </w:tcPr>
+          <w:p>
+            <w:pPr>
+              <w:pStyle w:val="TableText"/>
+              <w:jc w:val="center"/>
+            </w:pPr>
+            <w:r>
+              <w:rPr>
+                <w:sz w:val="20"/>
+              </w:rPr>
+              <w:t>2</w:t>
+            </w:r>
+          </w:p>
+        </w:tc>
+        <w:tc>
+          <w:tcPr>
+            <w:tcW w:type="dxa" w:w="5216"/>
+            <w:vAlign w:val="center"/>
+          </w:tcPr>
+          <w:p>
+            <w:pPr>
+              <w:pStyle w:val="TableText"/>
+              <w:jc w:val="left"/>
+            </w:pPr>
+            <w:r>
+              <w:rPr>
+                <w:sz w:val="20"/>
+              </w:rPr>
+              <w:t>Сбор открытых данных о характеристиках LoRa, IEEE 802.11 и Wi-Fi HaLow</w:t>
+            </w:r>
+          </w:p>
+        </w:tc>
+        <w:tc>
+          <w:tcPr>
+            <w:tcW w:type="dxa" w:w="964"/>
+            <w:vAlign w:val="center"/>
+          </w:tcPr>
+          <w:p>
+            <w:pPr>
+              <w:pStyle w:val="TableText"/>
+              <w:jc w:val="center"/>
+            </w:pPr>
+            <w:r>
+              <w:rPr>
+                <w:sz w:val="20"/>
+              </w:rPr>
+              <w:t>1–3</w:t>
+            </w:r>
+          </w:p>
+        </w:tc>
+        <w:tc>
+          <w:tcPr>
+            <w:tcW w:type="dxa" w:w="964"/>
+            <w:vAlign w:val="center"/>
+          </w:tcPr>
+          <w:p>
+            <w:pPr>
+              <w:pStyle w:val="TableText"/>
+              <w:jc w:val="center"/>
+            </w:pPr>
+            <w:r>
+              <w:rPr>
+                <w:sz w:val="20"/>
+              </w:rPr>
+              <w:t>П</w:t>
+            </w:r>
+          </w:p>
+        </w:tc>
+        <w:tc>
+          <w:tcPr>
+            <w:tcW w:type="dxa" w:w="624"/>
+            <w:vAlign w:val="center"/>
+          </w:tcPr>
+          <w:p>
+            <w:pPr>
+              <w:pStyle w:val="TableText"/>
+              <w:jc w:val="center"/>
+            </w:pPr>
+            <w:r>
+              <w:rPr>
+                <w:sz w:val="20"/>
+              </w:rPr>
+              <w:t>4</w:t>
+            </w:r>
+          </w:p>
+        </w:tc>
+        <w:tc>
+          <w:tcPr>
+            <w:tcW w:type="dxa" w:w="624"/>
+            <w:vAlign w:val="center"/>
+          </w:tcPr>
+          <w:p>
+            <w:pPr>
+              <w:pStyle w:val="TableText"/>
+              <w:jc w:val="center"/>
+            </w:pPr>
+            <w:r>
+              <w:rPr>
+                <w:sz w:val="20"/>
+              </w:rPr>
+              <w:t>9</w:t>
+            </w:r>
+          </w:p>
+        </w:tc>
+        <w:tc>
+          <w:tcPr>
+            <w:tcW w:type="dxa" w:w="624"/>
+            <w:vAlign w:val="center"/>
+          </w:tcPr>
+          <w:p>
+            <w:pPr>
+              <w:pStyle w:val="TableText"/>
+              <w:jc w:val="center"/>
+            </w:pPr>
+            <w:r>
+              <w:rPr>
+                <w:sz w:val="20"/>
+              </w:rPr>
+              <w:t>6</w:t>
+            </w:r>
+          </w:p>
+        </w:tc>
+      </w:tr>
+      <w:tr>
+        <w:trPr>
+          <w:cantSplit/>
+        </w:trPr>
+        <w:tc>
+          <w:tcPr>
+            <w:tcW w:type="dxa" w:w="454"/>
+            <w:vAlign w:val="center"/>
+          </w:tcPr>
+          <w:p>
+            <w:pPr>
+              <w:pStyle w:val="TableText"/>
+              <w:jc w:val="center"/>
+            </w:pPr>
+            <w:r>
+              <w:rPr>
+                <w:sz w:val="20"/>
+              </w:rPr>
+              <w:t>3</w:t>
+            </w:r>
+          </w:p>
+        </w:tc>
+        <w:tc>
+          <w:tcPr>
+            <w:tcW w:type="dxa" w:w="5216"/>
+            <w:vAlign w:val="center"/>
+          </w:tcPr>
+          <w:p>
+            <w:pPr>
+              <w:pStyle w:val="TableText"/>
+              <w:jc w:val="left"/>
+            </w:pPr>
+            <w:r>
+              <w:rPr>
+                <w:sz w:val="20"/>
+              </w:rPr>
+              <w:t>Сравнение Wi-Fi HaLow с другими вариантами канала связи по дальности, пропускной способности, энергопотреблению и проникающей способности</w:t>
+            </w:r>
+          </w:p>
+        </w:tc>
+        <w:tc>
+          <w:tcPr>
+            <w:tcW w:type="dxa" w:w="964"/>
+            <w:vAlign w:val="center"/>
+          </w:tcPr>
+          <w:p>
+            <w:pPr>
+              <w:pStyle w:val="TableText"/>
+              <w:jc w:val="center"/>
+            </w:pPr>
+            <w:r>
+              <w:rPr>
+                <w:sz w:val="20"/>
+              </w:rPr>
+              <w:t>2–3</w:t>
+            </w:r>
+          </w:p>
+        </w:tc>
+        <w:tc>
+          <w:tcPr>
+            <w:tcW w:type="dxa" w:w="964"/>
+            <w:vAlign w:val="center"/>
+          </w:tcPr>
+          <w:p>
+            <w:pPr>
+              <w:pStyle w:val="TableText"/>
+              <w:jc w:val="center"/>
+            </w:pPr>
+            <w:r>
+              <w:rPr>
+                <w:sz w:val="20"/>
+              </w:rPr>
+              <w:t>И</w:t>
+            </w:r>
+          </w:p>
+        </w:tc>
+        <w:tc>
+          <w:tcPr>
+            <w:tcW w:type="dxa" w:w="624"/>
+            <w:vAlign w:val="center"/>
+          </w:tcPr>
+          <w:p>
+            <w:pPr>
+              <w:pStyle w:val="TableText"/>
+              <w:jc w:val="center"/>
+            </w:pPr>
+            <w:r>
+              <w:rPr>
+                <w:sz w:val="20"/>
+              </w:rPr>
+              <w:t>4</w:t>
+            </w:r>
+          </w:p>
+        </w:tc>
+        <w:tc>
+          <w:tcPr>
+            <w:tcW w:type="dxa" w:w="624"/>
+            <w:vAlign w:val="center"/>
+          </w:tcPr>
+          <w:p>
+            <w:pPr>
+              <w:pStyle w:val="TableText"/>
+              <w:jc w:val="center"/>
+            </w:pPr>
+            <w:r>
+              <w:rPr>
+                <w:sz w:val="20"/>
+              </w:rPr>
+              <w:t>9</w:t>
+            </w:r>
+          </w:p>
+        </w:tc>
+        <w:tc>
+          <w:tcPr>
+            <w:tcW w:type="dxa" w:w="624"/>
+            <w:vAlign w:val="center"/>
+          </w:tcPr>
+          <w:p>
+            <w:pPr>
+              <w:pStyle w:val="TableText"/>
+              <w:jc w:val="center"/>
+            </w:pPr>
+            <w:r>
+              <w:rPr>
+                <w:sz w:val="20"/>
+              </w:rPr>
+              <w:t>6</w:t>
+            </w:r>
+          </w:p>
+        </w:tc>
+      </w:tr>
+      <w:tr>
+        <w:trPr>
+          <w:cantSplit/>
+        </w:trPr>
+        <w:tc>
+          <w:tcPr>
+            <w:tcW w:type="dxa" w:w="454"/>
+            <w:vAlign w:val="center"/>
+          </w:tcPr>
+          <w:p>
+            <w:pPr>
+              <w:pStyle w:val="TableText"/>
+              <w:jc w:val="center"/>
+            </w:pPr>
+            <w:r>
+              <w:rPr>
+                <w:sz w:val="20"/>
+              </w:rPr>
+              <w:t>4</w:t>
+            </w:r>
+          </w:p>
+        </w:tc>
+        <w:tc>
+          <w:tcPr>
+            <w:tcW w:type="dxa" w:w="5216"/>
+            <w:vAlign w:val="center"/>
+          </w:tcPr>
+          <w:p>
+            <w:pPr>
+              <w:pStyle w:val="TableText"/>
+              <w:jc w:val="left"/>
+            </w:pPr>
+            <w:r>
+              <w:rPr>
+                <w:sz w:val="20"/>
+              </w:rPr>
+              <w:t>Рассмотрение результатов сравнительного анализа</w:t>
+            </w:r>
+          </w:p>
+        </w:tc>
+        <w:tc>
+          <w:tcPr>
+            <w:tcW w:type="dxa" w:w="964"/>
+            <w:vAlign w:val="center"/>
+          </w:tcPr>
+          <w:p>
+            <w:pPr>
+              <w:pStyle w:val="TableText"/>
+              <w:jc w:val="center"/>
+            </w:pPr>
+            <w:r>
+              <w:rPr>
+                <w:sz w:val="20"/>
+              </w:rPr>
+              <w:t>3–4</w:t>
+            </w:r>
+          </w:p>
+        </w:tc>
+        <w:tc>
+          <w:tcPr>
+            <w:tcW w:type="dxa" w:w="964"/>
+            <w:vAlign w:val="center"/>
+          </w:tcPr>
+          <w:p>
+            <w:pPr>
+              <w:pStyle w:val="TableText"/>
+              <w:jc w:val="center"/>
+            </w:pPr>
+            <w:r>
+              <w:rPr>
+                <w:sz w:val="20"/>
+              </w:rPr>
+              <w:t>Р</w:t>
+            </w:r>
+          </w:p>
+        </w:tc>
+        <w:tc>
+          <w:tcPr>
+            <w:tcW w:type="dxa" w:w="624"/>
+            <w:vAlign w:val="center"/>
+          </w:tcPr>
+          <w:p>
+            <w:pPr>
+              <w:pStyle w:val="TableText"/>
+              <w:jc w:val="center"/>
+            </w:pPr>
+            <w:r>
+              <w:rPr>
+                <w:sz w:val="20"/>
+              </w:rPr>
+              <w:t>0,5</w:t>
+            </w:r>
+          </w:p>
+        </w:tc>
+        <w:tc>
+          <w:tcPr>
+            <w:tcW w:type="dxa" w:w="624"/>
+            <w:vAlign w:val="center"/>
+          </w:tcPr>
+          <w:p>
+            <w:pPr>
+              <w:pStyle w:val="TableText"/>
+              <w:jc w:val="center"/>
+            </w:pPr>
+            <w:r>
+              <w:rPr>
+                <w:sz w:val="20"/>
+              </w:rPr>
+              <w:t>1,75</w:t>
+            </w:r>
+          </w:p>
+        </w:tc>
+        <w:tc>
+          <w:tcPr>
+            <w:tcW w:type="dxa" w:w="624"/>
+            <w:vAlign w:val="center"/>
+          </w:tcPr>
+          <w:p>
+            <w:pPr>
+              <w:pStyle w:val="TableText"/>
+              <w:jc w:val="center"/>
+            </w:pPr>
+            <w:r>
+              <w:rPr>
+                <w:sz w:val="20"/>
+              </w:rPr>
+              <w:t>1</w:t>
+            </w:r>
+          </w:p>
+        </w:tc>
+      </w:tr>
+      <w:tr>
+        <w:trPr>
+          <w:cantSplit/>
+        </w:trPr>
+        <w:tc>
+          <w:tcPr>
+            <w:tcW w:type="dxa" w:w="454"/>
+            <w:vAlign w:val="center"/>
+          </w:tcPr>
+          <w:p>
+            <w:pPr>
+              <w:pStyle w:val="TableText"/>
+              <w:jc w:val="center"/>
+            </w:pPr>
+            <w:r>
+              <w:rPr>
+                <w:sz w:val="20"/>
+              </w:rPr>
+              <w:t>5</w:t>
+            </w:r>
+          </w:p>
+        </w:tc>
+        <w:tc>
+          <w:tcPr>
+            <w:tcW w:type="dxa" w:w="5216"/>
+            <w:vAlign w:val="center"/>
+          </w:tcPr>
+          <w:p>
+            <w:pPr>
+              <w:pStyle w:val="TableText"/>
+              <w:jc w:val="left"/>
+            </w:pPr>
+            <w:r>
+              <w:rPr>
+                <w:sz w:val="20"/>
+              </w:rPr>
+              <w:t>Обоснование необходимости эксперимента, разработка методики экспериментов</w:t>
+            </w:r>
+          </w:p>
+        </w:tc>
+        <w:tc>
+          <w:tcPr>
+            <w:tcW w:type="dxa" w:w="964"/>
+            <w:vAlign w:val="center"/>
+          </w:tcPr>
+          <w:p>
+            <w:pPr>
+              <w:pStyle w:val="TableText"/>
+              <w:jc w:val="center"/>
+            </w:pPr>
+            <w:r>
+              <w:rPr>
+                <w:sz w:val="20"/>
+              </w:rPr>
+              <w:t>4–5</w:t>
+            </w:r>
+          </w:p>
+        </w:tc>
+        <w:tc>
+          <w:tcPr>
+            <w:tcW w:type="dxa" w:w="964"/>
+            <w:vAlign w:val="center"/>
+          </w:tcPr>
+          <w:p>
+            <w:pPr>
+              <w:pStyle w:val="TableText"/>
+              <w:jc w:val="center"/>
+            </w:pPr>
+            <w:r>
+              <w:rPr>
+                <w:sz w:val="20"/>
+              </w:rPr>
+              <w:t>И</w:t>
+            </w:r>
+          </w:p>
+        </w:tc>
+        <w:tc>
+          <w:tcPr>
+            <w:tcW w:type="dxa" w:w="624"/>
+            <w:vAlign w:val="center"/>
+          </w:tcPr>
+          <w:p>
+            <w:pPr>
+              <w:pStyle w:val="TableText"/>
+              <w:jc w:val="center"/>
+            </w:pPr>
+            <w:r>
+              <w:rPr>
+                <w:sz w:val="20"/>
+              </w:rPr>
+              <w:t>6</w:t>
+            </w:r>
+          </w:p>
+        </w:tc>
+        <w:tc>
+          <w:tcPr>
+            <w:tcW w:type="dxa" w:w="624"/>
+            <w:vAlign w:val="center"/>
+          </w:tcPr>
+          <w:p>
+            <w:pPr>
+              <w:pStyle w:val="TableText"/>
+              <w:jc w:val="center"/>
+            </w:pPr>
+            <w:r>
+              <w:rPr>
+                <w:sz w:val="20"/>
+              </w:rPr>
+              <w:t>11</w:t>
+            </w:r>
+          </w:p>
+        </w:tc>
+        <w:tc>
+          <w:tcPr>
+            <w:tcW w:type="dxa" w:w="624"/>
+            <w:vAlign w:val="center"/>
+          </w:tcPr>
+          <w:p>
+            <w:pPr>
+              <w:pStyle w:val="TableText"/>
+              <w:jc w:val="center"/>
+            </w:pPr>
+            <w:r>
+              <w:rPr>
+                <w:sz w:val="20"/>
+              </w:rPr>
+              <w:t>8</w:t>
+            </w:r>
+          </w:p>
+        </w:tc>
+      </w:tr>
+      <w:tr>
+        <w:trPr>
+          <w:cantSplit/>
+        </w:trPr>
+        <w:tc>
+          <w:tcPr>
+            <w:tcW w:type="dxa" w:w="454"/>
+            <w:vAlign w:val="center"/>
+          </w:tcPr>
+          <w:p>
+            <w:pPr>
+              <w:pStyle w:val="TableText"/>
+              <w:jc w:val="center"/>
+            </w:pPr>
+            <w:r>
+              <w:rPr>
+                <w:sz w:val="20"/>
+              </w:rPr>
+              <w:t>6</w:t>
+            </w:r>
+          </w:p>
+        </w:tc>
+        <w:tc>
+          <w:tcPr>
+            <w:tcW w:type="dxa" w:w="5216"/>
+            <w:vAlign w:val="center"/>
+          </w:tcPr>
+          <w:p>
+            <w:pPr>
+              <w:pStyle w:val="TableText"/>
+              <w:jc w:val="left"/>
+            </w:pPr>
+            <w:r>
+              <w:rPr>
+                <w:sz w:val="20"/>
+              </w:rPr>
+              <w:t>Обновление встроенного программного обеспечения радиомодулей, разработка программ передачи видео и регистрации показателей канала</w:t>
+            </w:r>
+          </w:p>
+        </w:tc>
+        <w:tc>
+          <w:tcPr>
+            <w:tcW w:type="dxa" w:w="964"/>
+            <w:vAlign w:val="center"/>
+          </w:tcPr>
+          <w:p>
+            <w:pPr>
+              <w:pStyle w:val="TableText"/>
+              <w:jc w:val="center"/>
+            </w:pPr>
+            <w:r>
+              <w:rPr>
+                <w:sz w:val="20"/>
+              </w:rPr>
+              <w:t>4–6</w:t>
+            </w:r>
+          </w:p>
+        </w:tc>
+        <w:tc>
+          <w:tcPr>
+            <w:tcW w:type="dxa" w:w="964"/>
+            <w:vAlign w:val="center"/>
+          </w:tcPr>
+          <w:p>
+            <w:pPr>
+              <w:pStyle w:val="TableText"/>
+              <w:jc w:val="center"/>
+            </w:pPr>
+            <w:r>
+              <w:rPr>
+                <w:sz w:val="20"/>
+              </w:rPr>
+              <w:t>П</w:t>
+            </w:r>
+          </w:p>
+        </w:tc>
+        <w:tc>
+          <w:tcPr>
+            <w:tcW w:type="dxa" w:w="624"/>
+            <w:vAlign w:val="center"/>
+          </w:tcPr>
+          <w:p>
+            <w:pPr>
+              <w:pStyle w:val="TableText"/>
+              <w:jc w:val="center"/>
+            </w:pPr>
+            <w:r>
+              <w:rPr>
+                <w:sz w:val="20"/>
+              </w:rPr>
+              <w:t>12</w:t>
+            </w:r>
+          </w:p>
+        </w:tc>
+        <w:tc>
+          <w:tcPr>
+            <w:tcW w:type="dxa" w:w="624"/>
+            <w:vAlign w:val="center"/>
+          </w:tcPr>
+          <w:p>
+            <w:pPr>
+              <w:pStyle w:val="TableText"/>
+              <w:jc w:val="center"/>
+            </w:pPr>
+            <w:r>
+              <w:rPr>
+                <w:sz w:val="20"/>
+              </w:rPr>
+              <w:t>17</w:t>
+            </w:r>
+          </w:p>
+        </w:tc>
+        <w:tc>
+          <w:tcPr>
+            <w:tcW w:type="dxa" w:w="624"/>
+            <w:vAlign w:val="center"/>
+          </w:tcPr>
+          <w:p>
+            <w:pPr>
+              <w:pStyle w:val="TableText"/>
+              <w:jc w:val="center"/>
+            </w:pPr>
+            <w:r>
+              <w:rPr>
+                <w:sz w:val="20"/>
+              </w:rPr>
+              <w:t>14</w:t>
+            </w:r>
+          </w:p>
+        </w:tc>
+      </w:tr>
+      <w:tr>
+        <w:trPr>
+          <w:cantSplit/>
+        </w:trPr>
+        <w:tc>
+          <w:tcPr>
+            <w:tcW w:type="dxa" w:w="454"/>
+            <w:vAlign w:val="center"/>
+          </w:tcPr>
+          <w:p>
+            <w:pPr>
+              <w:pStyle w:val="TableText"/>
+              <w:jc w:val="center"/>
+            </w:pPr>
+            <w:r>
+              <w:rPr>
+                <w:sz w:val="20"/>
+              </w:rPr>
+              <w:t>7</w:t>
+            </w:r>
+          </w:p>
+        </w:tc>
+        <w:tc>
+          <w:tcPr>
+            <w:tcW w:type="dxa" w:w="5216"/>
+            <w:vAlign w:val="center"/>
+          </w:tcPr>
+          <w:p>
+            <w:pPr>
+              <w:pStyle w:val="TableText"/>
+              <w:jc w:val="left"/>
+            </w:pPr>
+            <w:r>
+              <w:rPr>
+                <w:sz w:val="20"/>
+              </w:rPr>
+              <w:t>Утверждение методики экспериментов</w:t>
+            </w:r>
+          </w:p>
+        </w:tc>
+        <w:tc>
+          <w:tcPr>
+            <w:tcW w:type="dxa" w:w="964"/>
+            <w:vAlign w:val="center"/>
+          </w:tcPr>
+          <w:p>
+            <w:pPr>
+              <w:pStyle w:val="TableText"/>
+              <w:jc w:val="center"/>
+            </w:pPr>
+            <w:r>
+              <w:rPr>
+                <w:sz w:val="20"/>
+              </w:rPr>
+              <w:t>5–7</w:t>
+            </w:r>
+          </w:p>
+        </w:tc>
+        <w:tc>
+          <w:tcPr>
+            <w:tcW w:type="dxa" w:w="964"/>
+            <w:vAlign w:val="center"/>
+          </w:tcPr>
+          <w:p>
+            <w:pPr>
+              <w:pStyle w:val="TableText"/>
+              <w:jc w:val="center"/>
+            </w:pPr>
+            <w:r>
+              <w:rPr>
+                <w:sz w:val="20"/>
+              </w:rPr>
+              <w:t>Р</w:t>
+            </w:r>
+          </w:p>
+        </w:tc>
+        <w:tc>
+          <w:tcPr>
+            <w:tcW w:type="dxa" w:w="624"/>
+            <w:vAlign w:val="center"/>
+          </w:tcPr>
+          <w:p>
+            <w:pPr>
+              <w:pStyle w:val="TableText"/>
+              <w:jc w:val="center"/>
+            </w:pPr>
+            <w:r>
+              <w:rPr>
+                <w:sz w:val="20"/>
+              </w:rPr>
+              <w:t>0,5</w:t>
+            </w:r>
+          </w:p>
+        </w:tc>
+        <w:tc>
+          <w:tcPr>
+            <w:tcW w:type="dxa" w:w="624"/>
+            <w:vAlign w:val="center"/>
+          </w:tcPr>
+          <w:p>
+            <w:pPr>
+              <w:pStyle w:val="TableText"/>
+              <w:jc w:val="center"/>
+            </w:pPr>
+            <w:r>
+              <w:rPr>
+                <w:sz w:val="20"/>
+              </w:rPr>
+              <w:t>1,75</w:t>
+            </w:r>
+          </w:p>
+        </w:tc>
+        <w:tc>
+          <w:tcPr>
+            <w:tcW w:type="dxa" w:w="624"/>
+            <w:vAlign w:val="center"/>
+          </w:tcPr>
+          <w:p>
+            <w:pPr>
+              <w:pStyle w:val="TableText"/>
+              <w:jc w:val="center"/>
+            </w:pPr>
+            <w:r>
+              <w:rPr>
+                <w:sz w:val="20"/>
+              </w:rPr>
+              <w:t>1</w:t>
+            </w:r>
+          </w:p>
+        </w:tc>
+      </w:tr>
+      <w:tr>
+        <w:trPr>
+          <w:cantSplit/>
+        </w:trPr>
+        <w:tc>
+          <w:tcPr>
+            <w:tcW w:type="dxa" w:w="454"/>
+            <w:vAlign w:val="center"/>
+          </w:tcPr>
+          <w:p>
+            <w:pPr>
+              <w:pStyle w:val="TableText"/>
+              <w:jc w:val="center"/>
+            </w:pPr>
+            <w:r>
+              <w:rPr>
+                <w:sz w:val="20"/>
+              </w:rPr>
+              <w:t>8</w:t>
+            </w:r>
+          </w:p>
+        </w:tc>
+        <w:tc>
+          <w:tcPr>
+            <w:tcW w:type="dxa" w:w="5216"/>
+            <w:vAlign w:val="center"/>
+          </w:tcPr>
+          <w:p>
+            <w:pPr>
+              <w:pStyle w:val="TableText"/>
+              <w:jc w:val="left"/>
+            </w:pPr>
+            <w:r>
+              <w:rPr>
+                <w:sz w:val="20"/>
+              </w:rPr>
+              <w:t>Сборка и отладка экспериментального стенда</w:t>
+            </w:r>
+          </w:p>
+        </w:tc>
+        <w:tc>
+          <w:tcPr>
+            <w:tcW w:type="dxa" w:w="964"/>
+            <w:vAlign w:val="center"/>
+          </w:tcPr>
+          <w:p>
+            <w:pPr>
+              <w:pStyle w:val="TableText"/>
+              <w:jc w:val="center"/>
+            </w:pPr>
+            <w:r>
+              <w:rPr>
+                <w:sz w:val="20"/>
+              </w:rPr>
+              <w:t>6–7</w:t>
+            </w:r>
+          </w:p>
+        </w:tc>
+        <w:tc>
+          <w:tcPr>
+            <w:tcW w:type="dxa" w:w="964"/>
+            <w:vAlign w:val="center"/>
+          </w:tcPr>
+          <w:p>
+            <w:pPr>
+              <w:pStyle w:val="TableText"/>
+              <w:jc w:val="center"/>
+            </w:pPr>
+            <w:r>
+              <w:rPr>
+                <w:sz w:val="20"/>
+              </w:rPr>
+              <w:t>И, П</w:t>
+            </w:r>
+          </w:p>
+        </w:tc>
+        <w:tc>
+          <w:tcPr>
+            <w:tcW w:type="dxa" w:w="624"/>
+            <w:vAlign w:val="center"/>
+          </w:tcPr>
+          <w:p>
+            <w:pPr>
+              <w:pStyle w:val="TableText"/>
+              <w:jc w:val="center"/>
+            </w:pPr>
+            <w:r>
+              <w:rPr>
+                <w:sz w:val="20"/>
+              </w:rPr>
+              <w:t>2</w:t>
+            </w:r>
+          </w:p>
+        </w:tc>
+        <w:tc>
+          <w:tcPr>
+            <w:tcW w:type="dxa" w:w="624"/>
+            <w:vAlign w:val="center"/>
+          </w:tcPr>
+          <w:p>
+            <w:pPr>
+              <w:pStyle w:val="TableText"/>
+              <w:jc w:val="center"/>
+            </w:pPr>
+            <w:r>
+              <w:rPr>
+                <w:sz w:val="20"/>
+              </w:rPr>
+              <w:t>7</w:t>
+            </w:r>
+          </w:p>
+        </w:tc>
+        <w:tc>
+          <w:tcPr>
+            <w:tcW w:type="dxa" w:w="624"/>
+            <w:vAlign w:val="center"/>
+          </w:tcPr>
+          <w:p>
+            <w:pPr>
+              <w:pStyle w:val="TableText"/>
+              <w:jc w:val="center"/>
+            </w:pPr>
+            <w:r>
+              <w:rPr>
+                <w:sz w:val="20"/>
+              </w:rPr>
+              <w:t>4</w:t>
+            </w:r>
+          </w:p>
+        </w:tc>
+      </w:tr>
+      <w:tr>
+        <w:trPr>
+          <w:cantSplit/>
+        </w:trPr>
+        <w:tc>
+          <w:tcPr>
+            <w:tcW w:type="dxa" w:w="454"/>
+            <w:vAlign w:val="center"/>
+          </w:tcPr>
+          <w:p>
+            <w:pPr>
+              <w:pStyle w:val="TableText"/>
+              <w:jc w:val="center"/>
+            </w:pPr>
+            <w:r>
+              <w:rPr>
+                <w:sz w:val="20"/>
+              </w:rPr>
+              <w:t>9</w:t>
+            </w:r>
+          </w:p>
+        </w:tc>
+        <w:tc>
+          <w:tcPr>
+            <w:tcW w:type="dxa" w:w="5216"/>
+            <w:vAlign w:val="center"/>
+          </w:tcPr>
+          <w:p>
+            <w:pPr>
+              <w:pStyle w:val="TableText"/>
+              <w:jc w:val="left"/>
+            </w:pPr>
+            <w:r>
+              <w:rPr>
+                <w:sz w:val="20"/>
+              </w:rPr>
+              <w:t>Измерение показателей канала Wi-Fi HaLow</w:t>
+            </w:r>
+          </w:p>
+        </w:tc>
+        <w:tc>
+          <w:tcPr>
+            <w:tcW w:type="dxa" w:w="964"/>
+            <w:vAlign w:val="center"/>
+          </w:tcPr>
+          <w:p>
+            <w:pPr>
+              <w:pStyle w:val="TableText"/>
+              <w:jc w:val="center"/>
+            </w:pPr>
+            <w:r>
+              <w:rPr>
+                <w:sz w:val="20"/>
+              </w:rPr>
+              <w:t>7–8</w:t>
+            </w:r>
+          </w:p>
+        </w:tc>
+        <w:tc>
+          <w:tcPr>
+            <w:tcW w:type="dxa" w:w="964"/>
+            <w:vAlign w:val="center"/>
+          </w:tcPr>
+          <w:p>
+            <w:pPr>
+              <w:pStyle w:val="TableText"/>
+              <w:jc w:val="center"/>
+            </w:pPr>
+            <w:r>
+              <w:rPr>
+                <w:sz w:val="20"/>
+              </w:rPr>
+              <w:t>И, Т</w:t>
+            </w:r>
+          </w:p>
+        </w:tc>
+        <w:tc>
+          <w:tcPr>
+            <w:tcW w:type="dxa" w:w="624"/>
+            <w:vAlign w:val="center"/>
+          </w:tcPr>
+          <w:p>
+            <w:pPr>
+              <w:pStyle w:val="TableText"/>
+              <w:jc w:val="center"/>
+            </w:pPr>
+            <w:r>
+              <w:rPr>
+                <w:sz w:val="20"/>
+              </w:rPr>
+              <w:t>7</w:t>
+            </w:r>
+          </w:p>
+        </w:tc>
+        <w:tc>
+          <w:tcPr>
+            <w:tcW w:type="dxa" w:w="624"/>
+            <w:vAlign w:val="center"/>
+          </w:tcPr>
+          <w:p>
+            <w:pPr>
+              <w:pStyle w:val="TableText"/>
+              <w:jc w:val="center"/>
+            </w:pPr>
+            <w:r>
+              <w:rPr>
+                <w:sz w:val="20"/>
+              </w:rPr>
+              <w:t>12</w:t>
+            </w:r>
+          </w:p>
+        </w:tc>
+        <w:tc>
+          <w:tcPr>
+            <w:tcW w:type="dxa" w:w="624"/>
+            <w:vAlign w:val="center"/>
+          </w:tcPr>
+          <w:p>
+            <w:pPr>
+              <w:pStyle w:val="TableText"/>
+              <w:jc w:val="center"/>
+            </w:pPr>
+            <w:r>
+              <w:rPr>
+                <w:sz w:val="20"/>
+              </w:rPr>
+              <w:t>9</w:t>
+            </w:r>
+          </w:p>
+        </w:tc>
+      </w:tr>
+      <w:tr>
+        <w:trPr>
+          <w:cantSplit/>
+        </w:trPr>
+        <w:tc>
+          <w:tcPr>
+            <w:tcW w:type="dxa" w:w="454"/>
+            <w:vAlign w:val="center"/>
+          </w:tcPr>
+          <w:p>
+            <w:pPr>
+              <w:pStyle w:val="TableText"/>
+              <w:jc w:val="center"/>
+            </w:pPr>
+            <w:r>
+              <w:rPr>
+                <w:sz w:val="20"/>
+              </w:rPr>
+              <w:t>10</w:t>
+            </w:r>
+          </w:p>
+        </w:tc>
+        <w:tc>
+          <w:tcPr>
+            <w:tcW w:type="dxa" w:w="5216"/>
+            <w:vAlign w:val="center"/>
+          </w:tcPr>
+          <w:p>
+            <w:pPr>
+              <w:pStyle w:val="TableText"/>
+              <w:jc w:val="left"/>
+            </w:pPr>
+            <w:r>
+              <w:rPr>
+                <w:sz w:val="20"/>
+              </w:rPr>
+              <w:t>Подготовка программ обработки результатов измерений</w:t>
+            </w:r>
+          </w:p>
+        </w:tc>
+        <w:tc>
+          <w:tcPr>
+            <w:tcW w:type="dxa" w:w="964"/>
+            <w:vAlign w:val="center"/>
+          </w:tcPr>
+          <w:p>
+            <w:pPr>
+              <w:pStyle w:val="TableText"/>
+              <w:jc w:val="center"/>
+            </w:pPr>
+            <w:r>
+              <w:rPr>
+                <w:sz w:val="20"/>
+              </w:rPr>
+              <w:t>7–9</w:t>
+            </w:r>
+          </w:p>
+        </w:tc>
+        <w:tc>
+          <w:tcPr>
+            <w:tcW w:type="dxa" w:w="964"/>
+            <w:vAlign w:val="center"/>
+          </w:tcPr>
+          <w:p>
+            <w:pPr>
+              <w:pStyle w:val="TableText"/>
+              <w:jc w:val="center"/>
+            </w:pPr>
+            <w:r>
+              <w:rPr>
+                <w:sz w:val="20"/>
+              </w:rPr>
+              <w:t>П</w:t>
+            </w:r>
+          </w:p>
+        </w:tc>
+        <w:tc>
+          <w:tcPr>
+            <w:tcW w:type="dxa" w:w="624"/>
+            <w:vAlign w:val="center"/>
+          </w:tcPr>
+          <w:p>
+            <w:pPr>
+              <w:pStyle w:val="TableText"/>
+              <w:jc w:val="center"/>
+            </w:pPr>
+            <w:r>
+              <w:rPr>
+                <w:sz w:val="20"/>
+              </w:rPr>
+              <w:t>4</w:t>
+            </w:r>
+          </w:p>
+        </w:tc>
+        <w:tc>
+          <w:tcPr>
+            <w:tcW w:type="dxa" w:w="624"/>
+            <w:vAlign w:val="center"/>
+          </w:tcPr>
+          <w:p>
+            <w:pPr>
+              <w:pStyle w:val="TableText"/>
+              <w:jc w:val="center"/>
+            </w:pPr>
+            <w:r>
+              <w:rPr>
+                <w:sz w:val="20"/>
+              </w:rPr>
+              <w:t>9</w:t>
+            </w:r>
+          </w:p>
+        </w:tc>
+        <w:tc>
+          <w:tcPr>
+            <w:tcW w:type="dxa" w:w="624"/>
+            <w:vAlign w:val="center"/>
+          </w:tcPr>
+          <w:p>
+            <w:pPr>
+              <w:pStyle w:val="TableText"/>
+              <w:jc w:val="center"/>
+            </w:pPr>
+            <w:r>
+              <w:rPr>
+                <w:sz w:val="20"/>
+              </w:rPr>
+              <w:t>6</w:t>
+            </w:r>
+          </w:p>
+        </w:tc>
+      </w:tr>
+      <w:tr>
+        <w:trPr>
+          <w:cantSplit/>
+        </w:trPr>
+        <w:tc>
+          <w:tcPr>
+            <w:tcW w:type="dxa" w:w="454"/>
+            <w:vAlign w:val="center"/>
+          </w:tcPr>
+          <w:p>
+            <w:pPr>
+              <w:pStyle w:val="TableText"/>
+              <w:jc w:val="center"/>
+            </w:pPr>
+            <w:r>
+              <w:rPr>
+                <w:sz w:val="20"/>
+              </w:rPr>
+              <w:t>11</w:t>
+            </w:r>
+          </w:p>
+        </w:tc>
+        <w:tc>
+          <w:tcPr>
+            <w:tcW w:type="dxa" w:w="5216"/>
+            <w:vAlign w:val="center"/>
+          </w:tcPr>
+          <w:p>
+            <w:pPr>
+              <w:pStyle w:val="TableText"/>
+              <w:jc w:val="left"/>
+            </w:pPr>
+            <w:r>
+              <w:rPr>
+                <w:sz w:val="20"/>
+              </w:rPr>
+              <w:t>Измерение тех же показателей для IEEE 802.11 на той же аппаратной платформе</w:t>
+            </w:r>
+          </w:p>
+        </w:tc>
+        <w:tc>
+          <w:tcPr>
+            <w:tcW w:type="dxa" w:w="964"/>
+            <w:vAlign w:val="center"/>
+          </w:tcPr>
+          <w:p>
+            <w:pPr>
+              <w:pStyle w:val="TableText"/>
+              <w:jc w:val="center"/>
+            </w:pPr>
+            <w:r>
+              <w:rPr>
+                <w:sz w:val="20"/>
+              </w:rPr>
+              <w:t>8–9</w:t>
+            </w:r>
+          </w:p>
+        </w:tc>
+        <w:tc>
+          <w:tcPr>
+            <w:tcW w:type="dxa" w:w="964"/>
+            <w:vAlign w:val="center"/>
+          </w:tcPr>
+          <w:p>
+            <w:pPr>
+              <w:pStyle w:val="TableText"/>
+              <w:jc w:val="center"/>
+            </w:pPr>
+            <w:r>
+              <w:rPr>
+                <w:sz w:val="20"/>
+              </w:rPr>
+              <w:t>И, Т</w:t>
+            </w:r>
+          </w:p>
+        </w:tc>
+        <w:tc>
+          <w:tcPr>
+            <w:tcW w:type="dxa" w:w="624"/>
+            <w:vAlign w:val="center"/>
+          </w:tcPr>
+          <w:p>
+            <w:pPr>
+              <w:pStyle w:val="TableText"/>
+              <w:jc w:val="center"/>
+            </w:pPr>
+            <w:r>
+              <w:rPr>
+                <w:sz w:val="20"/>
+              </w:rPr>
+              <w:t>3</w:t>
+            </w:r>
+          </w:p>
+        </w:tc>
+        <w:tc>
+          <w:tcPr>
+            <w:tcW w:type="dxa" w:w="624"/>
+            <w:vAlign w:val="center"/>
+          </w:tcPr>
+          <w:p>
+            <w:pPr>
+              <w:pStyle w:val="TableText"/>
+              <w:jc w:val="center"/>
+            </w:pPr>
+            <w:r>
+              <w:rPr>
+                <w:sz w:val="20"/>
+              </w:rPr>
+              <w:t>8</w:t>
+            </w:r>
+          </w:p>
+        </w:tc>
+        <w:tc>
+          <w:tcPr>
+            <w:tcW w:type="dxa" w:w="624"/>
+            <w:vAlign w:val="center"/>
+          </w:tcPr>
+          <w:p>
+            <w:pPr>
+              <w:pStyle w:val="TableText"/>
+              <w:jc w:val="center"/>
+            </w:pPr>
+            <w:r>
+              <w:rPr>
+                <w:sz w:val="20"/>
+              </w:rPr>
+              <w:t>5</w:t>
+            </w:r>
+          </w:p>
+        </w:tc>
+      </w:tr>
+      <w:tr>
+        <w:trPr>
+          <w:cantSplit/>
+        </w:trPr>
+        <w:tc>
+          <w:tcPr>
+            <w:tcW w:type="dxa" w:w="454"/>
+            <w:vAlign w:val="center"/>
+          </w:tcPr>
+          <w:p>
+            <w:pPr>
+              <w:pStyle w:val="TableText"/>
+              <w:jc w:val="center"/>
+            </w:pPr>
+            <w:r>
+              <w:rPr>
+                <w:sz w:val="20"/>
+              </w:rPr>
+              <w:t>12</w:t>
+            </w:r>
+          </w:p>
+        </w:tc>
+        <w:tc>
+          <w:tcPr>
+            <w:tcW w:type="dxa" w:w="5216"/>
+            <w:vAlign w:val="center"/>
+          </w:tcPr>
+          <w:p>
+            <w:pPr>
+              <w:pStyle w:val="TableText"/>
+              <w:jc w:val="left"/>
+            </w:pPr>
+            <w:r>
+              <w:rPr>
+                <w:sz w:val="20"/>
+              </w:rPr>
+              <w:t>Обработка результатов, сравнение с другими протоколами</w:t>
+            </w:r>
+          </w:p>
+        </w:tc>
+        <w:tc>
+          <w:tcPr>
+            <w:tcW w:type="dxa" w:w="964"/>
+            <w:vAlign w:val="center"/>
+          </w:tcPr>
+          <w:p>
+            <w:pPr>
+              <w:pStyle w:val="TableText"/>
+              <w:jc w:val="center"/>
+            </w:pPr>
+            <w:r>
+              <w:rPr>
+                <w:sz w:val="20"/>
+              </w:rPr>
+              <w:t>9–10</w:t>
+            </w:r>
+          </w:p>
+        </w:tc>
+        <w:tc>
+          <w:tcPr>
+            <w:tcW w:type="dxa" w:w="964"/>
+            <w:vAlign w:val="center"/>
+          </w:tcPr>
+          <w:p>
+            <w:pPr>
+              <w:pStyle w:val="TableText"/>
+              <w:jc w:val="center"/>
+            </w:pPr>
+            <w:r>
+              <w:rPr>
+                <w:sz w:val="20"/>
+              </w:rPr>
+              <w:t>И, П</w:t>
+            </w:r>
+          </w:p>
+        </w:tc>
+        <w:tc>
+          <w:tcPr>
+            <w:tcW w:type="dxa" w:w="624"/>
+            <w:vAlign w:val="center"/>
+          </w:tcPr>
+          <w:p>
+            <w:pPr>
+              <w:pStyle w:val="TableText"/>
+              <w:jc w:val="center"/>
+            </w:pPr>
+            <w:r>
+              <w:rPr>
+                <w:sz w:val="20"/>
+              </w:rPr>
+              <w:t>3</w:t>
+            </w:r>
+          </w:p>
+        </w:tc>
+        <w:tc>
+          <w:tcPr>
+            <w:tcW w:type="dxa" w:w="624"/>
+            <w:vAlign w:val="center"/>
+          </w:tcPr>
+          <w:p>
+            <w:pPr>
+              <w:pStyle w:val="TableText"/>
+              <w:jc w:val="center"/>
+            </w:pPr>
+            <w:r>
+              <w:rPr>
+                <w:sz w:val="20"/>
+              </w:rPr>
+              <w:t>8</w:t>
+            </w:r>
+          </w:p>
+        </w:tc>
+        <w:tc>
+          <w:tcPr>
+            <w:tcW w:type="dxa" w:w="624"/>
+            <w:vAlign w:val="center"/>
+          </w:tcPr>
+          <w:p>
+            <w:pPr>
+              <w:pStyle w:val="TableText"/>
+              <w:jc w:val="center"/>
+            </w:pPr>
+            <w:r>
+              <w:rPr>
+                <w:sz w:val="20"/>
+              </w:rPr>
+              <w:t>5</w:t>
+            </w:r>
+          </w:p>
+        </w:tc>
+      </w:tr>
+      <w:tr>
+        <w:trPr>
+          <w:cantSplit/>
+        </w:trPr>
+        <w:tc>
+          <w:tcPr>
+            <w:tcW w:type="dxa" w:w="454"/>
+            <w:vAlign w:val="center"/>
+          </w:tcPr>
+          <w:p>
+            <w:pPr>
+              <w:pStyle w:val="TableText"/>
+              <w:jc w:val="center"/>
+            </w:pPr>
+            <w:r>
+              <w:rPr>
+                <w:sz w:val="20"/>
+              </w:rPr>
+              <w:t>13</w:t>
+            </w:r>
+          </w:p>
+        </w:tc>
+        <w:tc>
+          <w:tcPr>
+            <w:tcW w:type="dxa" w:w="5216"/>
+            <w:vAlign w:val="center"/>
+          </w:tcPr>
+          <w:p>
+            <w:pPr>
+              <w:pStyle w:val="TableText"/>
+              <w:jc w:val="left"/>
+            </w:pPr>
+            <w:r>
+              <w:rPr>
+                <w:sz w:val="20"/>
+              </w:rPr>
+              <w:t>Экономическая часть</w:t>
+            </w:r>
+          </w:p>
+        </w:tc>
+        <w:tc>
+          <w:tcPr>
+            <w:tcW w:type="dxa" w:w="964"/>
+            <w:vAlign w:val="center"/>
+          </w:tcPr>
+          <w:p>
+            <w:pPr>
+              <w:pStyle w:val="TableText"/>
+              <w:jc w:val="center"/>
+            </w:pPr>
+            <w:r>
+              <w:rPr>
+                <w:sz w:val="20"/>
+              </w:rPr>
+              <w:t>10–11</w:t>
+            </w:r>
+          </w:p>
+        </w:tc>
+        <w:tc>
+          <w:tcPr>
+            <w:tcW w:type="dxa" w:w="964"/>
+            <w:vAlign w:val="center"/>
+          </w:tcPr>
+          <w:p>
+            <w:pPr>
+              <w:pStyle w:val="TableText"/>
+              <w:jc w:val="center"/>
+            </w:pPr>
+            <w:r>
+              <w:rPr>
+                <w:sz w:val="20"/>
+              </w:rPr>
+              <w:t>И</w:t>
+            </w:r>
+          </w:p>
+        </w:tc>
+        <w:tc>
+          <w:tcPr>
+            <w:tcW w:type="dxa" w:w="624"/>
+            <w:vAlign w:val="center"/>
+          </w:tcPr>
+          <w:p>
+            <w:pPr>
+              <w:pStyle w:val="TableText"/>
+              <w:jc w:val="center"/>
+            </w:pPr>
+            <w:r>
+              <w:rPr>
+                <w:sz w:val="20"/>
+              </w:rPr>
+              <w:t>9</w:t>
+            </w:r>
+          </w:p>
+        </w:tc>
+        <w:tc>
+          <w:tcPr>
+            <w:tcW w:type="dxa" w:w="624"/>
+            <w:vAlign w:val="center"/>
+          </w:tcPr>
+          <w:p>
+            <w:pPr>
+              <w:pStyle w:val="TableText"/>
+              <w:jc w:val="center"/>
+            </w:pPr>
+            <w:r>
+              <w:rPr>
+                <w:sz w:val="20"/>
+              </w:rPr>
+              <w:t>14</w:t>
+            </w:r>
+          </w:p>
+        </w:tc>
+        <w:tc>
+          <w:tcPr>
+            <w:tcW w:type="dxa" w:w="624"/>
+            <w:vAlign w:val="center"/>
+          </w:tcPr>
+          <w:p>
+            <w:pPr>
+              <w:pStyle w:val="TableText"/>
+              <w:jc w:val="center"/>
+            </w:pPr>
+            <w:r>
+              <w:rPr>
+                <w:sz w:val="20"/>
+              </w:rPr>
+              <w:t>11</w:t>
+            </w:r>
+          </w:p>
+        </w:tc>
+      </w:tr>
+      <w:tr>
+        <w:trPr>
+          <w:cantSplit/>
+        </w:trPr>
+        <w:tc>
+          <w:tcPr>
+            <w:tcW w:type="dxa" w:w="454"/>
+            <w:vAlign w:val="center"/>
+          </w:tcPr>
+          <w:p>
+            <w:pPr>
+              <w:pStyle w:val="TableText"/>
+              <w:jc w:val="center"/>
+            </w:pPr>
+            <w:r>
+              <w:rPr>
+                <w:sz w:val="20"/>
+              </w:rPr>
+              <w:t>14</w:t>
+            </w:r>
+          </w:p>
+        </w:tc>
+        <w:tc>
+          <w:tcPr>
+            <w:tcW w:type="dxa" w:w="5216"/>
+            <w:vAlign w:val="center"/>
+          </w:tcPr>
+          <w:p>
+            <w:pPr>
+              <w:pStyle w:val="TableText"/>
+              <w:jc w:val="left"/>
+            </w:pPr>
+            <w:r>
+              <w:rPr>
+                <w:sz w:val="20"/>
+              </w:rPr>
+              <w:t>Охрана труда и окружающей среды</w:t>
+            </w:r>
+          </w:p>
+        </w:tc>
+        <w:tc>
+          <w:tcPr>
+            <w:tcW w:type="dxa" w:w="964"/>
+            <w:vAlign w:val="center"/>
+          </w:tcPr>
+          <w:p>
+            <w:pPr>
+              <w:pStyle w:val="TableText"/>
+              <w:jc w:val="center"/>
+            </w:pPr>
+            <w:r>
+              <w:rPr>
+                <w:sz w:val="20"/>
+              </w:rPr>
+              <w:t>11–12</w:t>
+            </w:r>
+          </w:p>
+        </w:tc>
+        <w:tc>
+          <w:tcPr>
+            <w:tcW w:type="dxa" w:w="964"/>
+            <w:vAlign w:val="center"/>
+          </w:tcPr>
+          <w:p>
+            <w:pPr>
+              <w:pStyle w:val="TableText"/>
+              <w:jc w:val="center"/>
+            </w:pPr>
+            <w:r>
+              <w:rPr>
+                <w:sz w:val="20"/>
+              </w:rPr>
+              <w:t>И</w:t>
+            </w:r>
+          </w:p>
+        </w:tc>
+        <w:tc>
+          <w:tcPr>
+            <w:tcW w:type="dxa" w:w="624"/>
+            <w:vAlign w:val="center"/>
+          </w:tcPr>
+          <w:p>
+            <w:pPr>
+              <w:pStyle w:val="TableText"/>
+              <w:jc w:val="center"/>
+            </w:pPr>
+            <w:r>
+              <w:rPr>
+                <w:sz w:val="20"/>
+              </w:rPr>
+              <w:t>9</w:t>
+            </w:r>
+          </w:p>
+        </w:tc>
+        <w:tc>
+          <w:tcPr>
+            <w:tcW w:type="dxa" w:w="624"/>
+            <w:vAlign w:val="center"/>
+          </w:tcPr>
+          <w:p>
+            <w:pPr>
+              <w:pStyle w:val="TableText"/>
+              <w:jc w:val="center"/>
+            </w:pPr>
+            <w:r>
+              <w:rPr>
+                <w:sz w:val="20"/>
+              </w:rPr>
+              <w:t>14</w:t>
+            </w:r>
+          </w:p>
+        </w:tc>
+        <w:tc>
+          <w:tcPr>
+            <w:tcW w:type="dxa" w:w="624"/>
+            <w:vAlign w:val="center"/>
+          </w:tcPr>
+          <w:p>
+            <w:pPr>
+              <w:pStyle w:val="TableText"/>
+              <w:jc w:val="center"/>
+            </w:pPr>
+            <w:r>
+              <w:rPr>
+                <w:sz w:val="20"/>
+              </w:rPr>
+              <w:t>11</w:t>
+            </w:r>
+          </w:p>
+        </w:tc>
+      </w:tr>
+      <w:tr>
+        <w:trPr>
+          <w:cantSplit/>
+        </w:trPr>
+        <w:tc>
+          <w:tcPr>
+            <w:tcW w:type="dxa" w:w="454"/>
+            <w:vAlign w:val="center"/>
+          </w:tcPr>
+          <w:p>
+            <w:pPr>
+              <w:pStyle w:val="TableText"/>
+              <w:jc w:val="center"/>
+            </w:pPr>
+            <w:r>
+              <w:rPr>
+                <w:sz w:val="20"/>
+              </w:rPr>
+              <w:t>15</w:t>
+            </w:r>
+          </w:p>
+        </w:tc>
+        <w:tc>
+          <w:tcPr>
+            <w:tcW w:type="dxa" w:w="5216"/>
+            <w:vAlign w:val="center"/>
+          </w:tcPr>
+          <w:p>
+            <w:pPr>
+              <w:pStyle w:val="TableText"/>
+              <w:jc w:val="left"/>
+            </w:pPr>
+            <w:r>
+              <w:rPr>
+                <w:sz w:val="20"/>
+              </w:rPr>
+              <w:t>Основные результаты и выводы, предложения по интеграции в существующие модели БПЛА</w:t>
+            </w:r>
+          </w:p>
+        </w:tc>
+        <w:tc>
+          <w:tcPr>
+            <w:tcW w:type="dxa" w:w="964"/>
+            <w:vAlign w:val="center"/>
+          </w:tcPr>
+          <w:p>
+            <w:pPr>
+              <w:pStyle w:val="TableText"/>
+              <w:jc w:val="center"/>
+            </w:pPr>
+            <w:r>
+              <w:rPr>
+                <w:sz w:val="20"/>
+              </w:rPr>
+              <w:t>12–13</w:t>
+            </w:r>
+          </w:p>
+        </w:tc>
+        <w:tc>
+          <w:tcPr>
+            <w:tcW w:type="dxa" w:w="964"/>
+            <w:vAlign w:val="center"/>
+          </w:tcPr>
+          <w:p>
+            <w:pPr>
+              <w:pStyle w:val="TableText"/>
+              <w:jc w:val="center"/>
+            </w:pPr>
+            <w:r>
+              <w:rPr>
+                <w:sz w:val="20"/>
+              </w:rPr>
+              <w:t>И, Р</w:t>
+            </w:r>
+          </w:p>
+        </w:tc>
+        <w:tc>
+          <w:tcPr>
+            <w:tcW w:type="dxa" w:w="624"/>
+            <w:vAlign w:val="center"/>
+          </w:tcPr>
+          <w:p>
+            <w:pPr>
+              <w:pStyle w:val="TableText"/>
+              <w:jc w:val="center"/>
+            </w:pPr>
+            <w:r>
+              <w:rPr>
+                <w:sz w:val="20"/>
+              </w:rPr>
+              <w:t>2</w:t>
+            </w:r>
+          </w:p>
+        </w:tc>
+        <w:tc>
+          <w:tcPr>
+            <w:tcW w:type="dxa" w:w="624"/>
+            <w:vAlign w:val="center"/>
+          </w:tcPr>
+          <w:p>
+            <w:pPr>
+              <w:pStyle w:val="TableText"/>
+              <w:jc w:val="center"/>
+            </w:pPr>
+            <w:r>
+              <w:rPr>
+                <w:sz w:val="20"/>
+              </w:rPr>
+              <w:t>4,5</w:t>
+            </w:r>
+          </w:p>
+        </w:tc>
+        <w:tc>
+          <w:tcPr>
+            <w:tcW w:type="dxa" w:w="624"/>
+            <w:vAlign w:val="center"/>
+          </w:tcPr>
+          <w:p>
+            <w:pPr>
+              <w:pStyle w:val="TableText"/>
+              <w:jc w:val="center"/>
+            </w:pPr>
+            <w:r>
+              <w:rPr>
+                <w:sz w:val="20"/>
+              </w:rPr>
+              <w:t>3</w:t>
+            </w:r>
+          </w:p>
+        </w:tc>
+      </w:tr>
+    </w:tbl>
+    <w:p>
+      <w:pPr>
+        <w:spacing w:line="240" w:lineRule="auto"/>
+      </w:pPr>
+    </w:p>
+    <w:p>
+      <w:r>
+        <w:t>Сетевой график приведён на рисунке 4.1.</w:t>
+      </w:r>
+    </w:p>
+    <w:p>
+      <w:pPr>
+        <w:keepNext/>
+        <w:ind w:firstLine="0"/>
+        <w:jc w:val="center"/>
+      </w:pPr>
+      <w:r>
+        <w:drawing>
+          <wp:inline xmlns:a="http://schemas.openxmlformats.org/drawingml/2006/main" xmlns:pic="http://schemas.openxmlformats.org/drawingml/2006/picture">
+            <wp:extent cx="5940000" cy="3600000"/>
+            <wp:docPr id="1" name="Picture 1"/>
+            <wp:cNvGraphicFramePr>
+              <a:graphicFrameLocks noChangeAspect="1"/>
+            </wp:cNvGraphicFramePr>
+            <a:graphic>
+              <a:graphicData uri="http://schemas.openxmlformats.org/drawingml/2006/picture">
+                <pic:pic>
+                  <pic:nvPicPr>
+                    <pic:cNvPr id="0" name="network.png"/>
+                    <pic:cNvPicPr/>
+                  </pic:nvPicPr>
+                  <pic:blipFill>
+                    <a:blip r:embed="rId10"/>
+                    <a:stretch>
+                      <a:fillRect/>
+                    </a:stretch>
+                  </pic:blipFill>
+                  <pic:spPr>
+                    <a:xfrm>
+                      <a:off x="0" y="0"/>
+                      <a:ext cx="5940000" cy="3600000"/>
+                    </a:xfrm>
+                    <a:prstGeom prst="rect"/>
+                  </pic:spPr>
+                </pic:pic>
+              </a:graphicData>
+            </a:graphic>
+          </wp:inline>
+        </w:drawing>
+      </w:r>
+    </w:p>
+    <w:p>
+      <w:pPr>
+        <w:ind w:firstLine="0"/>
+        <w:jc w:val="center"/>
+      </w:pPr>
+      <w:r>
+        <w:t>Рисунок 4.1 – Сетевой график НИР (над стрелкой — ожидаемая продолжительность работы, кал. дн.; под стрелкой — исполнители)</w:t>
+      </w:r>
+    </w:p>
+    <w:p>
+      <w:r>
+        <w:t>Критический путь проходит через события 1–2–3–4–6–7–8–9–10–11–12–13; его продолжительность 73 кал. дн. совпадает с длительностью НИР по календарному плану (таблица 4.3) и укладывается в срок сдачи работы по заданию. Работы 1–3, 4–5, 5–7, 7–9 имеют резерв времени от 4 до 9 дн. и выполняются параллельно с работами критического пути.</w:t>
+      </w:r>
+    </w:p>
+    <w:p>
+      <w:pPr>
         <w:pStyle w:val="Heading2"/>
       </w:pPr>
       <w:r>
@@ -4158,7 +6608,7 @@
               <w:jc w:val="right"/>
             </w:pPr>
             <w:r>
-              <w:t>(4.5)</w:t>
+              <w:t>(4.6)</w:t>
             </w:r>
           </w:p>
         </w:tc>
@@ -4233,7 +6683,7 @@
     </w:p>
     <w:p>
       <w:r>
-        <w:t>Расчёт приведён в таблице 4.4.</w:t>
+        <w:t>Расчёт приведён в таблице 4.5.</w:t>
       </w:r>
     </w:p>
     <w:p>
@@ -4242,7 +6692,7 @@
         <w:ind w:firstLine="0"/>
       </w:pPr>
       <w:r>
-        <w:t>Таблица 4.4 – Расчёт заработной платы персонала</w:t>
+        <w:t>Таблица 4.5 – Расчёт заработной платы персонала</w:t>
       </w:r>
     </w:p>
     <w:tbl>
@@ -6192,7 +8642,7 @@
               <w:jc w:val="right"/>
             </w:pPr>
             <w:r>
-              <w:t>(4.6)</w:t>
+              <w:t>(4.7)</w:t>
             </w:r>
           </w:p>
         </w:tc>
@@ -6314,1474 +8764,8 @@
     </w:p>
     <w:p>
       <w:r>
-        <w:t>Материальные затраты включают покупные комплектующие изделия для экспериментального стенда и канцелярские товары (таблица 4.5), а также электроэнергию. Две платы LilyGO T-HaLow образуют канал «точка — точка»: передающая плата с камерой OV5640 работает в режиме точки доступа, приёмная — в режиме станции. Цена платы 37,98 долл. США [27] по курсу Банка России 84,1975 руб./долл. на 20.09.2026 [43] составляет 3 198 руб. Микросхемы флеш-памяти и программатор нужны для резервного копирования и восстановления встроенного программного обеспечения радиомодуля TX-AH [44, 45], аккумуляторы — для автономного питания плат на полевой площадке. Цены остальных позиций — средние розничные на сентябрь 2026 г.; канцелярские товары рассчитаны на печать около 2 500 листов.</w:t>
+        <w:t>Материальные затраты включают покупные комплектующие изделия для экспериментального стенда, канцелярские товары и электроэнергию. Две платы LilyGO T-HaLow образуют канал «точка — точка»: передающая плата с камерой OV5640 работает в режиме точки доступа, приёмная — в режиме станции. Цена платы 37,98 долл. США [27] по курсу Банка России 84,1975 руб./долл. на 20.09.2026 [43] составляет 3 198 руб. Микросхемы флеш-памяти и программатор нужны для резервного копирования и восстановления встроенного программного обеспечения радиомодуля TX-AH [44, 45], аккумуляторы — для автономного питания плат. Цены остальных позиций — средние розничные на сентябрь 2026 г. Покупные комплектующие: отладочная плата LilyGO T-HaLow V1.0 — 2 шт. по 3 198 руб.; модуль камеры OV5640, 24 pin — 2 шт. по 1 100 руб.; микросхема флеш-памяти W25Q32JVSSIQ — 2 шт. по 100 руб.; программатор CH341A с зажимом SOIC-8 — 1 шт. по 714 руб.; кабель USB Type-C с передачей данных, 1 м — 2 шт. по 350 руб.; аккумулятор Li-Ion 18650, 3000 мА·ч — 4 шт. по 450 руб.; зарядное устройство для аккумуляторов 18650 — 1 шт. по 900 руб.; итого 12 910 руб. Канцелярские товары (бумага, картриджи, принадлежности) на печать около 2 500 листов — 11 650 руб.</w:t>
       </w:r>
-    </w:p>
-    <w:p>
-      <w:pPr>
-        <w:pStyle w:val="TableCaption"/>
-        <w:ind w:firstLine="0"/>
-      </w:pPr>
-      <w:r>
-        <w:t>Таблица 4.5 – Покупные комплектующие изделия и канцелярские товары</w:t>
-      </w:r>
-    </w:p>
-    <w:tbl>
-      <w:tblPr>
-        <w:tblStyle w:val="TableGrid"/>
-        <w:tblW w:type="auto" w:w="0"/>
-        <w:jc w:val="center"/>
-        <w:tblLayout w:type="fixed"/>
-        <w:tblLook w:firstColumn="1" w:firstRow="1" w:lastColumn="0" w:lastRow="0" w:noHBand="0" w:noVBand="1" w:val="04A0"/>
-        <w:tblCellMar>
-          <w:left w:w="57" w:type="dxa"/>
-          <w:right w:w="57" w:type="dxa"/>
-        </w:tblCellMar>
-      </w:tblPr>
-      <w:tblGrid>
-        <w:gridCol w:w="510"/>
-        <w:gridCol w:w="4875"/>
-        <w:gridCol w:w="907"/>
-        <w:gridCol w:w="907"/>
-        <w:gridCol w:w="1020"/>
-        <w:gridCol w:w="1133"/>
-      </w:tblGrid>
-      <w:tr>
-        <w:trPr>
-          <w:cantSplit/>
-          <w:tblHeader w:val="true"/>
-        </w:trPr>
-        <w:tc>
-          <w:tcPr>
-            <w:tcW w:type="dxa" w:w="510"/>
-            <w:vAlign w:val="center"/>
-          </w:tcPr>
-          <w:p>
-            <w:pPr>
-              <w:pStyle w:val="TableText"/>
-              <w:keepNext/>
-              <w:jc w:val="center"/>
-            </w:pPr>
-            <w:r>
-              <w:rPr>
-                <w:b/>
-                <w:sz w:val="22"/>
-              </w:rPr>
-              <w:t>№</w:t>
-            </w:r>
-          </w:p>
-        </w:tc>
-        <w:tc>
-          <w:tcPr>
-            <w:tcW w:type="dxa" w:w="4876"/>
-            <w:vAlign w:val="center"/>
-          </w:tcPr>
-          <w:p>
-            <w:pPr>
-              <w:pStyle w:val="TableText"/>
-              <w:keepNext/>
-              <w:jc w:val="center"/>
-            </w:pPr>
-            <w:r>
-              <w:rPr>
-                <w:b/>
-                <w:sz w:val="22"/>
-              </w:rPr>
-              <w:t>Наименование</w:t>
-            </w:r>
-          </w:p>
-        </w:tc>
-        <w:tc>
-          <w:tcPr>
-            <w:tcW w:type="dxa" w:w="907"/>
-            <w:vAlign w:val="center"/>
-          </w:tcPr>
-          <w:p>
-            <w:pPr>
-              <w:pStyle w:val="TableText"/>
-              <w:keepNext/>
-              <w:jc w:val="center"/>
-            </w:pPr>
-            <w:r>
-              <w:rPr>
-                <w:b/>
-                <w:sz w:val="22"/>
-              </w:rPr>
-              <w:t>Ед. изм.</w:t>
-            </w:r>
-          </w:p>
-        </w:tc>
-        <w:tc>
-          <w:tcPr>
-            <w:tcW w:type="dxa" w:w="907"/>
-            <w:vAlign w:val="center"/>
-          </w:tcPr>
-          <w:p>
-            <w:pPr>
-              <w:pStyle w:val="TableText"/>
-              <w:keepNext/>
-              <w:jc w:val="center"/>
-            </w:pPr>
-            <w:r>
-              <w:rPr>
-                <w:b/>
-                <w:sz w:val="22"/>
-              </w:rPr>
-              <w:t>Кол-во</w:t>
-            </w:r>
-          </w:p>
-        </w:tc>
-        <w:tc>
-          <w:tcPr>
-            <w:tcW w:type="dxa" w:w="1020"/>
-            <w:vAlign w:val="center"/>
-          </w:tcPr>
-          <w:p>
-            <w:pPr>
-              <w:pStyle w:val="TableText"/>
-              <w:keepNext/>
-              <w:jc w:val="center"/>
-            </w:pPr>
-            <w:r>
-              <w:rPr>
-                <w:b/>
-                <w:sz w:val="22"/>
-              </w:rPr>
-              <w:t>Цена, руб.</w:t>
-            </w:r>
-          </w:p>
-        </w:tc>
-        <w:tc>
-          <w:tcPr>
-            <w:tcW w:type="dxa" w:w="1134"/>
-            <w:vAlign w:val="center"/>
-          </w:tcPr>
-          <w:p>
-            <w:pPr>
-              <w:pStyle w:val="TableText"/>
-              <w:keepNext/>
-              <w:jc w:val="center"/>
-            </w:pPr>
-            <w:r>
-              <w:rPr>
-                <w:b/>
-                <w:sz w:val="22"/>
-              </w:rPr>
-              <w:t>Сумма, руб.</w:t>
-            </w:r>
-          </w:p>
-        </w:tc>
-      </w:tr>
-      <w:tr>
-        <w:trPr>
-          <w:cantSplit/>
-        </w:trPr>
-        <w:tc>
-          <w:tcPr>
-            <w:tcW w:type="dxa" w:w="510"/>
-            <w:vAlign w:val="center"/>
-          </w:tcPr>
-          <w:p>
-            <w:pPr>
-              <w:pStyle w:val="TableText"/>
-              <w:keepNext/>
-              <w:jc w:val="left"/>
-            </w:pPr>
-            <w:r>
-              <w:rPr>
-                <w:sz w:val="22"/>
-              </w:rPr>
-              <w:t>1</w:t>
-            </w:r>
-          </w:p>
-        </w:tc>
-        <w:tc>
-          <w:tcPr>
-            <w:tcW w:type="dxa" w:w="4876"/>
-            <w:vAlign w:val="center"/>
-          </w:tcPr>
-          <w:p>
-            <w:pPr>
-              <w:pStyle w:val="TableText"/>
-              <w:keepNext/>
-              <w:jc w:val="left"/>
-            </w:pPr>
-            <w:r>
-              <w:rPr>
-                <w:sz w:val="22"/>
-              </w:rPr>
-              <w:t>Отладочная плата LilyGO T-HaLow V1.0, ревизия 24-08-23 (ESP32-S3 + TX-AH-R900P, 859–894 МГц)</w:t>
-            </w:r>
-          </w:p>
-        </w:tc>
-        <w:tc>
-          <w:tcPr>
-            <w:tcW w:type="dxa" w:w="907"/>
-            <w:vAlign w:val="center"/>
-          </w:tcPr>
-          <w:p>
-            <w:pPr>
-              <w:pStyle w:val="TableText"/>
-              <w:keepNext/>
-              <w:jc w:val="center"/>
-            </w:pPr>
-            <w:r>
-              <w:rPr>
-                <w:sz w:val="22"/>
-              </w:rPr>
-              <w:t>шт.</w:t>
-            </w:r>
-          </w:p>
-        </w:tc>
-        <w:tc>
-          <w:tcPr>
-            <w:tcW w:type="dxa" w:w="907"/>
-            <w:vAlign w:val="center"/>
-          </w:tcPr>
-          <w:p>
-            <w:pPr>
-              <w:pStyle w:val="TableText"/>
-              <w:keepNext/>
-              <w:jc w:val="center"/>
-            </w:pPr>
-            <w:r>
-              <w:rPr>
-                <w:sz w:val="22"/>
-              </w:rPr>
-              <w:t>2</w:t>
-            </w:r>
-          </w:p>
-        </w:tc>
-        <w:tc>
-          <w:tcPr>
-            <w:tcW w:type="dxa" w:w="1020"/>
-            <w:vAlign w:val="center"/>
-          </w:tcPr>
-          <w:p>
-            <w:pPr>
-              <w:pStyle w:val="TableText"/>
-              <w:keepNext/>
-              <w:jc w:val="right"/>
-            </w:pPr>
-            <w:r>
-              <w:rPr>
-                <w:sz w:val="22"/>
-              </w:rPr>
-              <w:t>3 198</w:t>
-            </w:r>
-          </w:p>
-        </w:tc>
-        <w:tc>
-          <w:tcPr>
-            <w:tcW w:type="dxa" w:w="1134"/>
-            <w:vAlign w:val="center"/>
-          </w:tcPr>
-          <w:p>
-            <w:pPr>
-              <w:pStyle w:val="TableText"/>
-              <w:keepNext/>
-              <w:jc w:val="right"/>
-            </w:pPr>
-            <w:r>
-              <w:rPr>
-                <w:sz w:val="22"/>
-              </w:rPr>
-              <w:t>6 396</w:t>
-            </w:r>
-          </w:p>
-        </w:tc>
-      </w:tr>
-      <w:tr>
-        <w:trPr>
-          <w:cantSplit/>
-        </w:trPr>
-        <w:tc>
-          <w:tcPr>
-            <w:tcW w:type="dxa" w:w="510"/>
-            <w:vAlign w:val="center"/>
-          </w:tcPr>
-          <w:p>
-            <w:pPr>
-              <w:pStyle w:val="TableText"/>
-              <w:keepNext/>
-              <w:jc w:val="left"/>
-            </w:pPr>
-            <w:r>
-              <w:rPr>
-                <w:sz w:val="22"/>
-              </w:rPr>
-              <w:t>2</w:t>
-            </w:r>
-          </w:p>
-        </w:tc>
-        <w:tc>
-          <w:tcPr>
-            <w:tcW w:type="dxa" w:w="4876"/>
-            <w:vAlign w:val="center"/>
-          </w:tcPr>
-          <w:p>
-            <w:pPr>
-              <w:pStyle w:val="TableText"/>
-              <w:keepNext/>
-              <w:jc w:val="left"/>
-            </w:pPr>
-            <w:r>
-              <w:rPr>
-                <w:sz w:val="22"/>
-              </w:rPr>
-              <w:t>Модуль камеры OV5640, 24 pin (основной и запасной)</w:t>
-            </w:r>
-          </w:p>
-        </w:tc>
-        <w:tc>
-          <w:tcPr>
-            <w:tcW w:type="dxa" w:w="907"/>
-            <w:vAlign w:val="center"/>
-          </w:tcPr>
-          <w:p>
-            <w:pPr>
-              <w:pStyle w:val="TableText"/>
-              <w:keepNext/>
-              <w:jc w:val="center"/>
-            </w:pPr>
-            <w:r>
-              <w:rPr>
-                <w:sz w:val="22"/>
-              </w:rPr>
-              <w:t>шт.</w:t>
-            </w:r>
-          </w:p>
-        </w:tc>
-        <w:tc>
-          <w:tcPr>
-            <w:tcW w:type="dxa" w:w="907"/>
-            <w:vAlign w:val="center"/>
-          </w:tcPr>
-          <w:p>
-            <w:pPr>
-              <w:pStyle w:val="TableText"/>
-              <w:keepNext/>
-              <w:jc w:val="center"/>
-            </w:pPr>
-            <w:r>
-              <w:rPr>
-                <w:sz w:val="22"/>
-              </w:rPr>
-              <w:t>2</w:t>
-            </w:r>
-          </w:p>
-        </w:tc>
-        <w:tc>
-          <w:tcPr>
-            <w:tcW w:type="dxa" w:w="1020"/>
-            <w:vAlign w:val="center"/>
-          </w:tcPr>
-          <w:p>
-            <w:pPr>
-              <w:pStyle w:val="TableText"/>
-              <w:keepNext/>
-              <w:jc w:val="right"/>
-            </w:pPr>
-            <w:r>
-              <w:rPr>
-                <w:sz w:val="22"/>
-              </w:rPr>
-              <w:t>1 100</w:t>
-            </w:r>
-          </w:p>
-        </w:tc>
-        <w:tc>
-          <w:tcPr>
-            <w:tcW w:type="dxa" w:w="1134"/>
-            <w:vAlign w:val="center"/>
-          </w:tcPr>
-          <w:p>
-            <w:pPr>
-              <w:pStyle w:val="TableText"/>
-              <w:keepNext/>
-              <w:jc w:val="right"/>
-            </w:pPr>
-            <w:r>
-              <w:rPr>
-                <w:sz w:val="22"/>
-              </w:rPr>
-              <w:t>2 200</w:t>
-            </w:r>
-          </w:p>
-        </w:tc>
-      </w:tr>
-      <w:tr>
-        <w:trPr>
-          <w:cantSplit/>
-        </w:trPr>
-        <w:tc>
-          <w:tcPr>
-            <w:tcW w:type="dxa" w:w="510"/>
-            <w:vAlign w:val="center"/>
-          </w:tcPr>
-          <w:p>
-            <w:pPr>
-              <w:pStyle w:val="TableText"/>
-              <w:keepNext/>
-              <w:jc w:val="left"/>
-            </w:pPr>
-            <w:r>
-              <w:rPr>
-                <w:sz w:val="22"/>
-              </w:rPr>
-              <w:t>3</w:t>
-            </w:r>
-          </w:p>
-        </w:tc>
-        <w:tc>
-          <w:tcPr>
-            <w:tcW w:type="dxa" w:w="4876"/>
-            <w:vAlign w:val="center"/>
-          </w:tcPr>
-          <w:p>
-            <w:pPr>
-              <w:pStyle w:val="TableText"/>
-              <w:keepNext/>
-              <w:jc w:val="left"/>
-            </w:pPr>
-            <w:r>
-              <w:rPr>
-                <w:sz w:val="22"/>
-              </w:rPr>
-              <w:t>Микросхема флеш-памяти W25Q32JVSSIQ</w:t>
-            </w:r>
-          </w:p>
-        </w:tc>
-        <w:tc>
-          <w:tcPr>
-            <w:tcW w:type="dxa" w:w="907"/>
-            <w:vAlign w:val="center"/>
-          </w:tcPr>
-          <w:p>
-            <w:pPr>
-              <w:pStyle w:val="TableText"/>
-              <w:keepNext/>
-              <w:jc w:val="center"/>
-            </w:pPr>
-            <w:r>
-              <w:rPr>
-                <w:sz w:val="22"/>
-              </w:rPr>
-              <w:t>шт.</w:t>
-            </w:r>
-          </w:p>
-        </w:tc>
-        <w:tc>
-          <w:tcPr>
-            <w:tcW w:type="dxa" w:w="907"/>
-            <w:vAlign w:val="center"/>
-          </w:tcPr>
-          <w:p>
-            <w:pPr>
-              <w:pStyle w:val="TableText"/>
-              <w:keepNext/>
-              <w:jc w:val="center"/>
-            </w:pPr>
-            <w:r>
-              <w:rPr>
-                <w:sz w:val="22"/>
-              </w:rPr>
-              <w:t>2</w:t>
-            </w:r>
-          </w:p>
-        </w:tc>
-        <w:tc>
-          <w:tcPr>
-            <w:tcW w:type="dxa" w:w="1020"/>
-            <w:vAlign w:val="center"/>
-          </w:tcPr>
-          <w:p>
-            <w:pPr>
-              <w:pStyle w:val="TableText"/>
-              <w:keepNext/>
-              <w:jc w:val="right"/>
-            </w:pPr>
-            <w:r>
-              <w:rPr>
-                <w:sz w:val="22"/>
-              </w:rPr>
-              <w:t>100</w:t>
-            </w:r>
-          </w:p>
-        </w:tc>
-        <w:tc>
-          <w:tcPr>
-            <w:tcW w:type="dxa" w:w="1134"/>
-            <w:vAlign w:val="center"/>
-          </w:tcPr>
-          <w:p>
-            <w:pPr>
-              <w:pStyle w:val="TableText"/>
-              <w:keepNext/>
-              <w:jc w:val="right"/>
-            </w:pPr>
-            <w:r>
-              <w:rPr>
-                <w:sz w:val="22"/>
-              </w:rPr>
-              <w:t>200</w:t>
-            </w:r>
-          </w:p>
-        </w:tc>
-      </w:tr>
-      <w:tr>
-        <w:trPr>
-          <w:cantSplit/>
-        </w:trPr>
-        <w:tc>
-          <w:tcPr>
-            <w:tcW w:type="dxa" w:w="510"/>
-            <w:vAlign w:val="center"/>
-          </w:tcPr>
-          <w:p>
-            <w:pPr>
-              <w:pStyle w:val="TableText"/>
-              <w:keepNext/>
-              <w:jc w:val="left"/>
-            </w:pPr>
-            <w:r>
-              <w:rPr>
-                <w:sz w:val="22"/>
-              </w:rPr>
-              <w:t>4</w:t>
-            </w:r>
-          </w:p>
-        </w:tc>
-        <w:tc>
-          <w:tcPr>
-            <w:tcW w:type="dxa" w:w="4876"/>
-            <w:vAlign w:val="center"/>
-          </w:tcPr>
-          <w:p>
-            <w:pPr>
-              <w:pStyle w:val="TableText"/>
-              <w:keepNext/>
-              <w:jc w:val="left"/>
-            </w:pPr>
-            <w:r>
-              <w:rPr>
-                <w:sz w:val="22"/>
-              </w:rPr>
-              <w:t>Программатор CH341A с зажимом SOIC-8</w:t>
-            </w:r>
-          </w:p>
-        </w:tc>
-        <w:tc>
-          <w:tcPr>
-            <w:tcW w:type="dxa" w:w="907"/>
-            <w:vAlign w:val="center"/>
-          </w:tcPr>
-          <w:p>
-            <w:pPr>
-              <w:pStyle w:val="TableText"/>
-              <w:keepNext/>
-              <w:jc w:val="center"/>
-            </w:pPr>
-            <w:r>
-              <w:rPr>
-                <w:sz w:val="22"/>
-              </w:rPr>
-              <w:t>шт.</w:t>
-            </w:r>
-          </w:p>
-        </w:tc>
-        <w:tc>
-          <w:tcPr>
-            <w:tcW w:type="dxa" w:w="907"/>
-            <w:vAlign w:val="center"/>
-          </w:tcPr>
-          <w:p>
-            <w:pPr>
-              <w:pStyle w:val="TableText"/>
-              <w:keepNext/>
-              <w:jc w:val="center"/>
-            </w:pPr>
-            <w:r>
-              <w:rPr>
-                <w:sz w:val="22"/>
-              </w:rPr>
-              <w:t>1</w:t>
-            </w:r>
-          </w:p>
-        </w:tc>
-        <w:tc>
-          <w:tcPr>
-            <w:tcW w:type="dxa" w:w="1020"/>
-            <w:vAlign w:val="center"/>
-          </w:tcPr>
-          <w:p>
-            <w:pPr>
-              <w:pStyle w:val="TableText"/>
-              <w:keepNext/>
-              <w:jc w:val="right"/>
-            </w:pPr>
-            <w:r>
-              <w:rPr>
-                <w:sz w:val="22"/>
-              </w:rPr>
-              <w:t>714</w:t>
-            </w:r>
-          </w:p>
-        </w:tc>
-        <w:tc>
-          <w:tcPr>
-            <w:tcW w:type="dxa" w:w="1134"/>
-            <w:vAlign w:val="center"/>
-          </w:tcPr>
-          <w:p>
-            <w:pPr>
-              <w:pStyle w:val="TableText"/>
-              <w:keepNext/>
-              <w:jc w:val="right"/>
-            </w:pPr>
-            <w:r>
-              <w:rPr>
-                <w:sz w:val="22"/>
-              </w:rPr>
-              <w:t>714</w:t>
-            </w:r>
-          </w:p>
-        </w:tc>
-      </w:tr>
-      <w:tr>
-        <w:trPr>
-          <w:cantSplit/>
-        </w:trPr>
-        <w:tc>
-          <w:tcPr>
-            <w:tcW w:type="dxa" w:w="510"/>
-            <w:vAlign w:val="center"/>
-          </w:tcPr>
-          <w:p>
-            <w:pPr>
-              <w:pStyle w:val="TableText"/>
-              <w:keepNext/>
-              <w:jc w:val="left"/>
-            </w:pPr>
-            <w:r>
-              <w:rPr>
-                <w:sz w:val="22"/>
-              </w:rPr>
-              <w:t>5</w:t>
-            </w:r>
-          </w:p>
-        </w:tc>
-        <w:tc>
-          <w:tcPr>
-            <w:tcW w:type="dxa" w:w="4876"/>
-            <w:vAlign w:val="center"/>
-          </w:tcPr>
-          <w:p>
-            <w:pPr>
-              <w:pStyle w:val="TableText"/>
-              <w:keepNext/>
-              <w:jc w:val="left"/>
-            </w:pPr>
-            <w:r>
-              <w:rPr>
-                <w:sz w:val="22"/>
-              </w:rPr>
-              <w:t>Кабель USB Type-C с передачей данных, 1 м</w:t>
-            </w:r>
-          </w:p>
-        </w:tc>
-        <w:tc>
-          <w:tcPr>
-            <w:tcW w:type="dxa" w:w="907"/>
-            <w:vAlign w:val="center"/>
-          </w:tcPr>
-          <w:p>
-            <w:pPr>
-              <w:pStyle w:val="TableText"/>
-              <w:keepNext/>
-              <w:jc w:val="center"/>
-            </w:pPr>
-            <w:r>
-              <w:rPr>
-                <w:sz w:val="22"/>
-              </w:rPr>
-              <w:t>шт.</w:t>
-            </w:r>
-          </w:p>
-        </w:tc>
-        <w:tc>
-          <w:tcPr>
-            <w:tcW w:type="dxa" w:w="907"/>
-            <w:vAlign w:val="center"/>
-          </w:tcPr>
-          <w:p>
-            <w:pPr>
-              <w:pStyle w:val="TableText"/>
-              <w:keepNext/>
-              <w:jc w:val="center"/>
-            </w:pPr>
-            <w:r>
-              <w:rPr>
-                <w:sz w:val="22"/>
-              </w:rPr>
-              <w:t>2</w:t>
-            </w:r>
-          </w:p>
-        </w:tc>
-        <w:tc>
-          <w:tcPr>
-            <w:tcW w:type="dxa" w:w="1020"/>
-            <w:vAlign w:val="center"/>
-          </w:tcPr>
-          <w:p>
-            <w:pPr>
-              <w:pStyle w:val="TableText"/>
-              <w:keepNext/>
-              <w:jc w:val="right"/>
-            </w:pPr>
-            <w:r>
-              <w:rPr>
-                <w:sz w:val="22"/>
-              </w:rPr>
-              <w:t>350</w:t>
-            </w:r>
-          </w:p>
-        </w:tc>
-        <w:tc>
-          <w:tcPr>
-            <w:tcW w:type="dxa" w:w="1134"/>
-            <w:vAlign w:val="center"/>
-          </w:tcPr>
-          <w:p>
-            <w:pPr>
-              <w:pStyle w:val="TableText"/>
-              <w:keepNext/>
-              <w:jc w:val="right"/>
-            </w:pPr>
-            <w:r>
-              <w:rPr>
-                <w:sz w:val="22"/>
-              </w:rPr>
-              <w:t>700</w:t>
-            </w:r>
-          </w:p>
-        </w:tc>
-      </w:tr>
-      <w:tr>
-        <w:trPr>
-          <w:cantSplit/>
-        </w:trPr>
-        <w:tc>
-          <w:tcPr>
-            <w:tcW w:type="dxa" w:w="510"/>
-            <w:vAlign w:val="center"/>
-          </w:tcPr>
-          <w:p>
-            <w:pPr>
-              <w:pStyle w:val="TableText"/>
-              <w:keepNext/>
-              <w:jc w:val="left"/>
-            </w:pPr>
-            <w:r>
-              <w:rPr>
-                <w:sz w:val="22"/>
-              </w:rPr>
-              <w:t>6</w:t>
-            </w:r>
-          </w:p>
-        </w:tc>
-        <w:tc>
-          <w:tcPr>
-            <w:tcW w:type="dxa" w:w="4876"/>
-            <w:vAlign w:val="center"/>
-          </w:tcPr>
-          <w:p>
-            <w:pPr>
-              <w:pStyle w:val="TableText"/>
-              <w:keepNext/>
-              <w:jc w:val="left"/>
-            </w:pPr>
-            <w:r>
-              <w:rPr>
-                <w:sz w:val="22"/>
-              </w:rPr>
-              <w:t>Аккумулятор Li-Ion 18650, 3000 мА·ч</w:t>
-            </w:r>
-          </w:p>
-        </w:tc>
-        <w:tc>
-          <w:tcPr>
-            <w:tcW w:type="dxa" w:w="907"/>
-            <w:vAlign w:val="center"/>
-          </w:tcPr>
-          <w:p>
-            <w:pPr>
-              <w:pStyle w:val="TableText"/>
-              <w:keepNext/>
-              <w:jc w:val="center"/>
-            </w:pPr>
-            <w:r>
-              <w:rPr>
-                <w:sz w:val="22"/>
-              </w:rPr>
-              <w:t>шт.</w:t>
-            </w:r>
-          </w:p>
-        </w:tc>
-        <w:tc>
-          <w:tcPr>
-            <w:tcW w:type="dxa" w:w="907"/>
-            <w:vAlign w:val="center"/>
-          </w:tcPr>
-          <w:p>
-            <w:pPr>
-              <w:pStyle w:val="TableText"/>
-              <w:keepNext/>
-              <w:jc w:val="center"/>
-            </w:pPr>
-            <w:r>
-              <w:rPr>
-                <w:sz w:val="22"/>
-              </w:rPr>
-              <w:t>4</w:t>
-            </w:r>
-          </w:p>
-        </w:tc>
-        <w:tc>
-          <w:tcPr>
-            <w:tcW w:type="dxa" w:w="1020"/>
-            <w:vAlign w:val="center"/>
-          </w:tcPr>
-          <w:p>
-            <w:pPr>
-              <w:pStyle w:val="TableText"/>
-              <w:keepNext/>
-              <w:jc w:val="right"/>
-            </w:pPr>
-            <w:r>
-              <w:rPr>
-                <w:sz w:val="22"/>
-              </w:rPr>
-              <w:t>450</w:t>
-            </w:r>
-          </w:p>
-        </w:tc>
-        <w:tc>
-          <w:tcPr>
-            <w:tcW w:type="dxa" w:w="1134"/>
-            <w:vAlign w:val="center"/>
-          </w:tcPr>
-          <w:p>
-            <w:pPr>
-              <w:pStyle w:val="TableText"/>
-              <w:keepNext/>
-              <w:jc w:val="right"/>
-            </w:pPr>
-            <w:r>
-              <w:rPr>
-                <w:sz w:val="22"/>
-              </w:rPr>
-              <w:t>1 800</w:t>
-            </w:r>
-          </w:p>
-        </w:tc>
-      </w:tr>
-      <w:tr>
-        <w:trPr>
-          <w:cantSplit/>
-        </w:trPr>
-        <w:tc>
-          <w:tcPr>
-            <w:tcW w:type="dxa" w:w="510"/>
-            <w:vAlign w:val="center"/>
-          </w:tcPr>
-          <w:p>
-            <w:pPr>
-              <w:pStyle w:val="TableText"/>
-              <w:keepNext/>
-              <w:jc w:val="left"/>
-            </w:pPr>
-            <w:r>
-              <w:rPr>
-                <w:sz w:val="22"/>
-              </w:rPr>
-              <w:t>7</w:t>
-            </w:r>
-          </w:p>
-        </w:tc>
-        <w:tc>
-          <w:tcPr>
-            <w:tcW w:type="dxa" w:w="4876"/>
-            <w:vAlign w:val="center"/>
-          </w:tcPr>
-          <w:p>
-            <w:pPr>
-              <w:pStyle w:val="TableText"/>
-              <w:keepNext/>
-              <w:jc w:val="left"/>
-            </w:pPr>
-            <w:r>
-              <w:rPr>
-                <w:sz w:val="22"/>
-              </w:rPr>
-              <w:t>Зарядное устройство для аккумуляторов 18650</w:t>
-            </w:r>
-          </w:p>
-        </w:tc>
-        <w:tc>
-          <w:tcPr>
-            <w:tcW w:type="dxa" w:w="907"/>
-            <w:vAlign w:val="center"/>
-          </w:tcPr>
-          <w:p>
-            <w:pPr>
-              <w:pStyle w:val="TableText"/>
-              <w:keepNext/>
-              <w:jc w:val="center"/>
-            </w:pPr>
-            <w:r>
-              <w:rPr>
-                <w:sz w:val="22"/>
-              </w:rPr>
-              <w:t>шт.</w:t>
-            </w:r>
-          </w:p>
-        </w:tc>
-        <w:tc>
-          <w:tcPr>
-            <w:tcW w:type="dxa" w:w="907"/>
-            <w:vAlign w:val="center"/>
-          </w:tcPr>
-          <w:p>
-            <w:pPr>
-              <w:pStyle w:val="TableText"/>
-              <w:keepNext/>
-              <w:jc w:val="center"/>
-            </w:pPr>
-            <w:r>
-              <w:rPr>
-                <w:sz w:val="22"/>
-              </w:rPr>
-              <w:t>1</w:t>
-            </w:r>
-          </w:p>
-        </w:tc>
-        <w:tc>
-          <w:tcPr>
-            <w:tcW w:type="dxa" w:w="1020"/>
-            <w:vAlign w:val="center"/>
-          </w:tcPr>
-          <w:p>
-            <w:pPr>
-              <w:pStyle w:val="TableText"/>
-              <w:keepNext/>
-              <w:jc w:val="right"/>
-            </w:pPr>
-            <w:r>
-              <w:rPr>
-                <w:sz w:val="22"/>
-              </w:rPr>
-              <w:t>900</w:t>
-            </w:r>
-          </w:p>
-        </w:tc>
-        <w:tc>
-          <w:tcPr>
-            <w:tcW w:type="dxa" w:w="1134"/>
-            <w:vAlign w:val="center"/>
-          </w:tcPr>
-          <w:p>
-            <w:pPr>
-              <w:pStyle w:val="TableText"/>
-              <w:keepNext/>
-              <w:jc w:val="right"/>
-            </w:pPr>
-            <w:r>
-              <w:rPr>
-                <w:sz w:val="22"/>
-              </w:rPr>
-              <w:t>900</w:t>
-            </w:r>
-          </w:p>
-        </w:tc>
-      </w:tr>
-      <w:tr>
-        <w:trPr>
-          <w:cantSplit/>
-        </w:trPr>
-        <w:tc>
-          <w:tcPr>
-            <w:tcW w:type="dxa" w:w="510"/>
-            <w:vAlign w:val="center"/>
-          </w:tcPr>
-          <w:p>
-            <w:pPr>
-              <w:pStyle w:val="TableText"/>
-              <w:keepNext/>
-              <w:jc w:val="left"/>
-            </w:pPr>
-            <w:r>
-              <w:rPr>
-                <w:sz w:val="22"/>
-              </w:rPr>
-              <w:t>8</w:t>
-            </w:r>
-          </w:p>
-        </w:tc>
-        <w:tc>
-          <w:tcPr>
-            <w:tcW w:type="dxa" w:w="4876"/>
-            <w:vAlign w:val="center"/>
-          </w:tcPr>
-          <w:p>
-            <w:pPr>
-              <w:pStyle w:val="TableText"/>
-              <w:keepNext/>
-              <w:jc w:val="left"/>
-            </w:pPr>
-            <w:r>
-              <w:rPr>
-                <w:sz w:val="22"/>
-              </w:rPr>
-              <w:t>Бумага офисная А4, 500 листов</w:t>
-            </w:r>
-          </w:p>
-        </w:tc>
-        <w:tc>
-          <w:tcPr>
-            <w:tcW w:type="dxa" w:w="907"/>
-            <w:vAlign w:val="center"/>
-          </w:tcPr>
-          <w:p>
-            <w:pPr>
-              <w:pStyle w:val="TableText"/>
-              <w:keepNext/>
-              <w:jc w:val="center"/>
-            </w:pPr>
-            <w:r>
-              <w:rPr>
-                <w:sz w:val="22"/>
-              </w:rPr>
-              <w:t>пачка</w:t>
-            </w:r>
-          </w:p>
-        </w:tc>
-        <w:tc>
-          <w:tcPr>
-            <w:tcW w:type="dxa" w:w="907"/>
-            <w:vAlign w:val="center"/>
-          </w:tcPr>
-          <w:p>
-            <w:pPr>
-              <w:pStyle w:val="TableText"/>
-              <w:keepNext/>
-              <w:jc w:val="center"/>
-            </w:pPr>
-            <w:r>
-              <w:rPr>
-                <w:sz w:val="22"/>
-              </w:rPr>
-              <w:t>5</w:t>
-            </w:r>
-          </w:p>
-        </w:tc>
-        <w:tc>
-          <w:tcPr>
-            <w:tcW w:type="dxa" w:w="1020"/>
-            <w:vAlign w:val="center"/>
-          </w:tcPr>
-          <w:p>
-            <w:pPr>
-              <w:pStyle w:val="TableText"/>
-              <w:keepNext/>
-              <w:jc w:val="right"/>
-            </w:pPr>
-            <w:r>
-              <w:rPr>
-                <w:sz w:val="22"/>
-              </w:rPr>
-              <w:t>550</w:t>
-            </w:r>
-          </w:p>
-        </w:tc>
-        <w:tc>
-          <w:tcPr>
-            <w:tcW w:type="dxa" w:w="1134"/>
-            <w:vAlign w:val="center"/>
-          </w:tcPr>
-          <w:p>
-            <w:pPr>
-              <w:pStyle w:val="TableText"/>
-              <w:keepNext/>
-              <w:jc w:val="right"/>
-            </w:pPr>
-            <w:r>
-              <w:rPr>
-                <w:sz w:val="22"/>
-              </w:rPr>
-              <w:t>2 750</w:t>
-            </w:r>
-          </w:p>
-        </w:tc>
-      </w:tr>
-      <w:tr>
-        <w:trPr>
-          <w:cantSplit/>
-        </w:trPr>
-        <w:tc>
-          <w:tcPr>
-            <w:tcW w:type="dxa" w:w="510"/>
-            <w:vAlign w:val="center"/>
-          </w:tcPr>
-          <w:p>
-            <w:pPr>
-              <w:pStyle w:val="TableText"/>
-              <w:keepNext/>
-              <w:jc w:val="left"/>
-            </w:pPr>
-            <w:r>
-              <w:rPr>
-                <w:sz w:val="22"/>
-              </w:rPr>
-              <w:t>9</w:t>
-            </w:r>
-          </w:p>
-        </w:tc>
-        <w:tc>
-          <w:tcPr>
-            <w:tcW w:type="dxa" w:w="4876"/>
-            <w:vAlign w:val="center"/>
-          </w:tcPr>
-          <w:p>
-            <w:pPr>
-              <w:pStyle w:val="TableText"/>
-              <w:keepNext/>
-              <w:jc w:val="left"/>
-            </w:pPr>
-            <w:r>
-              <w:rPr>
-                <w:sz w:val="22"/>
-              </w:rPr>
-              <w:t>Картридж для лазерного принтера</w:t>
-            </w:r>
-          </w:p>
-        </w:tc>
-        <w:tc>
-          <w:tcPr>
-            <w:tcW w:type="dxa" w:w="907"/>
-            <w:vAlign w:val="center"/>
-          </w:tcPr>
-          <w:p>
-            <w:pPr>
-              <w:pStyle w:val="TableText"/>
-              <w:keepNext/>
-              <w:jc w:val="center"/>
-            </w:pPr>
-            <w:r>
-              <w:rPr>
-                <w:sz w:val="22"/>
-              </w:rPr>
-              <w:t>шт.</w:t>
-            </w:r>
-          </w:p>
-        </w:tc>
-        <w:tc>
-          <w:tcPr>
-            <w:tcW w:type="dxa" w:w="907"/>
-            <w:vAlign w:val="center"/>
-          </w:tcPr>
-          <w:p>
-            <w:pPr>
-              <w:pStyle w:val="TableText"/>
-              <w:keepNext/>
-              <w:jc w:val="center"/>
-            </w:pPr>
-            <w:r>
-              <w:rPr>
-                <w:sz w:val="22"/>
-              </w:rPr>
-              <w:t>2</w:t>
-            </w:r>
-          </w:p>
-        </w:tc>
-        <w:tc>
-          <w:tcPr>
-            <w:tcW w:type="dxa" w:w="1020"/>
-            <w:vAlign w:val="center"/>
-          </w:tcPr>
-          <w:p>
-            <w:pPr>
-              <w:pStyle w:val="TableText"/>
-              <w:keepNext/>
-              <w:jc w:val="right"/>
-            </w:pPr>
-            <w:r>
-              <w:rPr>
-                <w:sz w:val="22"/>
-              </w:rPr>
-              <w:t>3 200</w:t>
-            </w:r>
-          </w:p>
-        </w:tc>
-        <w:tc>
-          <w:tcPr>
-            <w:tcW w:type="dxa" w:w="1134"/>
-            <w:vAlign w:val="center"/>
-          </w:tcPr>
-          <w:p>
-            <w:pPr>
-              <w:pStyle w:val="TableText"/>
-              <w:keepNext/>
-              <w:jc w:val="right"/>
-            </w:pPr>
-            <w:r>
-              <w:rPr>
-                <w:sz w:val="22"/>
-              </w:rPr>
-              <w:t>6 400</w:t>
-            </w:r>
-          </w:p>
-        </w:tc>
-      </w:tr>
-      <w:tr>
-        <w:trPr>
-          <w:cantSplit/>
-        </w:trPr>
-        <w:tc>
-          <w:tcPr>
-            <w:tcW w:type="dxa" w:w="510"/>
-            <w:vAlign w:val="center"/>
-          </w:tcPr>
-          <w:p>
-            <w:pPr>
-              <w:pStyle w:val="TableText"/>
-              <w:keepNext/>
-              <w:jc w:val="left"/>
-            </w:pPr>
-            <w:r>
-              <w:rPr>
-                <w:sz w:val="22"/>
-              </w:rPr>
-              <w:t>10</w:t>
-            </w:r>
-          </w:p>
-        </w:tc>
-        <w:tc>
-          <w:tcPr>
-            <w:tcW w:type="dxa" w:w="4876"/>
-            <w:vAlign w:val="center"/>
-          </w:tcPr>
-          <w:p>
-            <w:pPr>
-              <w:pStyle w:val="TableText"/>
-              <w:keepNext/>
-              <w:jc w:val="left"/>
-            </w:pPr>
-            <w:r>
-              <w:rPr>
-                <w:sz w:val="22"/>
-              </w:rPr>
-              <w:t>Канцелярские принадлежности: ручки, карандаши, скрепки, скобы, файлы, папки, тетради для журналов полевых измерений, маркеры</w:t>
-            </w:r>
-          </w:p>
-        </w:tc>
-        <w:tc>
-          <w:tcPr>
-            <w:tcW w:type="dxa" w:w="907"/>
-            <w:vAlign w:val="center"/>
-          </w:tcPr>
-          <w:p>
-            <w:pPr>
-              <w:pStyle w:val="TableText"/>
-              <w:keepNext/>
-              <w:jc w:val="center"/>
-            </w:pPr>
-            <w:r>
-              <w:rPr>
-                <w:sz w:val="22"/>
-              </w:rPr>
-              <w:t>компл.</w:t>
-            </w:r>
-          </w:p>
-        </w:tc>
-        <w:tc>
-          <w:tcPr>
-            <w:tcW w:type="dxa" w:w="907"/>
-            <w:vAlign w:val="center"/>
-          </w:tcPr>
-          <w:p>
-            <w:pPr>
-              <w:pStyle w:val="TableText"/>
-              <w:keepNext/>
-              <w:jc w:val="center"/>
-            </w:pPr>
-            <w:r>
-              <w:rPr>
-                <w:sz w:val="22"/>
-              </w:rPr>
-              <w:t>1</w:t>
-            </w:r>
-          </w:p>
-        </w:tc>
-        <w:tc>
-          <w:tcPr>
-            <w:tcW w:type="dxa" w:w="1020"/>
-            <w:vAlign w:val="center"/>
-          </w:tcPr>
-          <w:p>
-            <w:pPr>
-              <w:pStyle w:val="TableText"/>
-              <w:keepNext/>
-              <w:jc w:val="right"/>
-            </w:pPr>
-            <w:r>
-              <w:rPr>
-                <w:sz w:val="22"/>
-              </w:rPr>
-              <w:t>2 500</w:t>
-            </w:r>
-          </w:p>
-        </w:tc>
-        <w:tc>
-          <w:tcPr>
-            <w:tcW w:type="dxa" w:w="1134"/>
-            <w:vAlign w:val="center"/>
-          </w:tcPr>
-          <w:p>
-            <w:pPr>
-              <w:pStyle w:val="TableText"/>
-              <w:keepNext/>
-              <w:jc w:val="right"/>
-            </w:pPr>
-            <w:r>
-              <w:rPr>
-                <w:sz w:val="22"/>
-              </w:rPr>
-              <w:t>2 500</w:t>
-            </w:r>
-          </w:p>
-        </w:tc>
-      </w:tr>
-      <w:tr>
-        <w:trPr>
-          <w:cantSplit/>
-        </w:trPr>
-        <w:tc>
-          <w:tcPr>
-            <w:tcW w:type="dxa" w:w="510"/>
-            <w:vAlign w:val="center"/>
-          </w:tcPr>
-          <w:p>
-            <w:pPr>
-              <w:pStyle w:val="TableText"/>
-              <w:jc w:val="left"/>
-            </w:pPr>
-            <w:r>
-              <w:rPr>
-                <w:b/>
-                <w:sz w:val="22"/>
-              </w:rPr>
-            </w:r>
-          </w:p>
-        </w:tc>
-        <w:tc>
-          <w:tcPr>
-            <w:tcW w:type="dxa" w:w="4876"/>
-            <w:vAlign w:val="center"/>
-          </w:tcPr>
-          <w:p>
-            <w:pPr>
-              <w:pStyle w:val="TableText"/>
-              <w:jc w:val="left"/>
-            </w:pPr>
-            <w:r>
-              <w:rPr>
-                <w:b/>
-                <w:sz w:val="22"/>
-              </w:rPr>
-              <w:t>Итого</w:t>
-            </w:r>
-          </w:p>
-        </w:tc>
-        <w:tc>
-          <w:tcPr>
-            <w:tcW w:type="dxa" w:w="907"/>
-            <w:vAlign w:val="center"/>
-          </w:tcPr>
-          <w:p>
-            <w:pPr>
-              <w:pStyle w:val="TableText"/>
-              <w:jc w:val="center"/>
-            </w:pPr>
-            <w:r>
-              <w:rPr>
-                <w:b/>
-                <w:sz w:val="22"/>
-              </w:rPr>
-            </w:r>
-          </w:p>
-        </w:tc>
-        <w:tc>
-          <w:tcPr>
-            <w:tcW w:type="dxa" w:w="907"/>
-            <w:vAlign w:val="center"/>
-          </w:tcPr>
-          <w:p>
-            <w:pPr>
-              <w:pStyle w:val="TableText"/>
-              <w:jc w:val="center"/>
-            </w:pPr>
-            <w:r>
-              <w:rPr>
-                <w:b/>
-                <w:sz w:val="22"/>
-              </w:rPr>
-            </w:r>
-          </w:p>
-        </w:tc>
-        <w:tc>
-          <w:tcPr>
-            <w:tcW w:type="dxa" w:w="1020"/>
-            <w:vAlign w:val="center"/>
-          </w:tcPr>
-          <w:p>
-            <w:pPr>
-              <w:pStyle w:val="TableText"/>
-              <w:jc w:val="right"/>
-            </w:pPr>
-            <w:r>
-              <w:rPr>
-                <w:b/>
-                <w:sz w:val="22"/>
-              </w:rPr>
-            </w:r>
-          </w:p>
-        </w:tc>
-        <w:tc>
-          <w:tcPr>
-            <w:tcW w:type="dxa" w:w="1134"/>
-            <w:vAlign w:val="center"/>
-          </w:tcPr>
-          <w:p>
-            <w:pPr>
-              <w:pStyle w:val="TableText"/>
-              <w:jc w:val="right"/>
-            </w:pPr>
-            <w:r>
-              <w:rPr>
-                <w:b/>
-                <w:sz w:val="22"/>
-              </w:rPr>
-              <w:t>24 560</w:t>
-            </w:r>
-          </w:p>
-        </w:tc>
-      </w:tr>
-    </w:tbl>
-    <w:p>
-      <w:pPr>
-        <w:spacing w:line="240" w:lineRule="auto"/>
-      </w:pPr>
     </w:p>
     <w:p>
       <w:r>
@@ -9309,7 +10293,7 @@
               <w:jc w:val="right"/>
             </w:pPr>
             <w:r>
-              <w:t>(4.7)</w:t>
+              <w:t>(4.8)</w:t>
             </w:r>
           </w:p>
         </w:tc>
@@ -9670,7 +10654,7 @@
               <w:jc w:val="right"/>
             </w:pPr>
             <w:r>
-              <w:t>(4.8)</w:t>
+              <w:t>(4.9)</w:t>
             </w:r>
           </w:p>
         </w:tc>
@@ -9912,7 +10896,7 @@
               <w:jc w:val="right"/>
             </w:pPr>
             <w:r>
-              <w:t>(4.9)</w:t>
+              <w:t>(4.10)</w:t>
             </w:r>
           </w:p>
         </w:tc>
@@ -10354,7 +11338,7 @@
               <w:jc w:val="right"/>
             </w:pPr>
             <w:r>
-              <w:t>(4.10)</w:t>
+              <w:t>(4.11)</w:t>
             </w:r>
           </w:p>
         </w:tc>
@@ -10583,7 +11567,7 @@
               <w:jc w:val="right"/>
             </w:pPr>
             <w:r>
-              <w:t>(4.11)</w:t>
+              <w:t>(4.12)</w:t>
             </w:r>
           </w:p>
         </w:tc>

</xml_diff>

<commit_message>
Thesis 2.1: Doppler shift estimate (87 Hz at 30 m/s, ICI -46 dB vs 31.25 kHz subcarrier spacing), traveling pilots
Co-Authored-By: Claude Opus 5.5 <noreply@anthropic.com>
Claude-Session: https://claude.ai/code/session_01F7zWgPWK1QF4RLkRPrjcGv
</commit_message>
<xml_diff>
--- a/docs/ekonomika/Ekonomicheskaya_chast_HaLow.docx
+++ b/docs/ekonomika/Ekonomicheskaya_chast_HaLow.docx
@@ -17,7 +17,7 @@
     </w:p>
     <w:p>
       <w:r>
-        <w:t>Целью экономической части является технико-экономическое обоснование НИР по методике [38]: оценка её целесообразности по индексу научно-технической прогрессивности, планирование работ, определение затрат, себестоимости, цены и рентабельности, оценка экономической эффективности и срока окупаемости. Расчёты выполнены в ценах сентября 2026 г. для работы, выполняемой в г. Москве.</w:t>
+        <w:t>Целью экономической части является технико-экономическое обоснование НИР по методике [39]: оценка её целесообразности по индексу научно-технической прогрессивности, планирование работ, определение затрат, себестоимости, цены и рентабельности, оценка экономической эффективности и срока окупаемости. Расчёты выполнены в ценах сентября 2026 г. для работы, выполняемой в г. Москве.</w:t>
       </w:r>
     </w:p>
     <w:p>
@@ -30,17 +30,17 @@
     </w:p>
     <w:p>
       <w:r>
-        <w:t>Целесообразность НИР оценивается индексом научно-технической прогрессивности, который определяется сравнением НТПр с аналогом, выбранным за базу для сравнения. Сравнение выполняется методом балльных оценок по трём признакам: научно-технический уровень (новизна), перспективность и возможность применения результатов; баллы назначаются по нормативным шкалам [38].</w:t>
+        <w:t>Целесообразность НИР оценивается индексом научно-технической прогрессивности, который определяется сравнением НТПр с аналогом, выбранным за базу для сравнения. Сравнение выполняется методом балльных оценок по трём признакам: научно-технический уровень (новизна), перспективность и возможность применения результатов; баллы назначаются по нормативным шкалам [39].</w:t>
       </w:r>
     </w:p>
     <w:p>
       <w:r>
-        <w:t>Помимо используемой в работе платы LilyGO T-HaLow на чипсете Taixin стоимостью 3 198 руб. [27] на рынке представлены платы и оценочные комплекты на чипсетах Newracom, требующие внешнего управляющего компьютера или поставляемые по запросу [28, 29, 30], и Morse Micro. Единственный оценочный комплект производителя чипсета с открытой ценой и поставкой в Российскую Федерацию — Morse Micro MM6108-EKH05 стоимостью 39 620 руб. [31]. За базу для сравнения принят распространённый подход к оценке Wi-Fi HaLow — испытания по методике производителя на таких комплектах: измерение дальности и пропускной способности без сопоставления с теоретической оценкой и без сравнения с IEEE 802.11 в идентичных условиях.</w:t>
+        <w:t>Помимо используемой в работе платы LilyGO T-HaLow на чипсете Taixin стоимостью 3 198 руб. [28] на рынке представлены платы и оценочные комплекты на чипсетах Newracom, требующие внешнего управляющего компьютера или поставляемые по запросу [29, 30, 31], и Morse Micro. Единственный оценочный комплект производителя чипсета с открытой ценой и поставкой в Российскую Федерацию — Morse Micro MM6108-EKH05 стоимостью 39 620 руб. [32]. За базу для сравнения принят распространённый подход к оценке Wi-Fi HaLow — испытания по методике производителя на таких комплектах: измерение дальности и пропускной способности без сопоставления с теоретической оценкой и без сравнения с IEEE 802.11 в идентичных условиях.</w:t>
       </w:r>
     </w:p>
     <w:p>
       <w:r>
-        <w:t>Базовый вариант воспроизводит известные испытания, его результаты привязаны к конкретному комплекту и применимы на уровне отдельного предприятия после адаптации в срок 3–5 лет: новизна — 3 балла («приближается к мировым достижениям»), перспективность — 5 («важная»), возможность применения — 3. В настоящей работе теоретические модели распространения радиоволн проверяются экспериментально с определением их параметров и границ применимости, а Wi-Fi HaLow сравнивается с IEEE 802.11 на одной аппаратной платформе (ESP32-S3 имеет собственный радиотракт 2,4 ГГц), что исключает влияние различий оборудования, — 5 баллов; более высокая оценка не принята, так как исследована статичная конфигурация «точка — точка». Результаты непосредственно используются при проектировании каналов связи с БПЛА, а натурных данных для серийных модулей Wi-Fi HaLow, появившихся в 2024–2025 гг., немного, — 7 баллов. Результаты получены на серийной платформе и применимы разработчиками систем связи БПЛА на уровне отрасли в срок до 3 лет — 8 баллов. Значимость признаков принята по [38], результаты оценки сведены в таблицу 4.1.</w:t>
+        <w:t>Базовый вариант воспроизводит известные испытания, его результаты привязаны к конкретному комплекту и применимы на уровне отдельного предприятия после адаптации в срок 3–5 лет: новизна — 3 балла («приближается к мировым достижениям»), перспективность — 5 («важная»), возможность применения — 3. В настоящей работе теоретические модели распространения радиоволн проверяются экспериментально с определением их параметров и границ применимости, а Wi-Fi HaLow сравнивается с IEEE 802.11 на одной аппаратной платформе (ESP32-S3 имеет собственный радиотракт 2,4 ГГц), что исключает влияние различий оборудования, — 5 баллов; более высокая оценка не принята, так как исследована статичная конфигурация «точка — точка». Результаты непосредственно используются при проектировании каналов связи с БПЛА, а натурных данных для серийных модулей Wi-Fi HaLow, появившихся в 2024–2025 гг., немного, — 7 баллов. Результаты получены на серийной платформе и применимы разработчиками систем связи БПЛА на уровне отрасли в срок до 3 лет — 8 баллов. Значимость признаков принята по [39], результаты оценки сведены в таблицу 4.1.</w:t>
       </w:r>
     </w:p>
     <w:p>
@@ -1098,7 +1098,7 @@
     </w:p>
     <w:p>
       <w:r>
-        <w:t>Новизна НТПр оценивается по пяти критериям: принципиально новое — 5 баллов, новое — 3, улучшенное — 2, существующего уровня — 1, устаревшее — 0 [38] (таблица 4.2).</w:t>
+        <w:t>Новизна НТПр оценивается по пяти критериям: принципиально новое — 5 баллов, новое — 3, улучшенное — 2, существующего уровня — 1, устаревшее — 0 [39] (таблица 4.2).</w:t>
       </w:r>
     </w:p>
     <w:p>
@@ -1907,7 +1907,7 @@
     </w:p>
     <w:p>
       <w:r>
-        <w:t>Результат НИР является новым по функциональному критерию и улучшенным по технологическому и производственному; период эффективности новых технологий 2–3 года [38] согласуется с принятым периодом применения результатов — до 3 лет.</w:t>
+        <w:t>Результат НИР является новым по функциональному критерию и улучшенным по технологическому и производственному; период эффективности новых технологий 2–3 года [39] согласуется с принятым периодом применения результатов — до 3 лет.</w:t>
       </w:r>
     </w:p>
     <w:p>
@@ -1928,7 +1928,7 @@
         <w:keepNext/>
       </w:pPr>
       <w:r>
-        <w:t>Производственный цикл j-й стадии в рабочих днях [38]:</w:t>
+        <w:t>Производственный цикл j-й стадии в рабочих днях [39]:</w:t>
       </w:r>
     </w:p>
     <w:tbl>
@@ -2255,7 +2255,7 @@
         </m:sSub>
       </m:oMath>
       <w:r>
-        <w:t xml:space="preserve"> [38]. При начале работ 09.10.2026 и суммарной длительности 73 календарных дня НИР завершается 20.12.2026, каждая стадия — не позднее срока по заданию на ВКР (таблица 4.3).</w:t>
+        <w:t xml:space="preserve"> [39]. При начале работ 09.10.2026 и суммарной длительности 73 календарных дня НИР завершается 20.12.2026, каждая стадия — не позднее срока по заданию на ВКР (таблица 4.3).</w:t>
       </w:r>
     </w:p>
     <w:p>
@@ -3988,7 +3988,7 @@
         <w:keepNext/>
       </w:pPr>
       <w:r>
-        <w:t xml:space="preserve">Для наглядного представления структуры работ и их сроков построен сетевой график [38]. Перечень работ и событий приведён в таблице 4.4; продолжительность работ указана в календарных днях. Поскольку продолжительность работ НИР заранее точно не известна, для каждой работы экспертно заданы минимальная оценка </w:t>
+        <w:t xml:space="preserve">Для наглядного представления структуры работ и их сроков построен сетевой график [39]. Перечень работ и событий приведён в таблице 4.4; продолжительность работ указана в календарных днях. Поскольку продолжительность работ НИР заранее точно не известна, для каждой работы экспертно заданы минимальная оценка </w:t>
       </w:r>
       <m:oMath>
         <m:sSub>
@@ -4040,7 +4040,7 @@
         </m:sSub>
       </m:oMath>
       <w:r>
-        <w:t xml:space="preserve"> — при наиболее неблагоприятном; ожидаемая продолжительность [38]:</w:t>
+        <w:t xml:space="preserve"> — при наиболее неблагоприятном; ожидаемая продолжительность [39]:</w:t>
       </w:r>
     </w:p>
     <w:tbl>
@@ -6443,7 +6443,7 @@
     </w:p>
     <w:p>
       <w:r>
-        <w:t>Основной статьёй затрат НИР является оплата труда. Месячные оклады приняты по медианам предложений работодателей г. Москвы на портале hh.ru [39]; суммы «на руки» пересчитаны в начисленные делением на 0,87 [40]. Оклад инженера-исследователя и инженера-программиста составляет 102 900 руб. (медиана 11 предложений для инженеров без опыта работы), техника — 90 000 руб. (4 предложения для техников без опыта), руководителя НИР — 175 000 руб. (9 предложений для специалистов с опытом 3–6 лет). Часовая ставка равна окладу, делённому на среднемесячный фонд рабочего времени 1 972/12 = 164,33 ч [41]: 626, 548 и 1 065 руб./ч соответственно.</w:t>
+        <w:t>Основной статьёй затрат НИР является оплата труда. Месячные оклады приняты по медианам предложений работодателей г. Москвы на портале hh.ru [40]; суммы «на руки» пересчитаны в начисленные делением на 0,87 [41]. Оклад инженера-исследователя и инженера-программиста составляет 102 900 руб. (медиана 11 предложений для инженеров без опыта работы), техника — 90 000 руб. (4 предложения для техников без опыта), руководителя НИР — 175 000 руб. (9 предложений для специалистов с опытом 3–6 лет). Часовая ставка равна окладу, делённому на среднемесячный фонд рабочего времени 1 972/12 = 164,33 ч [42]: 626, 548 и 1 065 руб./ч соответственно.</w:t>
       </w:r>
     </w:p>
     <w:p>
@@ -6451,7 +6451,7 @@
         <w:keepNext/>
       </w:pPr>
       <w:r>
-        <w:t>Заработная плата по стадиям работ [38]:</w:t>
+        <w:t>Заработная плата по стадиям работ [39]:</w:t>
       </w:r>
     </w:p>
     <w:tbl>
@@ -8461,7 +8461,7 @@
         <w:keepNext/>
       </w:pPr>
       <w:r>
-        <w:t>С учётом премиальных выплат 20 % [38] основная заработная плата</w:t>
+        <w:t>С учётом премиальных выплат 20 % [39] основная заработная плата</w:t>
       </w:r>
     </w:p>
     <w:tbl>
@@ -8653,7 +8653,7 @@
         <w:keepNext/>
       </w:pPr>
       <w:r>
-        <w:t>Дополнительная заработная плата — оплата ежегодного отпуска 28 календарных (20 рабочих) дней при 247 рабочих днях в 2026 г. [41]:</w:t>
+        <w:t>Дополнительная заработная плата — оплата ежегодного отпуска 28 календарных (20 рабочих) дней при 247 рабочих днях в 2026 г. [42]:</w:t>
       </w:r>
     </w:p>
     <w:p>
@@ -8759,12 +8759,12 @@
     </w:p>
     <w:p>
       <w:r>
-        <w:t>Фонд оплаты труда (ФОТ) составляет 612 298 + 53 882 = 666 180 руб. Отчисления на социальные нужды включают страховые взносы по единому тарифу 30 % (выплаты исполнителям не превышают предельной базы 2 979 000 руб. на 2026 г. [40, 42]) и взносы на страхование от несчастных случаев 0,2 % (I класс профессионального риска): 0,302·666 180 = 201 186 руб.</w:t>
+        <w:t>Фонд оплаты труда (ФОТ) составляет 612 298 + 53 882 = 666 180 руб. Отчисления на социальные нужды включают страховые взносы по единому тарифу 30 % (выплаты исполнителям не превышают предельной базы 2 979 000 руб. на 2026 г. [41, 43]) и взносы на страхование от несчастных случаев 0,2 % (I класс профессионального риска): 0,302·666 180 = 201 186 руб.</w:t>
       </w:r>
     </w:p>
     <w:p>
       <w:r>
-        <w:t>Материальные затраты включают покупные комплектующие изделия для экспериментального стенда, канцелярские товары и электроэнергию. Две платы LilyGO T-HaLow образуют канал «точка — точка»: передающая плата с камерой OV5640 работает в режиме точки доступа, приёмная — в режиме станции. Цена платы 37,98 долл. США [27] по курсу Банка России 84,1975 руб./долл. на 20.09.2026 [43] составляет 3 198 руб. Микросхемы флеш-памяти и программатор нужны для резервного копирования и восстановления встроенного программного обеспечения радиомодуля TX-AH [44, 45], аккумуляторы — для автономного питания плат. Цены остальных позиций — средние розничные на сентябрь 2026 г. Покупные комплектующие: отладочная плата LilyGO T-HaLow V1.0 — 2 шт. по 3 198 руб.; модуль камеры OV5640, 24 pin — 2 шт. по 1 100 руб.; микросхема флеш-памяти W25Q32JVSSIQ — 2 шт. по 100 руб.; программатор CH341A с зажимом SOIC-8 — 1 шт. по 714 руб.; кабель USB Type-C с передачей данных, 1 м — 2 шт. по 350 руб.; аккумулятор Li-Ion 18650, 3000 мА·ч — 4 шт. по 450 руб.; зарядное устройство для аккумуляторов 18650 — 1 шт. по 900 руб.; итого 12 910 руб. Канцелярские товары (бумага, картриджи, принадлежности) на печать около 2 500 листов — 11 650 руб.</w:t>
+        <w:t>Материальные затраты включают покупные комплектующие изделия для экспериментального стенда, канцелярские товары и электроэнергию. Две платы LilyGO T-HaLow образуют канал «точка — точка»: передающая плата с камерой OV5640 работает в режиме точки доступа, приёмная — в режиме станции. Цена платы 37,98 долл. США [28] по курсу Банка России 84,1975 руб./долл. на 20.09.2026 [44] составляет 3 198 руб. Микросхемы флеш-памяти и программатор нужны для резервного копирования и восстановления встроенного программного обеспечения радиомодуля TX-AH [45, 46], аккумуляторы — для автономного питания плат. Цены остальных позиций — средние розничные на сентябрь 2026 г. Покупные комплектующие: отладочная плата LilyGO T-HaLow V1.0 — 2 шт. по 3 198 руб.; модуль камеры OV5640, 24 pin — 2 шт. по 1 100 руб.; микросхема флеш-памяти W25Q32JVSSIQ — 2 шт. по 100 руб.; программатор CH341A с зажимом SOIC-8 — 1 шт. по 714 руб.; кабель USB Type-C с передачей данных, 1 м — 2 шт. по 350 руб.; аккумулятор Li-Ion 18650, 3000 мА·ч — 4 шт. по 450 руб.; зарядное устройство для аккумуляторов 18650 — 1 шт. по 900 руб.; итого 12 910 руб. Канцелярские товары (бумага, картриджи, принадлежности) на печать около 2 500 листов — 11 650 руб.</w:t>
       </w:r>
     </w:p>
     <w:p>
@@ -8931,7 +8931,7 @@
         </m:sSub>
       </m:oMath>
       <w:r>
-        <w:t xml:space="preserve"> – тариф в г. Москве с 01.10.2026, руб./(кВт·ч) [46]. Материальные затраты составляют 12 910 + 11 650 + 929 = 25 489 руб.</w:t>
+        <w:t xml:space="preserve"> – тариф в г. Москве с 01.10.2026, руб./(кВт·ч) [47]. Материальные затраты составляют 12 910 + 11 650 + 929 = 25 489 руб.</w:t>
       </w:r>
     </w:p>
     <w:p>
@@ -8974,7 +8974,7 @@
         </m:r>
       </m:oMath>
       <w:r>
-        <w:t xml:space="preserve"> руб., срок полезного использования 3 года — вторая амортизационная группа [47]) начисляется линейным способом пропорционально времени работы:</w:t>
+        <w:t xml:space="preserve"> руб., срок полезного использования 3 года — вторая амортизационная группа [48]) начисляется линейным способом пропорционально времени работы:</w:t>
       </w:r>
     </w:p>
     <w:p>
@@ -9152,7 +9152,7 @@
     </w:p>
     <w:p>
       <w:r>
-        <w:t>Накладные расходы приняты в размере 100 % от ФОТ, поскольку работа выполняется на базе кафедры; в типовой структуре затрат на НИР накладные расходы и заработная плата имеют одинаковый удельный вес — 34 % [38]. Прочие расходы (поездки на полевую площадку, связь, научно-техническая информация) — 10 % от ФОТ.</w:t>
+        <w:t>Накладные расходы приняты в размере 100 % от ФОТ, поскольку работа выполняется на базе кафедры; в типовой структуре затрат на НИР накладные расходы и заработная плата имеют одинаковый удельный вес — 34 % [39]. Прочие расходы (поездки на полевую площадку, связь, научно-техническая информация) — 10 % от ФОТ.</w:t>
       </w:r>
     </w:p>
     <w:p>
@@ -10098,7 +10098,7 @@
         <w:keepNext/>
       </w:pPr>
       <w:r>
-        <w:t>Цена НИР определяется исходя из обеспечения безубыточности деятельности организации [38]:</w:t>
+        <w:t>Цена НИР определяется исходя из обеспечения безубыточности деятельности организации [39]:</w:t>
       </w:r>
     </w:p>
     <w:tbl>
@@ -10382,7 +10382,7 @@
         </m:sSub>
       </m:oMath>
       <w:r>
-        <w:t xml:space="preserve"> – уровень рентабельности по отношению к оплате труда, 200–400 % [38].</w:t>
+        <w:t xml:space="preserve"> – уровень рентабельности по отношению к оплате труда, 200–400 % [39].</w:t>
       </w:r>
     </w:p>
     <w:p>
@@ -10704,7 +10704,7 @@
         </m:sSub>
       </m:oMath>
       <w:r>
-        <w:t xml:space="preserve"> [38]. Результаты НИР используются при проектировании каналов связи с БПЛА, то есть НИР связана с повышением качества проектирования, и годовой экономический эффект определяется по формуле [38]</w:t>
+        <w:t xml:space="preserve"> [39]. Результаты НИР используются при проектировании каналов связи с БПЛА, то есть НИР связана с повышением качества проектирования, и годовой экономический эффект определяется по формуле [39]</w:t>
       </w:r>
     </w:p>
     <w:tbl>
@@ -11109,7 +11109,7 @@
         </m:r>
       </m:oMath>
       <w:r>
-        <w:t xml:space="preserve"> руб. Срок поставки комплектов 7–8 недель [31] в денежном выражении не учитывается, что идёт в запас оценки. Экономический эффект:</w:t>
+        <w:t xml:space="preserve"> руб. Срок поставки комплектов 7–8 недель [32] в денежном выражении не учитывается, что идёт в запас оценки. Экономический эффект:</w:t>
       </w:r>
     </w:p>
     <w:p>
@@ -11173,7 +11173,7 @@
         <w:keepNext/>
       </w:pPr>
       <w:r>
-        <w:t>Уровень экономической эффективности затрат на НИР [38]:</w:t>
+        <w:t>Уровень экономической эффективности затрат на НИР [39]:</w:t>
       </w:r>
     </w:p>
     <w:tbl>
@@ -11575,7 +11575,7 @@
     </w:tbl>
     <w:p>
       <w:r>
-        <w:t xml:space="preserve">Срок окупаемости составляет около 6 месяцев. Для наукоёмкой продукции уровень экономической эффективности должен быть не менее 0,5, то есть вложения должны окупаться в пределах двух лет [38]; полученные значения Е = 2,08 и </w:t>
+        <w:t xml:space="preserve">Срок окупаемости составляет около 6 месяцев. Для наукоёмкой продукции уровень экономической эффективности должен быть не менее 0,5, то есть вложения должны окупаться в пределах двух лет [39]; полученные значения Е = 2,08 и </w:t>
       </w:r>
       <m:oMath>
         <m:sSub>

</xml_diff>

<commit_message>
Economics: start 29.09, salary table in the sample's form, hop-range paragraph reworded
- Network graph over 29.09-25.12 (88 days): expected 70, maximum 88.
- Salary table as table 5 of the sample: one executor per work, labour = expected duration.
- Hop range: modulation rate vs useful rate explained; Wi-Fi wording without "kilometres".
- Table builder: merged cells keep line breaks and stay with the caption.
- Hyphens in the effect formulas, as in the user's edit; econ slide updated.

Co-Authored-By: Claude Opus 5.5 <noreply@anthropic.com>
</commit_message>
<xml_diff>
--- a/docs/ekonomika/Ekonomicheskaya_chast_HaLow.docx
+++ b/docs/ekonomika/Ekonomicheskaya_chast_HaLow.docx
@@ -75,10 +75,11 @@
         <w:t xml:space="preserve">В результате будет получена комплексная оценка экономической обоснованности НИР и </w:t>
       </w:r>
       <w:r>
-        <w:t xml:space="preserve">план её выполнения с определёнными сроками и объёмом финансирования. Это позволит судить, оправдано ли проведение исследования и насколько быстро окупятся вложения в него при передаче результатов предприятиям-разработчикам. </w:t>
+        <w:t>план её выполнения с определёнными сроками и объёмом финансирования. Это позволит судить, оправдано ли проведение исследования и насколько быстро окупятся вложения в него при передаче результатов предприятиям-разработчикам. Расчёты выполнены в ценах сентяб</w:t>
       </w:r>
-      <w:bookmarkStart w:id="0" w:name="_GoBack"/>
-      <w:bookmarkEnd w:id="0"/>
+      <w:r>
+        <w:t>ря 2026 г. для работы, выполняемой в г. Москве.</w:t>
+      </w:r>
     </w:p>
     <w:p>
       <w:pPr>
@@ -129,11 +130,11 @@
         <w:t xml:space="preserve">ь в десятки километров, но ограничивает скорость единицами килобит в секунду [3]. Wi-Fi HaLow передаёт данные многими поднесущими (OFDM) в полосе 1–2 МГц со скоростью от сотен килобит до единиц мегабит в секунду, а платит за это меньшей чувствительностью. </w:t>
       </w:r>
       <w:r>
-        <w:t xml:space="preserve">LoRa — канал телеметрии и управления, передать по нему видео нельзя. Технология зрелая и широко применяется, но для задачи передачи видео с борта её научно-технический уровень лишь приближается к мировому — 5 баллов; перспективность — 4 балла </w:t>
+        <w:t xml:space="preserve">LoRa — канал телеметрии и управления, передать по нему видео нельзя. Технология зрелая и широко применяется, но для задачи передачи видео с борта её научно-технический </w:t>
       </w:r>
       <w:r>
         <w:lastRenderedPageBreak/>
-        <w:t>(«полезная»):</w:t>
+        <w:t>уровень лишь приближается к мировому — 5 баллов; перспективность — 4 балла («полезная»):</w:t>
       </w:r>
       <w:r>
         <w:t xml:space="preserve"> она сохраняется для телеметрии, но не для видео. Для передачи видео результаты LoRa применимы лишь на уровне отдельных предприятий и в отдалённой перспективе — 2 балла.</w:t>
@@ -144,27 +145,30 @@
         <w:t>Wi-Fi 2,4 ГГц передаёт видео с высокой скоростью — на одной паре плат измерено 15–19 М</w:t>
       </w:r>
       <w:r>
-        <w:t>бит/с (подраздел 3.7). Однако с увеличением дальности его скорость падает и за пределами нескольких километров становится меньше минимальной, необходимой для передачи видео. Кроме того, сигнал 2,4 ГГц сильнее ослабляется препятствиями, а диапазон перегруже</w:t>
+        <w:t>бит/с (подраздел 3.7). Однако с увеличением дальности его скорость падает быстрее, чем у Wi-Fi HaLow, и на расстояниях, где Wi-Fi HaLow ещё передаёт видео, становится меньше минимальной, необходимой для передачи видео. Кроме того, сигнал 2,4 ГГц сильнее ос</w:t>
       </w:r>
       <w:r>
-        <w:t>н бытовыми сетями. Научно-технический уровень оценён в 5 баллов («приближается к мировым достижениям»), перспективность для дальних каналов с БПЛА — 5 баллов. Оборудование Wi-Fi 2,4 ГГц массовое и применяется в отрасли уже сейчас, однако дальность ограничи</w:t>
+        <w:t xml:space="preserve">лабляется препятствиями, а диапазон перегружен бытовыми сетями. Научно-технический уровень оценён в 5 баллов («приближается к мировым достижениям»), перспективность для дальних каналов с БПЛА — 5 баллов. Оборудование Wi-Fi 2,4 ГГц массовое и применяется в </w:t>
       </w:r>
       <w:r>
-        <w:t>вает его применение в срок 3–5 лет — 7 баллов.</w:t>
+        <w:t>отрасли уже сейчас, однако дальность ограничивает его применение в срок 3–5 лет — 7 баллов.</w:t>
       </w:r>
     </w:p>
     <w:p>
       <w:r>
-        <w:t xml:space="preserve">Wi-Fi HaLow сочетает обе возможности: работает ниже 1 ГГц, где радиоволны распространяются дальше и лучше огибают препятствия, и при этом переносит видео. Характеристики канала в работе получены измерением на </w:t>
+        <w:t>Wi-Fi HaLow сочетает обе возможности: работает ниже 1 ГГц, где радиоволны распространяются дальше и лучше огибают препятствия, и при этом переносит видео. Характери</w:t>
       </w:r>
       <w:r>
-        <w:t>серийной плате и сопоставлены с моделями распространения радиоволн; сравнение с Wi-Fi 2,4 ГГц выполнено на той же паре плат, сравнение с LoRa — по опубликованным данным, поскольку радиомодуля LoRa на плате нет. Такой результат находится на уровне мировых и</w:t>
+        <w:t xml:space="preserve">стики канала в работе получены измерением на серийной плате и сопоставлены с моделями распространения радиоволн; сравнение с Wi-Fi 2,4 ГГц выполнено на той же паре плат, сравнение с LoRa — по опубликованным данным, поскольку радиомодуля LoRa на плате нет. </w:t>
       </w:r>
       <w:r>
-        <w:t xml:space="preserve">сследований технологии — 7 баллов. Технология новая: доступное оборудование появилось в 2024–2025 гг., натурных данных для серийных модулей мало, а потребность в дальних каналах связи с БПЛА, не требующих наземной инфраструктуры, растёт, — перспективность </w:t>
+        <w:t>Такой результат находится на уровне мировых исследований технологии — 7 баллов. Технология новая: доступное оборудование появилось в 2024–2025 гг., натурных данных для серийных модулей мало, а потребность в дальних каналах связи с БПЛА, не требующих наземн</w:t>
       </w:r>
       <w:r>
-        <w:t>7 баллов. Результаты получены на недорогой серийной плате в разрешённом диапазоне частот и при разрешённой мощности и применимы разработчиками систем связи БПЛА в масштабах отрасли в срок до 3 лет — 8 баллов. Оценки сведены в таблицу 4.1.</w:t>
+        <w:t>ой инфраструктуры, растёт, — перспективность 7 баллов. Результаты получены на недорогой серийной плате в разрешённом диапазоне частот и при разрешённой мощности и применимы разработчиками систем связи БПЛА в масштабах отрасли в срок до 3 лет — 8 баллов. Оц</w:t>
+      </w:r>
+      <w:r>
+        <w:t>енки сведены в таблицу 4.1.</w:t>
       </w:r>
     </w:p>
     <w:p>
@@ -172,10 +176,7 @@
         <w:pStyle w:val="TableCaption"/>
       </w:pPr>
       <w:r>
-        <w:t>Таблица 4.1 – Нау</w:t>
-      </w:r>
-      <w:r>
-        <w:t>чно-технический эффект НТПр</w:t>
+        <w:t>Таблица 4.1 – Научно-технический эффект НТПр</w:t>
       </w:r>
     </w:p>
     <w:tbl>
@@ -560,6 +561,7 @@
         <w:keepNext/>
       </w:pPr>
       <w:r>
+        <w:lastRenderedPageBreak/>
         <w:t>Индекс научно-технической прогрессивности определяется для каждой базы по формуле</w:t>
       </w:r>
     </w:p>
@@ -751,7 +753,6 @@
         <w:ind w:firstLine="0"/>
       </w:pPr>
       <w:r>
-        <w:lastRenderedPageBreak/>
         <w:t xml:space="preserve">где </w:t>
       </w:r>
       <m:oMath>
@@ -1852,14 +1853,11 @@
     </w:p>
     <w:p>
       <w:r>
+        <w:lastRenderedPageBreak/>
         <w:t xml:space="preserve">Помимо прогрессивности, целесообразность НИР характеризует новизна её результатов. Функционально результат отличается от баз тем, что канал Wi-Fi HaLow передаёт видео на расстояниях, где скорость Wi-Fi 2,4 ГГц падает ниже необходимой </w:t>
       </w:r>
       <w:r>
-        <w:t xml:space="preserve">для видео, а LoRa видео не передаёт вовсе. Технологически — тем, что Wi-Fi HaLow и Wi-Fi 2,4 ГГц сравнены на одной аппаратной платформе. Производственный, социальный и юридический критерии остаются на существующем уровне. Новизна оценивается по </w:t>
-      </w:r>
-      <w:r>
-        <w:lastRenderedPageBreak/>
-        <w:t>ориентирово</w:t>
+        <w:t>для видео, а LoRa видео не передаёт вовсе. Технологически — тем, что Wi-Fi HaLow и Wi-Fi 2,4 ГГц сравнены на одной аппаратной платформе. Производственный, социальный и юридический критерии остаются на существующем уровне. Новизна оценивается по ориентирово</w:t>
       </w:r>
       <w:r>
         <w:t>чной шкале методики [42]: принципиально новое — 5 баллов, новое — 3, улучшенное — 2, существующего уровня — 1, устаревшее — 0. Оценка приведена в таблице 4.2.</w:t>
@@ -2769,7 +2767,11 @@
         <w:t>После под</w:t>
       </w:r>
       <w:r>
-        <w:t>тверждения целесообразности НИР ключевым этапом её планирования становятся расчёт трудоёмкости и построение сетевого графика. Затраты труда и его оплата составляют основную часть себестоимости исследования, а сетевой график показывает, в какой последовател</w:t>
+        <w:t xml:space="preserve">тверждения целесообразности НИР ключевым этапом её планирования становятся расчёт трудоёмкости и построение сетевого графика. Затраты труда и его оплата составляют основную часть себестоимости исследования, а сетевой график </w:t>
+      </w:r>
+      <w:r>
+        <w:lastRenderedPageBreak/>
+        <w:t>показывает, в какой последовател</w:t>
       </w:r>
       <w:r>
         <w:t>ьности выполняются работы, какие из них можно вести параллельно и укладывается ли НИР в заданный срок. По методике [42] НИР делится на четыре стадии:</w:t>
@@ -2785,7 +2787,6 @@
     </w:p>
     <w:p>
       <w:r>
-        <w:lastRenderedPageBreak/>
         <w:t>– теоретическая разработка — основа исследования: выбор моделей и методики, подготовка средств проведения эксперимента;</w:t>
       </w:r>
     </w:p>
@@ -3774,7 +3775,7 @@
               <w:rPr>
                 <w:sz w:val="20"/>
               </w:rPr>
-              <w:t>7</w:t>
+              <w:t>9</w:t>
             </w:r>
           </w:p>
         </w:tc>
@@ -3793,7 +3794,7 @@
               <w:rPr>
                 <w:sz w:val="20"/>
               </w:rPr>
-              <w:t>12</w:t>
+              <w:t>14</w:t>
             </w:r>
           </w:p>
         </w:tc>
@@ -3812,7 +3813,7 @@
               <w:rPr>
                 <w:sz w:val="20"/>
               </w:rPr>
-              <w:t>9</w:t>
+              <w:t>11</w:t>
             </w:r>
           </w:p>
         </w:tc>
@@ -4056,7 +4057,7 @@
               <w:rPr>
                 <w:sz w:val="20"/>
               </w:rPr>
-              <w:t>14</w:t>
+              <w:t>15</w:t>
             </w:r>
           </w:p>
         </w:tc>
@@ -4075,7 +4076,7 @@
               <w:rPr>
                 <w:sz w:val="20"/>
               </w:rPr>
-              <w:t>19</w:t>
+              <w:t>20</w:t>
             </w:r>
           </w:p>
         </w:tc>
@@ -4094,7 +4095,7 @@
               <w:rPr>
                 <w:sz w:val="20"/>
               </w:rPr>
-              <w:t>16</w:t>
+              <w:t>17</w:t>
             </w:r>
           </w:p>
         </w:tc>
@@ -4194,7 +4195,7 @@
               <w:rPr>
                 <w:sz w:val="20"/>
               </w:rPr>
-              <w:t>4</w:t>
+              <w:t>5</w:t>
             </w:r>
           </w:p>
         </w:tc>
@@ -4213,7 +4214,7 @@
               <w:rPr>
                 <w:sz w:val="20"/>
               </w:rPr>
-              <w:t>9</w:t>
+              <w:t>10</w:t>
             </w:r>
           </w:p>
         </w:tc>
@@ -4232,7 +4233,7 @@
               <w:rPr>
                 <w:sz w:val="20"/>
               </w:rPr>
-              <w:t>6</w:t>
+              <w:t>7</w:t>
             </w:r>
           </w:p>
         </w:tc>
@@ -4332,7 +4333,7 @@
               <w:rPr>
                 <w:sz w:val="20"/>
               </w:rPr>
-              <w:t>15</w:t>
+              <w:t>20</w:t>
             </w:r>
           </w:p>
         </w:tc>
@@ -4351,7 +4352,7 @@
               <w:rPr>
                 <w:sz w:val="20"/>
               </w:rPr>
-              <w:t>20</w:t>
+              <w:t>25</w:t>
             </w:r>
           </w:p>
         </w:tc>
@@ -4370,7 +4371,7 @@
               <w:rPr>
                 <w:sz w:val="20"/>
               </w:rPr>
-              <w:t>17</w:t>
+              <w:t>22</w:t>
             </w:r>
           </w:p>
         </w:tc>
@@ -4476,7 +4477,7 @@
               <w:rPr>
                 <w:sz w:val="20"/>
               </w:rPr>
-              <w:t>5</w:t>
+              <w:t>6</w:t>
             </w:r>
           </w:p>
         </w:tc>
@@ -4495,7 +4496,7 @@
               <w:rPr>
                 <w:sz w:val="20"/>
               </w:rPr>
-              <w:t>10</w:t>
+              <w:t>11</w:t>
             </w:r>
           </w:p>
         </w:tc>
@@ -4514,7 +4515,7 @@
               <w:rPr>
                 <w:sz w:val="20"/>
               </w:rPr>
-              <w:t>7</w:t>
+              <w:t>8</w:t>
             </w:r>
           </w:p>
         </w:tc>
@@ -4614,7 +4615,7 @@
               <w:rPr>
                 <w:sz w:val="20"/>
               </w:rPr>
-              <w:t>9</w:t>
+              <w:t>10</w:t>
             </w:r>
           </w:p>
         </w:tc>
@@ -4633,7 +4634,7 @@
               <w:rPr>
                 <w:sz w:val="20"/>
               </w:rPr>
-              <w:t>14</w:t>
+              <w:t>15</w:t>
             </w:r>
           </w:p>
         </w:tc>
@@ -4652,7 +4653,7 @@
               <w:rPr>
                 <w:sz w:val="20"/>
               </w:rPr>
-              <w:t>11</w:t>
+              <w:t>12</w:t>
             </w:r>
           </w:p>
         </w:tc>
@@ -4697,7 +4698,7 @@
                 <w:b/>
                 <w:sz w:val="20"/>
               </w:rPr>
-              <w:t>50</w:t>
+              <w:t>60</w:t>
             </w:r>
           </w:p>
         </w:tc>
@@ -4716,7 +4717,7 @@
                 <w:b/>
                 <w:sz w:val="20"/>
               </w:rPr>
-              <w:t>78</w:t>
+              <w:t>88</w:t>
             </w:r>
           </w:p>
         </w:tc>
@@ -4735,7 +4736,7 @@
                 <w:b/>
                 <w:sz w:val="20"/>
               </w:rPr>
-              <w:t>60</w:t>
+              <w:t>70</w:t>
             </w:r>
           </w:p>
         </w:tc>
@@ -4748,13 +4749,13 @@
     </w:p>
     <w:p>
       <w:r>
-        <w:t>Инженер-исследователь последовательно выполняет теоретическую оценку</w:t>
+        <w:t xml:space="preserve">Инженер-исследователь последовательно выполняет теоретическую </w:t>
       </w:r>
       <w:r>
-        <w:t xml:space="preserve"> характеристик канала (работа 2–3) и разрабатывает методику экспериментов (работа 3–4), а инженер-программист параллельно с ним разрабатывает программное обеспечение стенда (работа 2–4). Измерения (работа 4–5) начинаются после завершения обеих ветвей. Пост</w:t>
+        <w:t>оценку характеристик канала (работа 2–3) и разрабатывает методику экспериментов (работа 3–4), а инженер-программист параллельно с ним разрабатывает программное обеспечение стенда (работа 2–4). Измерения (работа 4–5) начинаются после завершения обеих ветвей</w:t>
       </w:r>
       <w:r>
-        <w:t>роенный сетевой график представлен на рисунке 4.1.</w:t>
+        <w:t>. Построенный сетевой график представлен на рисунке 4.1.</w:t>
       </w:r>
     </w:p>
     <w:p>
@@ -4816,13 +4817,13 @@
     </w:p>
     <w:p>
       <w:r>
-        <w:t xml:space="preserve">Обе ветви графика от события 2 до события 4 имеют одинаковую длительность, поэтому </w:t>
+        <w:t>Обе ветви графика от события 2 до события 4 имеют одинаковую длительность, по</w:t>
       </w:r>
       <w:r>
-        <w:t>критическими являются пути 1–2–3–4–5–6–7 и 1–2–4–5–6–7, их длина составит 60 дней. Резервов времени у работ нет, и ни один исполнитель не простаивает в ожидании результатов другого. Максимальная возможная длительность выполнения НИР составит 78 календарных</w:t>
+        <w:t>этому критическими являются пути 1–2–3–4–5–6–7 и 1–2–4–5–6–7, их длина составит 70 дней. Резервов времени у работ нет, и ни один исполнитель не простаивает в ожидании результатов другого. Максимальная возможная длительность выполнения НИР составит 88 кален</w:t>
       </w:r>
       <w:r>
-        <w:t xml:space="preserve"> дней, что удовлетворяет требованиям на срок выполнения дипломной работы, который определён заданием с 09.10.2026 по 25.12.2026 и составляет 78 календарных дней. При ожидаемой продолжительности работ НИР завершается 07.12.2026.</w:t>
+        <w:t>дарных дней, что удовлетворяет требованиям на срок выполнения дипломной работы, который определён с 29.09.2026 по 25.12.2026 и составляет 88 календарных дней. При ожидаемой продолжительности работ НИР завершается 07.12.2026.</w:t>
       </w:r>
     </w:p>
     <w:p>
@@ -4831,54 +4832,51 @@
       </w:pPr>
       <w:r>
         <w:lastRenderedPageBreak/>
-        <w:t>4.3 Определение затрат, себе</w:t>
+        <w:t>4.3 Определение затрат, себесто</w:t>
       </w:r>
       <w:r>
-        <w:t>стоимости и цены разработки</w:t>
+        <w:t>имости и цены разработки</w:t>
       </w:r>
     </w:p>
     <w:p>
       <w:r>
-        <w:t xml:space="preserve">Как уже было сказано выше, основной статьёй расходов при проведении НИР является оплата труда исполнителей. Затраты на неё определяются как сумма затрат на выполнение каждой работы, которые в свою очередь являются произведением </w:t>
+        <w:t>Как уже было сказано выше, основной статьёй расходов при проведении НИР является оплата труда исполнителей. Затраты на неё определяются как сумма затрат на выполнение каждой работы, которые в свою очередь являются произведением тру</w:t>
       </w:r>
       <w:r>
-        <w:t>трудоёмкости работы на дневную ставку исполнителя [42].</w:t>
+        <w:t>доёмкости работы на дневную ставку исполнителя [42].</w:t>
       </w:r>
     </w:p>
     <w:p>
       <w:r>
-        <w:t>Определим состав исполнителей НИР. Основу группы составляет инженер-исследователь (радиоинженер): он анализирует варианты канала связи с БПЛА, выполняет теоретическую оценку характеристик канала, разр</w:t>
+        <w:t>Определим состав исполнителей НИР. Группа состоит из четырёх человек: руководителя НИР, инженера-исследователя, инженера-программиста и техника. Основу группы составляет инженер-исследователь — радиоинже</w:t>
       </w:r>
       <w:r>
-        <w:t>абатывает методику экспериментов, проводит измерения и обрабатывает их результаты. Одновременно с теоретической оценкой и разработкой методики инженер-программист создаёт программное обеспечение стенда — встроенные программы плат камеры и приёмника, переда</w:t>
+        <w:t>нер по специальности: он анализирует варианты канала связи с БПЛА, выполняет теоретическую оценку характеристик канала, разрабатывает методику экспериментов и проводит измерения — собирает стенд, загружает программы в платы, расставляет их на трассе, управ</w:t>
       </w:r>
       <w:r>
-        <w:t xml:space="preserve">ющие видео по каналу Wi-Fi HaLow и регистрирующие его показатели, а также программу приёма и отображения на компьютере. Измерения ведут оба инженера: исследователь управляет прогонами и контролирует показатели канала, программист собирает стенд, загружает </w:t>
+        <w:t xml:space="preserve">ляет прогонами и ведёт протокол. Одновременно с теоретической оценкой и разработкой методики инженер-программист создаёт программное обеспечение стенда — встроенные программы плат камеры и приёмника, передающие видео по каналу Wi-Fi HaLow и регистрирующие </w:t>
       </w:r>
       <w:r>
-        <w:t>программы в платы, расставляет их на трассе и ведёт протокол, а при сбое программы устраняет его на месте. Руководитель НИР участвует в обработке результатов: сопоставляет измерения с теоретической оценкой и с другими протоколами и формулирует рекомендации</w:t>
+        <w:t xml:space="preserve">его показатели, а также программу приёма и отображения на компьютере. Обработку результатов выполняет руководитель НИР: сопоставляет измерения с теоретической оценкой и с другими протоколами и формулирует рекомендации по применению технологии. Его участие </w:t>
       </w:r>
       <w:r>
-        <w:t xml:space="preserve"> по применению технологии. Его участие особенно важно на этом этапе, поскольку от выводов зависит практическая ценность работы. Оформление отчёта, включая расчёты экономической части и раздела охраны труда по готовым исходным данным, поручается технику.</w:t>
+        <w:t>особенно важно на этом этапе, поскольку от выводов зависит практическая ценность работы. Оформление отчёта, включая расчёты экономической части и раздела охраны труда по готовым исходным данным, поручается технику.</w:t>
       </w:r>
     </w:p>
     <w:p>
       <w:r>
-        <w:t>Ме</w:t>
+        <w:t>Месячные оклады исполнителей приняты по д</w:t>
       </w:r>
       <w:r>
-        <w:t>сячные оклады исполнителей приняты по данным рынка труда г. Москвы для специалистов соответствующей квалификации [43]: руководитель НИР — 175 000 руб., инженер-исследователь и инженер-программист — 102 900 руб., техник — 90 000 руб. Дневная ставка равна ок</w:t>
+        <w:t xml:space="preserve">анным рынка труда г. Москвы для специалистов соответствующей квалификации [43]: руководитель НИР — 175 000 руб., инженер-исследователь и инженер-программист — 102 900 руб., техник — 90 000 руб. Дневная ставка равна окладу, умноженному на 12 и делённому на </w:t>
       </w:r>
       <w:r>
-        <w:t>ладу, умноженному на 12 и делённому на 247 рабочих дней 2026 г. [44].</w:t>
+        <w:t>247 рабочих дней 2026 г. [44].</w:t>
       </w:r>
     </w:p>
     <w:p>
       <w:r>
-        <w:t>Трудоёмкость работы получена переводом её ожидаемой продолжительности (таблица 4.4) из календарных дней в рабочие делением на 1,4 [42] и умножением на число исполнителей. Итоговые сведен</w:t>
-      </w:r>
-      <w:r>
-        <w:t>ия об оплате труда исполнителей приведены в таблице 4.5.</w:t>
+        <w:t>Каждую работу выполняет один исполнитель, и её трудоёмкость равна ожидаемой продолжительности (таблица 4.4). Итоговые сведения об оплате труда исполнителей приведены в таблице 4.5.</w:t>
       </w:r>
     </w:p>
     <w:p>
@@ -4887,7 +4885,10 @@
       </w:pPr>
       <w:r>
         <w:lastRenderedPageBreak/>
-        <w:t>Таблица 4.5 – Расчёт заработной платы исполнителей</w:t>
+        <w:t>Таблица 4.5 – Расчёт заработной платы исполн</w:t>
+      </w:r>
+      <w:r>
+        <w:t>ителей</w:t>
       </w:r>
     </w:p>
     <w:tbl>
@@ -4904,10 +4905,10 @@
       </w:tblPr>
       <w:tblGrid>
         <w:gridCol w:w="1020"/>
+        <w:gridCol w:w="1474"/>
+        <w:gridCol w:w="2948"/>
+        <w:gridCol w:w="1247"/>
         <w:gridCol w:w="1361"/>
-        <w:gridCol w:w="2835"/>
-        <w:gridCol w:w="1247"/>
-        <w:gridCol w:w="1417"/>
         <w:gridCol w:w="1474"/>
       </w:tblGrid>
       <w:tr>
@@ -4919,6 +4920,7 @@
         <w:tc>
           <w:tcPr>
             <w:tcW w:w="1020" w:type="dxa"/>
+            <w:vMerge w:val="restart"/>
             <w:vAlign w:val="center"/>
           </w:tcPr>
           <w:p>
@@ -4938,7 +4940,8 @@
         </w:tc>
         <w:tc>
           <w:tcPr>
-            <w:tcW w:w="1361" w:type="dxa"/>
+            <w:tcW w:w="1474" w:type="dxa"/>
+            <w:vMerge w:val="restart"/>
             <w:vAlign w:val="center"/>
           </w:tcPr>
           <w:p>
@@ -4972,7 +4975,8 @@
         </w:tc>
         <w:tc>
           <w:tcPr>
-            <w:tcW w:w="2835" w:type="dxa"/>
+            <w:tcW w:w="4195" w:type="dxa"/>
+            <w:gridSpan w:val="2"/>
             <w:vAlign w:val="center"/>
           </w:tcPr>
           <w:p>
@@ -4986,13 +4990,14 @@
                 <w:b/>
                 <w:sz w:val="20"/>
               </w:rPr>
-              <w:t>Должность</w:t>
-            </w:r>
-          </w:p>
-        </w:tc>
-        <w:tc>
-          <w:tcPr>
-            <w:tcW w:w="1247" w:type="dxa"/>
+              <w:t>Исполнители</w:t>
+            </w:r>
+          </w:p>
+        </w:tc>
+        <w:tc>
+          <w:tcPr>
+            <w:tcW w:w="1361" w:type="dxa"/>
+            <w:vMerge w:val="restart"/>
             <w:vAlign w:val="center"/>
           </w:tcPr>
           <w:p>
@@ -5006,9 +5011,16 @@
                 <w:b/>
                 <w:sz w:val="20"/>
               </w:rPr>
-              <w:t>Числен-</w:t>
-            </w:r>
-          </w:p>
+              <w:t>Дневная ставка, руб.</w:t>
+            </w:r>
+          </w:p>
+        </w:tc>
+        <w:tc>
+          <w:tcPr>
+            <w:tcW w:w="1474" w:type="dxa"/>
+            <w:vMerge w:val="restart"/>
+            <w:vAlign w:val="center"/>
+          </w:tcPr>
           <w:p>
             <w:pPr>
               <w:pStyle w:val="TableText"/>
@@ -5020,15 +5032,9 @@
                 <w:b/>
                 <w:sz w:val="20"/>
               </w:rPr>
-              <w:t>ность, чел.</w:t>
-            </w:r>
-          </w:p>
-        </w:tc>
-        <w:tc>
-          <w:tcPr>
-            <w:tcW w:w="1417" w:type="dxa"/>
-            <w:vAlign w:val="center"/>
-          </w:tcPr>
+              <w:t>Заработ-</w:t>
+            </w:r>
+          </w:p>
           <w:p>
             <w:pPr>
               <w:pStyle w:val="TableText"/>
@@ -5040,13 +5046,44 @@
                 <w:b/>
                 <w:sz w:val="20"/>
               </w:rPr>
-              <w:t>Дневная ставка, руб.</w:t>
-            </w:r>
+              <w:t>ная плата, руб.</w:t>
+            </w:r>
+          </w:p>
+        </w:tc>
+      </w:tr>
+      <w:tr>
+        <w:trPr>
+          <w:cantSplit/>
+          <w:tblHeader/>
+          <w:jc w:val="center"/>
+        </w:trPr>
+        <w:tc>
+          <w:tcPr>
+            <w:tcW w:w="1020" w:type="dxa"/>
+            <w:vMerge/>
+            <w:vAlign w:val="center"/>
+          </w:tcPr>
+          <w:p>
+            <w:pPr>
+              <w:keepNext/>
+            </w:pPr>
           </w:p>
         </w:tc>
         <w:tc>
           <w:tcPr>
             <w:tcW w:w="1474" w:type="dxa"/>
+            <w:vMerge/>
+            <w:vAlign w:val="center"/>
+          </w:tcPr>
+          <w:p>
+            <w:pPr>
+              <w:keepNext/>
+            </w:pPr>
+          </w:p>
+        </w:tc>
+        <w:tc>
+          <w:tcPr>
+            <w:tcW w:w="2948" w:type="dxa"/>
             <w:vAlign w:val="center"/>
           </w:tcPr>
           <w:p>
@@ -5060,9 +5097,15 @@
                 <w:b/>
                 <w:sz w:val="20"/>
               </w:rPr>
-              <w:t>Заработ-</w:t>
-            </w:r>
-          </w:p>
+              <w:t>Должность</w:t>
+            </w:r>
+          </w:p>
+        </w:tc>
+        <w:tc>
+          <w:tcPr>
+            <w:tcW w:w="1247" w:type="dxa"/>
+            <w:vAlign w:val="center"/>
+          </w:tcPr>
           <w:p>
             <w:pPr>
               <w:pStyle w:val="TableText"/>
@@ -5074,8 +5117,46 @@
                 <w:b/>
                 <w:sz w:val="20"/>
               </w:rPr>
-              <w:t>ная плата, руб.</w:t>
-            </w:r>
+              <w:t>Числен-</w:t>
+            </w:r>
+          </w:p>
+          <w:p>
+            <w:pPr>
+              <w:pStyle w:val="TableText"/>
+              <w:keepNext/>
+              <w:jc w:val="center"/>
+            </w:pPr>
+            <w:r>
+              <w:rPr>
+                <w:b/>
+                <w:sz w:val="20"/>
+              </w:rPr>
+              <w:t>ность, чел.</w:t>
+            </w:r>
+          </w:p>
+        </w:tc>
+        <w:tc>
+          <w:tcPr>
+            <w:tcW w:w="1361" w:type="dxa"/>
+            <w:vMerge/>
+            <w:vAlign w:val="center"/>
+          </w:tcPr>
+          <w:p>
+            <w:pPr>
+              <w:keepNext/>
+            </w:pPr>
+          </w:p>
+        </w:tc>
+        <w:tc>
+          <w:tcPr>
+            <w:tcW w:w="1474" w:type="dxa"/>
+            <w:vMerge/>
+            <w:vAlign w:val="center"/>
+          </w:tcPr>
+          <w:p>
+            <w:pPr>
+              <w:keepNext/>
+            </w:pPr>
           </w:p>
         </w:tc>
       </w:tr>
@@ -5105,6 +5186,62 @@
         </w:tc>
         <w:tc>
           <w:tcPr>
+            <w:tcW w:w="1474" w:type="dxa"/>
+            <w:vAlign w:val="center"/>
+          </w:tcPr>
+          <w:p>
+            <w:pPr>
+              <w:pStyle w:val="TableText"/>
+              <w:keepNext/>
+              <w:jc w:val="center"/>
+            </w:pPr>
+            <w:r>
+              <w:rPr>
+                <w:sz w:val="22"/>
+              </w:rPr>
+              <w:t>11</w:t>
+            </w:r>
+          </w:p>
+        </w:tc>
+        <w:tc>
+          <w:tcPr>
+            <w:tcW w:w="2948" w:type="dxa"/>
+            <w:vAlign w:val="center"/>
+          </w:tcPr>
+          <w:p>
+            <w:pPr>
+              <w:pStyle w:val="TableText"/>
+              <w:keepNext/>
+            </w:pPr>
+            <w:r>
+              <w:rPr>
+                <w:sz w:val="22"/>
+              </w:rPr>
+              <w:t>Инженер-исследователь</w:t>
+            </w:r>
+          </w:p>
+        </w:tc>
+        <w:tc>
+          <w:tcPr>
+            <w:tcW w:w="1247" w:type="dxa"/>
+            <w:vAlign w:val="center"/>
+          </w:tcPr>
+          <w:p>
+            <w:pPr>
+              <w:pStyle w:val="TableText"/>
+              <w:keepNext/>
+              <w:jc w:val="center"/>
+            </w:pPr>
+            <w:r>
+              <w:rPr>
+                <w:sz w:val="22"/>
+              </w:rPr>
+              <w:t>1</w:t>
+            </w:r>
+          </w:p>
+        </w:tc>
+        <w:tc>
+          <w:tcPr>
             <w:tcW w:w="1361" w:type="dxa"/>
             <w:vAlign w:val="center"/>
           </w:tcPr>
@@ -5118,82 +5255,26 @@
               <w:rPr>
                 <w:sz w:val="22"/>
               </w:rPr>
-              <w:t>6</w:t>
-            </w:r>
-          </w:p>
-        </w:tc>
-        <w:tc>
-          <w:tcPr>
-            <w:tcW w:w="2835" w:type="dxa"/>
-            <w:vAlign w:val="center"/>
-          </w:tcPr>
-          <w:p>
-            <w:pPr>
-              <w:pStyle w:val="TableText"/>
-              <w:keepNext/>
+              <w:t>5 000</w:t>
+            </w:r>
+          </w:p>
+        </w:tc>
+        <w:tc>
+          <w:tcPr>
+            <w:tcW w:w="1474" w:type="dxa"/>
+            <w:vAlign w:val="center"/>
+          </w:tcPr>
+          <w:p>
+            <w:pPr>
+              <w:pStyle w:val="TableText"/>
+              <w:keepNext/>
+              <w:jc w:val="right"/>
             </w:pPr>
             <w:r>
               <w:rPr>
                 <w:sz w:val="22"/>
               </w:rPr>
-              <w:t>Инженер-исследователь</w:t>
-            </w:r>
-          </w:p>
-        </w:tc>
-        <w:tc>
-          <w:tcPr>
-            <w:tcW w:w="1247" w:type="dxa"/>
-            <w:vAlign w:val="center"/>
-          </w:tcPr>
-          <w:p>
-            <w:pPr>
-              <w:pStyle w:val="TableText"/>
-              <w:keepNext/>
-              <w:jc w:val="center"/>
-            </w:pPr>
-            <w:r>
-              <w:rPr>
-                <w:sz w:val="22"/>
-              </w:rPr>
-              <w:t>1</w:t>
-            </w:r>
-          </w:p>
-        </w:tc>
-        <w:tc>
-          <w:tcPr>
-            <w:tcW w:w="1417" w:type="dxa"/>
-            <w:vAlign w:val="center"/>
-          </w:tcPr>
-          <w:p>
-            <w:pPr>
-              <w:pStyle w:val="TableText"/>
-              <w:keepNext/>
-              <w:jc w:val="center"/>
-            </w:pPr>
-            <w:r>
-              <w:rPr>
-                <w:sz w:val="22"/>
-              </w:rPr>
-              <w:t>5 000</w:t>
-            </w:r>
-          </w:p>
-        </w:tc>
-        <w:tc>
-          <w:tcPr>
-            <w:tcW w:w="1474" w:type="dxa"/>
-            <w:vAlign w:val="center"/>
-          </w:tcPr>
-          <w:p>
-            <w:pPr>
-              <w:pStyle w:val="TableText"/>
-              <w:keepNext/>
-              <w:jc w:val="right"/>
-            </w:pPr>
-            <w:r>
-              <w:rPr>
-                <w:sz w:val="22"/>
-              </w:rPr>
-              <w:t>30 000</w:t>
+              <w:t>55 000</w:t>
             </w:r>
           </w:p>
         </w:tc>
@@ -5224,6 +5305,62 @@
         </w:tc>
         <w:tc>
           <w:tcPr>
+            <w:tcW w:w="1474" w:type="dxa"/>
+            <w:vAlign w:val="center"/>
+          </w:tcPr>
+          <w:p>
+            <w:pPr>
+              <w:pStyle w:val="TableText"/>
+              <w:keepNext/>
+              <w:jc w:val="center"/>
+            </w:pPr>
+            <w:r>
+              <w:rPr>
+                <w:sz w:val="22"/>
+              </w:rPr>
+              <w:t>10</w:t>
+            </w:r>
+          </w:p>
+        </w:tc>
+        <w:tc>
+          <w:tcPr>
+            <w:tcW w:w="2948" w:type="dxa"/>
+            <w:vAlign w:val="center"/>
+          </w:tcPr>
+          <w:p>
+            <w:pPr>
+              <w:pStyle w:val="TableText"/>
+              <w:keepNext/>
+            </w:pPr>
+            <w:r>
+              <w:rPr>
+                <w:sz w:val="22"/>
+              </w:rPr>
+              <w:t>Инженер-исследователь</w:t>
+            </w:r>
+          </w:p>
+        </w:tc>
+        <w:tc>
+          <w:tcPr>
+            <w:tcW w:w="1247" w:type="dxa"/>
+            <w:vAlign w:val="center"/>
+          </w:tcPr>
+          <w:p>
+            <w:pPr>
+              <w:pStyle w:val="TableText"/>
+              <w:keepNext/>
+              <w:jc w:val="center"/>
+            </w:pPr>
+            <w:r>
+              <w:rPr>
+                <w:sz w:val="22"/>
+              </w:rPr>
+              <w:t>1</w:t>
+            </w:r>
+          </w:p>
+        </w:tc>
+        <w:tc>
+          <w:tcPr>
             <w:tcW w:w="1361" w:type="dxa"/>
             <w:vAlign w:val="center"/>
           </w:tcPr>
@@ -5237,82 +5374,26 @@
               <w:rPr>
                 <w:sz w:val="22"/>
               </w:rPr>
-              <w:t>7</w:t>
-            </w:r>
-          </w:p>
-        </w:tc>
-        <w:tc>
-          <w:tcPr>
-            <w:tcW w:w="2835" w:type="dxa"/>
-            <w:vAlign w:val="center"/>
-          </w:tcPr>
-          <w:p>
-            <w:pPr>
-              <w:pStyle w:val="TableText"/>
-              <w:keepNext/>
+              <w:t>5 000</w:t>
+            </w:r>
+          </w:p>
+        </w:tc>
+        <w:tc>
+          <w:tcPr>
+            <w:tcW w:w="1474" w:type="dxa"/>
+            <w:vAlign w:val="center"/>
+          </w:tcPr>
+          <w:p>
+            <w:pPr>
+              <w:pStyle w:val="TableText"/>
+              <w:keepNext/>
+              <w:jc w:val="right"/>
             </w:pPr>
             <w:r>
               <w:rPr>
                 <w:sz w:val="22"/>
               </w:rPr>
-              <w:t>Инженер-исследователь</w:t>
-            </w:r>
-          </w:p>
-        </w:tc>
-        <w:tc>
-          <w:tcPr>
-            <w:tcW w:w="1247" w:type="dxa"/>
-            <w:vAlign w:val="center"/>
-          </w:tcPr>
-          <w:p>
-            <w:pPr>
-              <w:pStyle w:val="TableText"/>
-              <w:keepNext/>
-              <w:jc w:val="center"/>
-            </w:pPr>
-            <w:r>
-              <w:rPr>
-                <w:sz w:val="22"/>
-              </w:rPr>
-              <w:t>1</w:t>
-            </w:r>
-          </w:p>
-        </w:tc>
-        <w:tc>
-          <w:tcPr>
-            <w:tcW w:w="1417" w:type="dxa"/>
-            <w:vAlign w:val="center"/>
-          </w:tcPr>
-          <w:p>
-            <w:pPr>
-              <w:pStyle w:val="TableText"/>
-              <w:keepNext/>
-              <w:jc w:val="center"/>
-            </w:pPr>
-            <w:r>
-              <w:rPr>
-                <w:sz w:val="22"/>
-              </w:rPr>
-              <w:t>5 000</w:t>
-            </w:r>
-          </w:p>
-        </w:tc>
-        <w:tc>
-          <w:tcPr>
-            <w:tcW w:w="1474" w:type="dxa"/>
-            <w:vAlign w:val="center"/>
-          </w:tcPr>
-          <w:p>
-            <w:pPr>
-              <w:pStyle w:val="TableText"/>
-              <w:keepNext/>
-              <w:jc w:val="right"/>
-            </w:pPr>
-            <w:r>
-              <w:rPr>
-                <w:sz w:val="22"/>
-              </w:rPr>
-              <w:t>35 000</w:t>
+              <w:t>50 000</w:t>
             </w:r>
           </w:p>
         </w:tc>
@@ -5343,6 +5424,62 @@
         </w:tc>
         <w:tc>
           <w:tcPr>
+            <w:tcW w:w="1474" w:type="dxa"/>
+            <w:vAlign w:val="center"/>
+          </w:tcPr>
+          <w:p>
+            <w:pPr>
+              <w:pStyle w:val="TableText"/>
+              <w:keepNext/>
+              <w:jc w:val="center"/>
+            </w:pPr>
+            <w:r>
+              <w:rPr>
+                <w:sz w:val="22"/>
+              </w:rPr>
+              <w:t>17</w:t>
+            </w:r>
+          </w:p>
+        </w:tc>
+        <w:tc>
+          <w:tcPr>
+            <w:tcW w:w="2948" w:type="dxa"/>
+            <w:vAlign w:val="center"/>
+          </w:tcPr>
+          <w:p>
+            <w:pPr>
+              <w:pStyle w:val="TableText"/>
+              <w:keepNext/>
+            </w:pPr>
+            <w:r>
+              <w:rPr>
+                <w:sz w:val="22"/>
+              </w:rPr>
+              <w:t>Инженер-программист</w:t>
+            </w:r>
+          </w:p>
+        </w:tc>
+        <w:tc>
+          <w:tcPr>
+            <w:tcW w:w="1247" w:type="dxa"/>
+            <w:vAlign w:val="center"/>
+          </w:tcPr>
+          <w:p>
+            <w:pPr>
+              <w:pStyle w:val="TableText"/>
+              <w:keepNext/>
+              <w:jc w:val="center"/>
+            </w:pPr>
+            <w:r>
+              <w:rPr>
+                <w:sz w:val="22"/>
+              </w:rPr>
+              <w:t>1</w:t>
+            </w:r>
+          </w:p>
+        </w:tc>
+        <w:tc>
+          <w:tcPr>
             <w:tcW w:w="1361" w:type="dxa"/>
             <w:vAlign w:val="center"/>
           </w:tcPr>
@@ -5356,82 +5493,26 @@
               <w:rPr>
                 <w:sz w:val="22"/>
               </w:rPr>
-              <w:t>11</w:t>
-            </w:r>
-          </w:p>
-        </w:tc>
-        <w:tc>
-          <w:tcPr>
-            <w:tcW w:w="2835" w:type="dxa"/>
-            <w:vAlign w:val="center"/>
-          </w:tcPr>
-          <w:p>
-            <w:pPr>
-              <w:pStyle w:val="TableText"/>
-              <w:keepNext/>
+              <w:t>5 000</w:t>
+            </w:r>
+          </w:p>
+        </w:tc>
+        <w:tc>
+          <w:tcPr>
+            <w:tcW w:w="1474" w:type="dxa"/>
+            <w:vAlign w:val="center"/>
+          </w:tcPr>
+          <w:p>
+            <w:pPr>
+              <w:pStyle w:val="TableText"/>
+              <w:keepNext/>
+              <w:jc w:val="right"/>
             </w:pPr>
             <w:r>
               <w:rPr>
                 <w:sz w:val="22"/>
               </w:rPr>
-              <w:t>Инженер-программист</w:t>
-            </w:r>
-          </w:p>
-        </w:tc>
-        <w:tc>
-          <w:tcPr>
-            <w:tcW w:w="1247" w:type="dxa"/>
-            <w:vAlign w:val="center"/>
-          </w:tcPr>
-          <w:p>
-            <w:pPr>
-              <w:pStyle w:val="TableText"/>
-              <w:keepNext/>
-              <w:jc w:val="center"/>
-            </w:pPr>
-            <w:r>
-              <w:rPr>
-                <w:sz w:val="22"/>
-              </w:rPr>
-              <w:t>1</w:t>
-            </w:r>
-          </w:p>
-        </w:tc>
-        <w:tc>
-          <w:tcPr>
-            <w:tcW w:w="1417" w:type="dxa"/>
-            <w:vAlign w:val="center"/>
-          </w:tcPr>
-          <w:p>
-            <w:pPr>
-              <w:pStyle w:val="TableText"/>
-              <w:keepNext/>
-              <w:jc w:val="center"/>
-            </w:pPr>
-            <w:r>
-              <w:rPr>
-                <w:sz w:val="22"/>
-              </w:rPr>
-              <w:t>5 000</w:t>
-            </w:r>
-          </w:p>
-        </w:tc>
-        <w:tc>
-          <w:tcPr>
-            <w:tcW w:w="1474" w:type="dxa"/>
-            <w:vAlign w:val="center"/>
-          </w:tcPr>
-          <w:p>
-            <w:pPr>
-              <w:pStyle w:val="TableText"/>
-              <w:keepNext/>
-              <w:jc w:val="right"/>
-            </w:pPr>
-            <w:r>
-              <w:rPr>
-                <w:sz w:val="22"/>
-              </w:rPr>
-              <w:t>55 000</w:t>
+              <w:t>85 000</w:t>
             </w:r>
           </w:p>
         </w:tc>
@@ -5462,6 +5543,62 @@
         </w:tc>
         <w:tc>
           <w:tcPr>
+            <w:tcW w:w="1474" w:type="dxa"/>
+            <w:vAlign w:val="center"/>
+          </w:tcPr>
+          <w:p>
+            <w:pPr>
+              <w:pStyle w:val="TableText"/>
+              <w:keepNext/>
+              <w:jc w:val="center"/>
+            </w:pPr>
+            <w:r>
+              <w:rPr>
+                <w:sz w:val="22"/>
+              </w:rPr>
+              <w:t>7</w:t>
+            </w:r>
+          </w:p>
+        </w:tc>
+        <w:tc>
+          <w:tcPr>
+            <w:tcW w:w="2948" w:type="dxa"/>
+            <w:vAlign w:val="center"/>
+          </w:tcPr>
+          <w:p>
+            <w:pPr>
+              <w:pStyle w:val="TableText"/>
+              <w:keepNext/>
+            </w:pPr>
+            <w:r>
+              <w:rPr>
+                <w:sz w:val="22"/>
+              </w:rPr>
+              <w:t>Инженер-исследователь</w:t>
+            </w:r>
+          </w:p>
+        </w:tc>
+        <w:tc>
+          <w:tcPr>
+            <w:tcW w:w="1247" w:type="dxa"/>
+            <w:vAlign w:val="center"/>
+          </w:tcPr>
+          <w:p>
+            <w:pPr>
+              <w:pStyle w:val="TableText"/>
+              <w:keepNext/>
+              <w:jc w:val="center"/>
+            </w:pPr>
+            <w:r>
+              <w:rPr>
+                <w:sz w:val="22"/>
+              </w:rPr>
+              <w:t>1</w:t>
+            </w:r>
+          </w:p>
+        </w:tc>
+        <w:tc>
+          <w:tcPr>
             <w:tcW w:w="1361" w:type="dxa"/>
             <w:vAlign w:val="center"/>
           </w:tcPr>
@@ -5475,82 +5612,26 @@
               <w:rPr>
                 <w:sz w:val="22"/>
               </w:rPr>
-              <w:t>4</w:t>
-            </w:r>
-          </w:p>
-        </w:tc>
-        <w:tc>
-          <w:tcPr>
-            <w:tcW w:w="2835" w:type="dxa"/>
-            <w:vAlign w:val="center"/>
-          </w:tcPr>
-          <w:p>
-            <w:pPr>
-              <w:pStyle w:val="TableText"/>
-              <w:keepNext/>
+              <w:t>5 000</w:t>
+            </w:r>
+          </w:p>
+        </w:tc>
+        <w:tc>
+          <w:tcPr>
+            <w:tcW w:w="1474" w:type="dxa"/>
+            <w:vAlign w:val="center"/>
+          </w:tcPr>
+          <w:p>
+            <w:pPr>
+              <w:pStyle w:val="TableText"/>
+              <w:keepNext/>
+              <w:jc w:val="right"/>
             </w:pPr>
             <w:r>
               <w:rPr>
                 <w:sz w:val="22"/>
               </w:rPr>
-              <w:t>Инженер-исследователь</w:t>
-            </w:r>
-          </w:p>
-        </w:tc>
-        <w:tc>
-          <w:tcPr>
-            <w:tcW w:w="1247" w:type="dxa"/>
-            <w:vAlign w:val="center"/>
-          </w:tcPr>
-          <w:p>
-            <w:pPr>
-              <w:pStyle w:val="TableText"/>
-              <w:keepNext/>
-              <w:jc w:val="center"/>
-            </w:pPr>
-            <w:r>
-              <w:rPr>
-                <w:sz w:val="22"/>
-              </w:rPr>
-              <w:t>1</w:t>
-            </w:r>
-          </w:p>
-        </w:tc>
-        <w:tc>
-          <w:tcPr>
-            <w:tcW w:w="1417" w:type="dxa"/>
-            <w:vAlign w:val="center"/>
-          </w:tcPr>
-          <w:p>
-            <w:pPr>
-              <w:pStyle w:val="TableText"/>
-              <w:keepNext/>
-              <w:jc w:val="center"/>
-            </w:pPr>
-            <w:r>
-              <w:rPr>
-                <w:sz w:val="22"/>
-              </w:rPr>
-              <w:t>5 000</w:t>
-            </w:r>
-          </w:p>
-        </w:tc>
-        <w:tc>
-          <w:tcPr>
-            <w:tcW w:w="1474" w:type="dxa"/>
-            <w:vAlign w:val="center"/>
-          </w:tcPr>
-          <w:p>
-            <w:pPr>
-              <w:pStyle w:val="TableText"/>
-              <w:keepNext/>
-              <w:jc w:val="right"/>
-            </w:pPr>
-            <w:r>
-              <w:rPr>
-                <w:sz w:val="22"/>
-              </w:rPr>
-              <w:t>20 000</w:t>
+              <w:t>35 000</w:t>
             </w:r>
           </w:p>
         </w:tc>
@@ -5563,7 +5644,6 @@
         <w:tc>
           <w:tcPr>
             <w:tcW w:w="1020" w:type="dxa"/>
-            <w:vMerge w:val="restart"/>
             <w:vAlign w:val="center"/>
           </w:tcPr>
           <w:p>
@@ -5582,6 +5662,62 @@
         </w:tc>
         <w:tc>
           <w:tcPr>
+            <w:tcW w:w="1474" w:type="dxa"/>
+            <w:vAlign w:val="center"/>
+          </w:tcPr>
+          <w:p>
+            <w:pPr>
+              <w:pStyle w:val="TableText"/>
+              <w:keepNext/>
+              <w:jc w:val="center"/>
+            </w:pPr>
+            <w:r>
+              <w:rPr>
+                <w:sz w:val="22"/>
+              </w:rPr>
+              <w:t>22</w:t>
+            </w:r>
+          </w:p>
+        </w:tc>
+        <w:tc>
+          <w:tcPr>
+            <w:tcW w:w="2948" w:type="dxa"/>
+            <w:vAlign w:val="center"/>
+          </w:tcPr>
+          <w:p>
+            <w:pPr>
+              <w:pStyle w:val="TableText"/>
+              <w:keepNext/>
+            </w:pPr>
+            <w:r>
+              <w:rPr>
+                <w:sz w:val="22"/>
+              </w:rPr>
+              <w:t>Инженер-исследователь</w:t>
+            </w:r>
+          </w:p>
+        </w:tc>
+        <w:tc>
+          <w:tcPr>
+            <w:tcW w:w="1247" w:type="dxa"/>
+            <w:vAlign w:val="center"/>
+          </w:tcPr>
+          <w:p>
+            <w:pPr>
+              <w:pStyle w:val="TableText"/>
+              <w:keepNext/>
+              <w:jc w:val="center"/>
+            </w:pPr>
+            <w:r>
+              <w:rPr>
+                <w:sz w:val="22"/>
+              </w:rPr>
+              <w:t>1</w:t>
+            </w:r>
+          </w:p>
+        </w:tc>
+        <w:tc>
+          <w:tcPr>
             <w:tcW w:w="1361" w:type="dxa"/>
             <w:vAlign w:val="center"/>
           </w:tcPr>
@@ -5595,82 +5731,26 @@
               <w:rPr>
                 <w:sz w:val="22"/>
               </w:rPr>
-              <w:t>12</w:t>
-            </w:r>
-          </w:p>
-        </w:tc>
-        <w:tc>
-          <w:tcPr>
-            <w:tcW w:w="2835" w:type="dxa"/>
-            <w:vAlign w:val="center"/>
-          </w:tcPr>
-          <w:p>
-            <w:pPr>
-              <w:pStyle w:val="TableText"/>
-              <w:keepNext/>
+              <w:t>5 000</w:t>
+            </w:r>
+          </w:p>
+        </w:tc>
+        <w:tc>
+          <w:tcPr>
+            <w:tcW w:w="1474" w:type="dxa"/>
+            <w:vAlign w:val="center"/>
+          </w:tcPr>
+          <w:p>
+            <w:pPr>
+              <w:pStyle w:val="TableText"/>
+              <w:keepNext/>
+              <w:jc w:val="right"/>
             </w:pPr>
             <w:r>
               <w:rPr>
                 <w:sz w:val="22"/>
               </w:rPr>
-              <w:t>Инженер-исследователь</w:t>
-            </w:r>
-          </w:p>
-        </w:tc>
-        <w:tc>
-          <w:tcPr>
-            <w:tcW w:w="1247" w:type="dxa"/>
-            <w:vAlign w:val="center"/>
-          </w:tcPr>
-          <w:p>
-            <w:pPr>
-              <w:pStyle w:val="TableText"/>
-              <w:keepNext/>
-              <w:jc w:val="center"/>
-            </w:pPr>
-            <w:r>
-              <w:rPr>
-                <w:sz w:val="22"/>
-              </w:rPr>
-              <w:t>1</w:t>
-            </w:r>
-          </w:p>
-        </w:tc>
-        <w:tc>
-          <w:tcPr>
-            <w:tcW w:w="1417" w:type="dxa"/>
-            <w:vAlign w:val="center"/>
-          </w:tcPr>
-          <w:p>
-            <w:pPr>
-              <w:pStyle w:val="TableText"/>
-              <w:keepNext/>
-              <w:jc w:val="center"/>
-            </w:pPr>
-            <w:r>
-              <w:rPr>
-                <w:sz w:val="22"/>
-              </w:rPr>
-              <w:t>5 000</w:t>
-            </w:r>
-          </w:p>
-        </w:tc>
-        <w:tc>
-          <w:tcPr>
-            <w:tcW w:w="1474" w:type="dxa"/>
-            <w:vAlign w:val="center"/>
-          </w:tcPr>
-          <w:p>
-            <w:pPr>
-              <w:pStyle w:val="TableText"/>
-              <w:keepNext/>
-              <w:jc w:val="right"/>
-            </w:pPr>
-            <w:r>
-              <w:rPr>
-                <w:sz w:val="22"/>
-              </w:rPr>
-              <w:t>60 000</w:t>
+              <w:t>110 000</w:t>
             </w:r>
           </w:p>
         </w:tc>
@@ -5683,10 +5763,77 @@
         <w:tc>
           <w:tcPr>
             <w:tcW w:w="1020" w:type="dxa"/>
-            <w:vMerge/>
-            <w:vAlign w:val="center"/>
-          </w:tcPr>
-          <w:p/>
+            <w:vAlign w:val="center"/>
+          </w:tcPr>
+          <w:p>
+            <w:pPr>
+              <w:pStyle w:val="TableText"/>
+              <w:keepNext/>
+              <w:jc w:val="center"/>
+            </w:pPr>
+            <w:r>
+              <w:rPr>
+                <w:sz w:val="22"/>
+              </w:rPr>
+              <w:t>6</w:t>
+            </w:r>
+          </w:p>
+        </w:tc>
+        <w:tc>
+          <w:tcPr>
+            <w:tcW w:w="1474" w:type="dxa"/>
+            <w:vAlign w:val="center"/>
+          </w:tcPr>
+          <w:p>
+            <w:pPr>
+              <w:pStyle w:val="TableText"/>
+              <w:keepNext/>
+              <w:jc w:val="center"/>
+            </w:pPr>
+            <w:r>
+              <w:rPr>
+                <w:sz w:val="22"/>
+              </w:rPr>
+              <w:t>8</w:t>
+            </w:r>
+          </w:p>
+        </w:tc>
+        <w:tc>
+          <w:tcPr>
+            <w:tcW w:w="2948" w:type="dxa"/>
+            <w:vAlign w:val="center"/>
+          </w:tcPr>
+          <w:p>
+            <w:pPr>
+              <w:pStyle w:val="TableText"/>
+              <w:keepNext/>
+            </w:pPr>
+            <w:r>
+              <w:rPr>
+                <w:sz w:val="22"/>
+              </w:rPr>
+              <w:t>Руководитель НИР</w:t>
+            </w:r>
+          </w:p>
+        </w:tc>
+        <w:tc>
+          <w:tcPr>
+            <w:tcW w:w="1247" w:type="dxa"/>
+            <w:vAlign w:val="center"/>
+          </w:tcPr>
+          <w:p>
+            <w:pPr>
+              <w:pStyle w:val="TableText"/>
+              <w:keepNext/>
+              <w:jc w:val="center"/>
+            </w:pPr>
+            <w:r>
+              <w:rPr>
+                <w:sz w:val="22"/>
+              </w:rPr>
+              <w:t>1</w:t>
+            </w:r>
+          </w:p>
         </w:tc>
         <w:tc>
           <w:tcPr>
@@ -5703,82 +5850,26 @@
               <w:rPr>
                 <w:sz w:val="22"/>
               </w:rPr>
-              <w:t>12</w:t>
-            </w:r>
-          </w:p>
-        </w:tc>
-        <w:tc>
-          <w:tcPr>
-            <w:tcW w:w="2835" w:type="dxa"/>
-            <w:vAlign w:val="center"/>
-          </w:tcPr>
-          <w:p>
-            <w:pPr>
-              <w:pStyle w:val="TableText"/>
-              <w:keepNext/>
+              <w:t>8 500</w:t>
+            </w:r>
+          </w:p>
+        </w:tc>
+        <w:tc>
+          <w:tcPr>
+            <w:tcW w:w="1474" w:type="dxa"/>
+            <w:vAlign w:val="center"/>
+          </w:tcPr>
+          <w:p>
+            <w:pPr>
+              <w:pStyle w:val="TableText"/>
+              <w:keepNext/>
+              <w:jc w:val="right"/>
             </w:pPr>
             <w:r>
               <w:rPr>
                 <w:sz w:val="22"/>
               </w:rPr>
-              <w:t>Инженер-программист</w:t>
-            </w:r>
-          </w:p>
-        </w:tc>
-        <w:tc>
-          <w:tcPr>
-            <w:tcW w:w="1247" w:type="dxa"/>
-            <w:vAlign w:val="center"/>
-          </w:tcPr>
-          <w:p>
-            <w:pPr>
-              <w:pStyle w:val="TableText"/>
-              <w:keepNext/>
-              <w:jc w:val="center"/>
-            </w:pPr>
-            <w:r>
-              <w:rPr>
-                <w:sz w:val="22"/>
-              </w:rPr>
-              <w:t>1</w:t>
-            </w:r>
-          </w:p>
-        </w:tc>
-        <w:tc>
-          <w:tcPr>
-            <w:tcW w:w="1417" w:type="dxa"/>
-            <w:vAlign w:val="center"/>
-          </w:tcPr>
-          <w:p>
-            <w:pPr>
-              <w:pStyle w:val="TableText"/>
-              <w:keepNext/>
-              <w:jc w:val="center"/>
-            </w:pPr>
-            <w:r>
-              <w:rPr>
-                <w:sz w:val="22"/>
-              </w:rPr>
-              <w:t>5 000</w:t>
-            </w:r>
-          </w:p>
-        </w:tc>
-        <w:tc>
-          <w:tcPr>
-            <w:tcW w:w="1474" w:type="dxa"/>
-            <w:vAlign w:val="center"/>
-          </w:tcPr>
-          <w:p>
-            <w:pPr>
-              <w:pStyle w:val="TableText"/>
-              <w:keepNext/>
-              <w:jc w:val="right"/>
-            </w:pPr>
-            <w:r>
-              <w:rPr>
-                <w:sz w:val="22"/>
-              </w:rPr>
-              <w:t>60 000</w:t>
+              <w:t>68 000</w:t>
             </w:r>
           </w:p>
         </w:tc>
@@ -5791,7 +5882,6 @@
         <w:tc>
           <w:tcPr>
             <w:tcW w:w="1020" w:type="dxa"/>
-            <w:vMerge w:val="restart"/>
             <w:vAlign w:val="center"/>
           </w:tcPr>
           <w:p>
@@ -5804,7 +5894,63 @@
               <w:rPr>
                 <w:sz w:val="22"/>
               </w:rPr>
-              <w:t>6</w:t>
+              <w:t>7</w:t>
+            </w:r>
+          </w:p>
+        </w:tc>
+        <w:tc>
+          <w:tcPr>
+            <w:tcW w:w="1474" w:type="dxa"/>
+            <w:vAlign w:val="center"/>
+          </w:tcPr>
+          <w:p>
+            <w:pPr>
+              <w:pStyle w:val="TableText"/>
+              <w:keepNext/>
+              <w:jc w:val="center"/>
+            </w:pPr>
+            <w:r>
+              <w:rPr>
+                <w:sz w:val="22"/>
+              </w:rPr>
+              <w:t>12</w:t>
+            </w:r>
+          </w:p>
+        </w:tc>
+        <w:tc>
+          <w:tcPr>
+            <w:tcW w:w="2948" w:type="dxa"/>
+            <w:vAlign w:val="center"/>
+          </w:tcPr>
+          <w:p>
+            <w:pPr>
+              <w:pStyle w:val="TableText"/>
+              <w:keepNext/>
+            </w:pPr>
+            <w:r>
+              <w:rPr>
+                <w:sz w:val="22"/>
+              </w:rPr>
+              <w:t>Техник</w:t>
+            </w:r>
+          </w:p>
+        </w:tc>
+        <w:tc>
+          <w:tcPr>
+            <w:tcW w:w="1247" w:type="dxa"/>
+            <w:vAlign w:val="center"/>
+          </w:tcPr>
+          <w:p>
+            <w:pPr>
+              <w:pStyle w:val="TableText"/>
+              <w:keepNext/>
+              <w:jc w:val="center"/>
+            </w:pPr>
+            <w:r>
+              <w:rPr>
+                <w:sz w:val="22"/>
+              </w:rPr>
+              <w:t>1</w:t>
             </w:r>
           </w:p>
         </w:tc>
@@ -5823,82 +5969,26 @@
               <w:rPr>
                 <w:sz w:val="22"/>
               </w:rPr>
-              <w:t>5</w:t>
-            </w:r>
-          </w:p>
-        </w:tc>
-        <w:tc>
-          <w:tcPr>
-            <w:tcW w:w="2835" w:type="dxa"/>
-            <w:vAlign w:val="center"/>
-          </w:tcPr>
-          <w:p>
-            <w:pPr>
-              <w:pStyle w:val="TableText"/>
-              <w:keepNext/>
+              <w:t>4 370</w:t>
+            </w:r>
+          </w:p>
+        </w:tc>
+        <w:tc>
+          <w:tcPr>
+            <w:tcW w:w="1474" w:type="dxa"/>
+            <w:vAlign w:val="center"/>
+          </w:tcPr>
+          <w:p>
+            <w:pPr>
+              <w:pStyle w:val="TableText"/>
+              <w:keepNext/>
+              <w:jc w:val="right"/>
             </w:pPr>
             <w:r>
               <w:rPr>
                 <w:sz w:val="22"/>
               </w:rPr>
-              <w:t>Руководитель НИР</w:t>
-            </w:r>
-          </w:p>
-        </w:tc>
-        <w:tc>
-          <w:tcPr>
-            <w:tcW w:w="1247" w:type="dxa"/>
-            <w:vAlign w:val="center"/>
-          </w:tcPr>
-          <w:p>
-            <w:pPr>
-              <w:pStyle w:val="TableText"/>
-              <w:keepNext/>
-              <w:jc w:val="center"/>
-            </w:pPr>
-            <w:r>
-              <w:rPr>
-                <w:sz w:val="22"/>
-              </w:rPr>
-              <w:t>1</w:t>
-            </w:r>
-          </w:p>
-        </w:tc>
-        <w:tc>
-          <w:tcPr>
-            <w:tcW w:w="1417" w:type="dxa"/>
-            <w:vAlign w:val="center"/>
-          </w:tcPr>
-          <w:p>
-            <w:pPr>
-              <w:pStyle w:val="TableText"/>
-              <w:keepNext/>
-              <w:jc w:val="center"/>
-            </w:pPr>
-            <w:r>
-              <w:rPr>
-                <w:sz w:val="22"/>
-              </w:rPr>
-              <w:t>8 500</w:t>
-            </w:r>
-          </w:p>
-        </w:tc>
-        <w:tc>
-          <w:tcPr>
-            <w:tcW w:w="1474" w:type="dxa"/>
-            <w:vAlign w:val="center"/>
-          </w:tcPr>
-          <w:p>
-            <w:pPr>
-              <w:pStyle w:val="TableText"/>
-              <w:keepNext/>
-              <w:jc w:val="right"/>
-            </w:pPr>
-            <w:r>
-              <w:rPr>
-                <w:sz w:val="22"/>
-              </w:rPr>
-              <w:t>42 500</w:t>
+              <w:t>52 440</w:t>
             </w:r>
           </w:p>
         </w:tc>
@@ -5911,233 +6001,6 @@
         <w:tc>
           <w:tcPr>
             <w:tcW w:w="1020" w:type="dxa"/>
-            <w:vMerge/>
-            <w:vAlign w:val="center"/>
-          </w:tcPr>
-          <w:p/>
-        </w:tc>
-        <w:tc>
-          <w:tcPr>
-            <w:tcW w:w="1361" w:type="dxa"/>
-            <w:vAlign w:val="center"/>
-          </w:tcPr>
-          <w:p>
-            <w:pPr>
-              <w:pStyle w:val="TableText"/>
-              <w:keepNext/>
-              <w:jc w:val="center"/>
-            </w:pPr>
-            <w:r>
-              <w:rPr>
-                <w:sz w:val="22"/>
-              </w:rPr>
-              <w:t>5</w:t>
-            </w:r>
-          </w:p>
-        </w:tc>
-        <w:tc>
-          <w:tcPr>
-            <w:tcW w:w="2835" w:type="dxa"/>
-            <w:vAlign w:val="center"/>
-          </w:tcPr>
-          <w:p>
-            <w:pPr>
-              <w:pStyle w:val="TableText"/>
-              <w:keepNext/>
-            </w:pPr>
-            <w:r>
-              <w:rPr>
-                <w:sz w:val="22"/>
-              </w:rPr>
-              <w:t>Инженер-исследователь</w:t>
-            </w:r>
-          </w:p>
-        </w:tc>
-        <w:tc>
-          <w:tcPr>
-            <w:tcW w:w="1247" w:type="dxa"/>
-            <w:vAlign w:val="center"/>
-          </w:tcPr>
-          <w:p>
-            <w:pPr>
-              <w:pStyle w:val="TableText"/>
-              <w:keepNext/>
-              <w:jc w:val="center"/>
-            </w:pPr>
-            <w:r>
-              <w:rPr>
-                <w:sz w:val="22"/>
-              </w:rPr>
-              <w:t>1</w:t>
-            </w:r>
-          </w:p>
-        </w:tc>
-        <w:tc>
-          <w:tcPr>
-            <w:tcW w:w="1417" w:type="dxa"/>
-            <w:vAlign w:val="center"/>
-          </w:tcPr>
-          <w:p>
-            <w:pPr>
-              <w:pStyle w:val="TableText"/>
-              <w:keepNext/>
-              <w:jc w:val="center"/>
-            </w:pPr>
-            <w:r>
-              <w:rPr>
-                <w:sz w:val="22"/>
-              </w:rPr>
-              <w:t>5 000</w:t>
-            </w:r>
-          </w:p>
-        </w:tc>
-        <w:tc>
-          <w:tcPr>
-            <w:tcW w:w="1474" w:type="dxa"/>
-            <w:vAlign w:val="center"/>
-          </w:tcPr>
-          <w:p>
-            <w:pPr>
-              <w:pStyle w:val="TableText"/>
-              <w:keepNext/>
-              <w:jc w:val="right"/>
-            </w:pPr>
-            <w:r>
-              <w:rPr>
-                <w:sz w:val="22"/>
-              </w:rPr>
-              <w:t>25 000</w:t>
-            </w:r>
-          </w:p>
-        </w:tc>
-      </w:tr>
-      <w:tr>
-        <w:trPr>
-          <w:cantSplit/>
-          <w:jc w:val="center"/>
-        </w:trPr>
-        <w:tc>
-          <w:tcPr>
-            <w:tcW w:w="1020" w:type="dxa"/>
-            <w:vAlign w:val="center"/>
-          </w:tcPr>
-          <w:p>
-            <w:pPr>
-              <w:pStyle w:val="TableText"/>
-              <w:keepNext/>
-              <w:jc w:val="center"/>
-            </w:pPr>
-            <w:r>
-              <w:rPr>
-                <w:sz w:val="22"/>
-              </w:rPr>
-              <w:t>7</w:t>
-            </w:r>
-          </w:p>
-        </w:tc>
-        <w:tc>
-          <w:tcPr>
-            <w:tcW w:w="1361" w:type="dxa"/>
-            <w:vAlign w:val="center"/>
-          </w:tcPr>
-          <w:p>
-            <w:pPr>
-              <w:pStyle w:val="TableText"/>
-              <w:keepNext/>
-              <w:jc w:val="center"/>
-            </w:pPr>
-            <w:r>
-              <w:rPr>
-                <w:sz w:val="22"/>
-              </w:rPr>
-              <w:t>8</w:t>
-            </w:r>
-          </w:p>
-        </w:tc>
-        <w:tc>
-          <w:tcPr>
-            <w:tcW w:w="2835" w:type="dxa"/>
-            <w:vAlign w:val="center"/>
-          </w:tcPr>
-          <w:p>
-            <w:pPr>
-              <w:pStyle w:val="TableText"/>
-              <w:keepNext/>
-            </w:pPr>
-            <w:r>
-              <w:rPr>
-                <w:sz w:val="22"/>
-              </w:rPr>
-              <w:t>Техник</w:t>
-            </w:r>
-          </w:p>
-        </w:tc>
-        <w:tc>
-          <w:tcPr>
-            <w:tcW w:w="1247" w:type="dxa"/>
-            <w:vAlign w:val="center"/>
-          </w:tcPr>
-          <w:p>
-            <w:pPr>
-              <w:pStyle w:val="TableText"/>
-              <w:keepNext/>
-              <w:jc w:val="center"/>
-            </w:pPr>
-            <w:r>
-              <w:rPr>
-                <w:sz w:val="22"/>
-              </w:rPr>
-              <w:t>1</w:t>
-            </w:r>
-          </w:p>
-        </w:tc>
-        <w:tc>
-          <w:tcPr>
-            <w:tcW w:w="1417" w:type="dxa"/>
-            <w:vAlign w:val="center"/>
-          </w:tcPr>
-          <w:p>
-            <w:pPr>
-              <w:pStyle w:val="TableText"/>
-              <w:keepNext/>
-              <w:jc w:val="center"/>
-            </w:pPr>
-            <w:r>
-              <w:rPr>
-                <w:sz w:val="22"/>
-              </w:rPr>
-              <w:t>4 370</w:t>
-            </w:r>
-          </w:p>
-        </w:tc>
-        <w:tc>
-          <w:tcPr>
-            <w:tcW w:w="1474" w:type="dxa"/>
-            <w:vAlign w:val="center"/>
-          </w:tcPr>
-          <w:p>
-            <w:pPr>
-              <w:pStyle w:val="TableText"/>
-              <w:keepNext/>
-              <w:jc w:val="right"/>
-            </w:pPr>
-            <w:r>
-              <w:rPr>
-                <w:sz w:val="22"/>
-              </w:rPr>
-              <w:t>34 960</w:t>
-            </w:r>
-          </w:p>
-        </w:tc>
-      </w:tr>
-      <w:tr>
-        <w:trPr>
-          <w:cantSplit/>
-          <w:jc w:val="center"/>
-        </w:trPr>
-        <w:tc>
-          <w:tcPr>
-            <w:tcW w:w="1020" w:type="dxa"/>
             <w:vAlign w:val="center"/>
           </w:tcPr>
           <w:p>
@@ -6156,7 +6019,7 @@
         </w:tc>
         <w:tc>
           <w:tcPr>
-            <w:tcW w:w="1361" w:type="dxa"/>
+            <w:tcW w:w="1474" w:type="dxa"/>
             <w:vAlign w:val="center"/>
           </w:tcPr>
           <w:p>
@@ -6169,13 +6032,13 @@
                 <w:b/>
                 <w:sz w:val="22"/>
               </w:rPr>
-              <w:t>70</w:t>
-            </w:r>
-          </w:p>
-        </w:tc>
-        <w:tc>
-          <w:tcPr>
-            <w:tcW w:w="2835" w:type="dxa"/>
+              <w:t>87</w:t>
+            </w:r>
+          </w:p>
+        </w:tc>
+        <w:tc>
+          <w:tcPr>
+            <w:tcW w:w="2948" w:type="dxa"/>
             <w:vAlign w:val="center"/>
           </w:tcPr>
           <w:p>
@@ -6198,7 +6061,7 @@
         </w:tc>
         <w:tc>
           <w:tcPr>
-            <w:tcW w:w="1417" w:type="dxa"/>
+            <w:tcW w:w="1361" w:type="dxa"/>
             <w:vAlign w:val="center"/>
           </w:tcPr>
           <w:p>
@@ -6223,7 +6086,7 @@
                 <w:b/>
                 <w:sz w:val="22"/>
               </w:rPr>
-              <w:t>362 460</w:t>
+              <w:t>455 440</w:t>
             </w:r>
           </w:p>
         </w:tc>
@@ -6256,7 +6119,7 @@
             <w:rPr>
               <w:rFonts w:ascii="Cambria Math" w:hAnsi="Cambria Math"/>
             </w:rPr>
-            <m:t>30 000 + 35 000 + 55 000 + 20 000 + 60 000 + 60 000 + 42 500 + 25 000 + 34 960 = 362 460 руб.</m:t>
+            <m:t>55 000 + 50 000 + 85 000 + 35 000 + 110 000 + 68 000 + 52 440 = 455 440 руб.</m:t>
           </m:r>
         </m:oMath>
       </m:oMathPara>
@@ -6266,10 +6129,7 @@
         <w:keepNext/>
       </w:pPr>
       <w:r>
-        <w:t xml:space="preserve">Помимо основных выплат исполнителям </w:t>
-      </w:r>
-      <w:r>
-        <w:t>предусмотрена премия 20 % [42] за добросовестное выполнение и своевременную сдачу этапов НИР. Фонд оплаты труда, выделяемый на НИР:</w:t>
+        <w:t>Помимо основных выплат исполнителям предусмотрена премия 20 % [42] за добросовестное выполнение и своевременную сдачу этапов НИР. Фонд оплаты труда, выделяемый на НИР:</w:t>
       </w:r>
     </w:p>
     <w:p>
@@ -6314,17 +6174,17 @@
             <w:rPr>
               <w:rFonts w:ascii="Cambria Math" w:hAnsi="Cambria Math"/>
             </w:rPr>
-            <m:t xml:space="preserve"> = 1,2·362 460 = 434 952 руб.</m:t>
+            <m:t xml:space="preserve"> = 1,2·455 440 = 546 528 руб.</m:t>
           </m:r>
         </m:oMath>
       </m:oMathPara>
     </w:p>
     <w:p>
       <w:r>
-        <w:t>К расходам на персонал относятся также отчисления на социальные нужды. Согласно действующим</w:t>
+        <w:t>К расходам на персонал относятся также отчисления на социальные нужды. Согласно действующим нормативам их суммарный тариф составляет 30,2 % от фонда оплаты труда: единый тариф страховых взносов 30 % [45] и взносы на страховани</w:t>
       </w:r>
       <w:r>
-        <w:t xml:space="preserve"> нормативам их суммарный тариф составляет 30,2 % от фонда оплаты труда: единый тариф страховых взносов 30 % [45] и взносы на страхование от несчастных случаев на производстве 0,2 %. Эти средства включают:</w:t>
+        <w:t>е от несчастных случаев на производстве 0,2 %. Эти средства включают:</w:t>
       </w:r>
     </w:p>
     <w:p>
@@ -6334,23 +6194,20 @@
     </w:p>
     <w:p>
       <w:r>
-        <w:t xml:space="preserve">– </w:t>
-      </w:r>
-      <w:r>
-        <w:t>5,1 % — на обязательное медицинское страхование;</w:t>
+        <w:t>– 5,1 % — на обязательное медицинское страхование;</w:t>
       </w:r>
     </w:p>
     <w:p>
       <w:r>
-        <w:t>– 2,9 % — на обязательное социальное страхование на случай временной нетрудоспособности и в связи с материнством;</w:t>
+        <w:t xml:space="preserve">– 2,9 % — на обязательное социальное страхование на случай временной </w:t>
+      </w:r>
+      <w:r>
+        <w:t>нетрудоспособности и в связи с материнством;</w:t>
       </w:r>
     </w:p>
     <w:p>
       <w:r>
-        <w:t>– 0,2 % — на страхование от несчастных случаев на производстве и профессиональных заболеваний</w:t>
-      </w:r>
-      <w:r>
-        <w:t>.</w:t>
+        <w:t>– 0,2 % — на страхование от несчастных случаев на производстве и профессиональных заболеваний.</w:t>
       </w:r>
     </w:p>
     <w:p>
@@ -6403,7 +6260,7 @@
             <w:rPr>
               <w:rFonts w:ascii="Cambria Math" w:hAnsi="Cambria Math"/>
             </w:rPr>
-            <m:t xml:space="preserve"> = 0,302·434 952 = 131 356 руб.</m:t>
+            <m:t xml:space="preserve"> = 0,302·546 528 = 165 051 руб.</m:t>
           </m:r>
         </m:oMath>
       </m:oMathPara>
@@ -6413,8 +6270,10 @@
         <w:keepNext/>
       </w:pPr>
       <w:r>
-        <w:lastRenderedPageBreak/>
-        <w:t xml:space="preserve">Материальные, накладные и прочие расходы на НИР определим исходя из принятой оценки удельного веса расходов на оплату труда </w:t>
+        <w:t xml:space="preserve">Материальные, накладные и прочие расходы на НИР </w:t>
+      </w:r>
+      <w:r>
+        <w:t xml:space="preserve">определим исходя из принятой оценки удельного веса расходов на оплату труда </w:t>
       </w:r>
       <m:oMath>
         <m:sSub>
@@ -6635,10 +6494,7 @@
     </w:tbl>
     <w:p>
       <w:r>
-        <w:t>Поэлементн</w:t>
-      </w:r>
-      <w:r>
-        <w:t>ая укрупнённая структура затрат на НИР приведена в таблице 4.6.</w:t>
+        <w:t>Поэлементная укрупнённая структура затрат на НИР приведена в таблице 4.6.</w:t>
       </w:r>
     </w:p>
     <w:p>
@@ -6646,7 +6502,11 @@
         <w:pStyle w:val="TableCaption"/>
       </w:pPr>
       <w:r>
-        <w:t>Таблица 4.6 – Поэлементная укрупнённая структура затрат на НИР</w:t>
+        <w:lastRenderedPageBreak/>
+        <w:t>Таблица 4.6 – Поэлементная укрупнённая структура затра</w:t>
+      </w:r>
+      <w:r>
+        <w:t>т на НИР</w:t>
       </w:r>
     </w:p>
     <w:tbl>
@@ -6763,10 +6623,7 @@
               <w:keepNext/>
             </w:pPr>
             <w:r>
-              <w:t xml:space="preserve">Заработная плата </w:t>
-            </w:r>
-            <w:r>
-              <w:t>исполнителей</w:t>
+              <w:t>Заработная плата исполнителей</w:t>
             </w:r>
           </w:p>
         </w:tc>
@@ -6947,27 +6804,27 @@
     </w:p>
     <w:p>
       <w:r>
-        <w:t>К материалам, полуфабрикатам и покупным комплектующим изделиям отнесены платы LilyGO T-HaLow, модули камеры, микросхемы флеш-памяти и программатор, кабели,</w:t>
+        <w:t xml:space="preserve">К материалам, </w:t>
       </w:r>
       <w:r>
-        <w:t xml:space="preserve"> аккумуляторы с зарядным устройством, а также бумага, картриджи для принтера и канцелярские принадлежности. К накладным расходам — оплата электроэнергии, аренды и отопления помещения, заработной платы обслуживающего персонала, содержание вычислительной тех</w:t>
+        <w:t>полуфабрикатам и покупным комплектующим изделиям отнесены платы LilyGO T-HaLow, модули камеры, микросхемы флеш-памяти и программатор, кабели, аккумуляторы с зарядным устройством, а также бумага, картриджи для принтера и канцелярские принадлежности. К накла</w:t>
       </w:r>
       <w:r>
-        <w:t>ники кафедры. К прочим расходам — услуги связи, поездки на полевую площадку для натурных испытаний и доступ к стандартам и научным публикациям по тематике исследования.</w:t>
+        <w:t>дным расходам — оплата электроэнергии, аренды и отопления помещения, заработной платы обслуживающего персонала, содержание вычислительной техники кафедры. К прочим расходам — услуги связи, поездки на полевую площадку для натурных испытаний и доступ к станд</w:t>
+      </w:r>
+      <w:r>
+        <w:t>артам и научным публикациям по тематике исследования.</w:t>
       </w:r>
     </w:p>
     <w:p>
       <w:r>
-        <w:t>В типовой структуре затрат на НИР удельный вес заработной платы составляет 34 % [42]. В</w:t>
+        <w:t>В типовой структуре затрат на НИР удельный вес заработной платы составляет 34 % [42]. В настоящей работе он принят выше — 40 %: специального оборудования, работ сторонних организаций и командировок в НИ</w:t>
       </w:r>
       <w:r>
-        <w:t xml:space="preserve"> настоящей работе он принят выше — 40 %: специального оборудования, работ сторонних организаций и командировок в НИР нет, и основную часть затрат составляет труд исполнителей. Доля отчислений на социальные нужды (12 %) соответствует тарифу 30,2 % от зарабо</w:t>
+        <w:t>Р нет, и основную часть затрат составляет труд исполнителей. Доля отчислений на социальные нужды (12 %) соответствует тарифу 30,2 % от заработной платы. Стоимость материалов и покупных комплектующих изделий проверена прямым счётом (таблица 4.7): цена платы</w:t>
       </w:r>
       <w:r>
-        <w:t xml:space="preserve">тной платы. Стоимость материалов и покупных комплектующих изделий проверена прямым счётом (таблица 4.7): цена платы LilyGO T-HaLow 37,98 долл. США [28] по курсу 84,1975 руб./долл. на 20.09.2026 [46] составляет 3 198 руб., а всего материалы и комплектующие </w:t>
-      </w:r>
-      <w:r>
-        <w:t>стоят 24 560 руб., или 2,3 % себестоимости, что не превышает принятой доли 5 %.</w:t>
+        <w:t xml:space="preserve"> LilyGO T-HaLow 37,98 долл. США [28] по курсу 84,1975 руб./долл. на 20.09.2026 [46] составляет 3 198 руб., а всего материалы и комплектующие стоят 24 560 руб., или 1,8 % себестоимости, что не превышает принятой доли 5 %.</w:t>
       </w:r>
     </w:p>
     <w:p>
@@ -6975,8 +6832,10 @@
         <w:pStyle w:val="TableCaption"/>
       </w:pPr>
       <w:r>
-        <w:lastRenderedPageBreak/>
-        <w:t>Таблица 4.7 – Стоимость материалов и покупных комплектующих изделий</w:t>
+        <w:t xml:space="preserve">Таблица 4.7 – Стоимость материалов </w:t>
+      </w:r>
+      <w:r>
+        <w:t>и покупных комплектующих изделий</w:t>
       </w:r>
     </w:p>
     <w:tbl>
@@ -7402,7 +7261,13 @@
               <w:rPr>
                 <w:sz w:val="22"/>
               </w:rPr>
-              <w:t>Микросхема флеш-памяти W25Q32JVSSIQ</w:t>
+              <w:t xml:space="preserve">Микросхема флеш-памяти </w:t>
+            </w:r>
+            <w:r>
+              <w:rPr>
+                <w:sz w:val="22"/>
+              </w:rPr>
+              <w:t>W25Q32JVSSIQ</w:t>
             </w:r>
           </w:p>
         </w:tc>
@@ -8235,13 +8100,7 @@
               <w:rPr>
                 <w:sz w:val="22"/>
               </w:rPr>
-              <w:t xml:space="preserve">Канцелярские принадлежности, </w:t>
-            </w:r>
-            <w:r>
-              <w:rPr>
-                <w:sz w:val="22"/>
-              </w:rPr>
-              <w:t>журналы полевых измерений</w:t>
+              <w:t>Канцелярские принадлежности, журналы полевых измерений</w:t>
             </w:r>
           </w:p>
         </w:tc>
@@ -8529,7 +8388,7 @@
                 <w:rPr>
                   <w:rFonts w:ascii="Cambria Math" w:hAnsi="Cambria Math"/>
                 </w:rPr>
-                <m:t>434 952</m:t>
+                <m:t>546 528</m:t>
               </m:r>
             </m:num>
             <m:den>
@@ -8551,7 +8410,7 @@
             <w:rPr>
               <w:rFonts w:ascii="Cambria Math" w:hAnsi="Cambria Math"/>
             </w:rPr>
-            <m:t xml:space="preserve"> = 1 087 380 руб.</m:t>
+            <m:t xml:space="preserve"> = 1 366 320 руб.</m:t>
           </m:r>
         </m:oMath>
       </m:oMathPara>
@@ -8561,10 +8420,10 @@
         <w:keepNext/>
       </w:pPr>
       <w:r>
-        <w:t>Цена НИР</w:t>
+        <w:t>Цена НИР определяется исходя из обеспечения безубыточности организации, кот</w:t>
       </w:r>
       <w:r>
-        <w:t xml:space="preserve"> определяется исходя из обеспечения безубыточности организации, которая её выполняет [42]. Параметром, обеспечивающим безубыточность, служит уровень рентабельности по отношению к оплате труда:</w:t>
+        <w:t>орая её выполняет [42]. Параметром, обеспечивающим безубыточность, служит уровень рентабельности по отношению к оплате труда:</w:t>
       </w:r>
     </w:p>
     <w:tbl>
@@ -8891,7 +8750,7 @@
             <w:rPr>
               <w:rFonts w:ascii="Cambria Math" w:hAnsi="Cambria Math"/>
             </w:rPr>
-            <m:t xml:space="preserve"> = 1 087 380 + 434 952·</m:t>
+            <m:t xml:space="preserve"> = 1 366 320 + 546 528·</m:t>
           </m:r>
           <m:f>
             <m:fPr>
@@ -8931,7 +8790,7 @@
             <w:rPr>
               <w:rFonts w:ascii="Cambria Math" w:hAnsi="Cambria Math"/>
             </w:rPr>
-            <m:t xml:space="preserve"> = 2 392 236 руб.</m:t>
+            <m:t xml:space="preserve"> = 3 005 904 руб.</m:t>
           </m:r>
         </m:oMath>
       </m:oMathPara>
@@ -8952,7 +8811,6 @@
         <w:pStyle w:val="21"/>
       </w:pPr>
       <w:r>
-        <w:lastRenderedPageBreak/>
         <w:t>4.4 Определение и оценка основных показателей экономической эффективности</w:t>
       </w:r>
     </w:p>
@@ -9071,7 +8929,11 @@
         <w:t>Результатом НИР является не изделие, которое продаётся потребителю, а знания — измеренные характеристики канала Wi-Fi HaLow и рекомендации по его применению. Выручки они сам</w:t>
       </w:r>
       <w:r>
-        <w:t xml:space="preserve">и по себе не приносят; их ценность проявляется у предприятия, которое их применяет: оно решает ту же задачу с меньшими затратами. Поэтому экономический эффект НИР определяется как экономия затрат у потребителя её результатов [42]. В настоящей работе такая </w:t>
+        <w:t xml:space="preserve">и по себе не приносят; их ценность проявляется у предприятия, которое их применяет: оно решает ту же задачу с меньшими затратами. Поэтому экономический эффект НИР определяется как экономия затрат у потребителя её результатов [42]. В </w:t>
+      </w:r>
+      <w:r>
+        <w:lastRenderedPageBreak/>
+        <w:t xml:space="preserve">настоящей работе такая </w:t>
       </w:r>
       <w:r>
         <w:t>экономия возникает при создании линий связи с БПЛА: результаты позволяют выбрать технологию, дающую наибольшую дальность одного пролёта, и тем самым сократить число наземных ретрансляторов. Годовой экономический эффект определяется по формуле [42]</w:t>
@@ -9493,34 +9355,43 @@
         <w:t>Поэтому пролёт стремятся сделать как можно длиннее. С ростом расстояния уровень сигнала падает, и канал пер</w:t>
       </w:r>
       <w:r>
-        <w:t>еходит на всё более низкую скорость модуляции; на предельной дальности остаётся наименьшая — 1 Мбит/с у Wi-Fi 2,4 ГГц (802.11b) и 0,65 Мбит/с у Wi-Fi HaLow (канал 2 МГц). Для видео этого достаточно: в экспериментах видео пониженного разрешения 240 × 176 то</w:t>
+        <w:t>еходит на всё более низкую скорость модуляции, пока не останется наименьшая — 1 Мбит/с у Wi-Fi 2,4 ГГц (802.11b) и 0,65 Мбит/с у Wi-Fi HaLow (канал 2 МГц). Скорость модуляции — это скорость передачи в эфире вместе со служебными заголовками и повторами; пол</w:t>
       </w:r>
       <w:r>
-        <w:t xml:space="preserve">чек передавалось уже при полезной скорости 120–180 кбит/с (подразделы 3.2 и 3.3). Следовательно, дальность пролёта линии передачи </w:t>
+        <w:t xml:space="preserve">езная скорость, то есть объём видеоданных, доходящих до приёмника, всегда ниже неё. Видео пониженного разрешения нужно немного: в экспериментах видео 240 × 176 точек передавалось при полезной скорости 120–180 кбит/с (подразделы 3.2 и 3.3), что в 3,5–5 раз </w:t>
       </w:r>
       <w:r>
-        <w:lastRenderedPageBreak/>
-        <w:t>видео задаёт именно наименьшая скорость модуляции, и на больших дальностях проявляется преимущество Wi-Fi HaLow: на частоте ни</w:t>
+        <w:t>меньше даже наименьшей</w:t>
       </w:r>
       <w:r>
-        <w:t>же 1 ГГц сигнал затухает меньше. По расчёту бюджета канала (подраздел 3.7) в свободном пространстве с запасом 10 дБ при нормах мощности Российской Федерации предельная дальность пролёта составляет 2,6 км для Wi-Fi 2,4 ГГц и 4,9 км для Wi-Fi HaLow (для кана</w:t>
+        <w:t xml:space="preserve"> скорости модуляции Wi-Fi HaLow</w:t>
       </w:r>
       <w:r>
-        <w:t>ла 2 МГц — по оценочной чувствительности). Дальше скорость Wi-Fi 2,4 ГГц падает ниже необходимой для передачи видео.</w:t>
+        <w:t>. Следовательно, технологии различаются не скоростью на краю пролёта, а расстоянием, на котором эта н</w:t>
+      </w:r>
+      <w:r>
+        <w:t>аименьшая скорость ещё сохраняется; дальше связи нет совсем. По расчёту бюджета канала (подраздел 3.7) в свободном пространстве с запасом 10 дБ при нормах мощности Российской Федерации это расстояние составляет 2,6 км для Wi-Fi 2,4 ГГц и 4,9 км для Wi-Fi H</w:t>
+      </w:r>
+      <w:r>
+        <w:t>aLow (для канала 2 МГц — по оценочной чувствительности). Несмотря на меньшую разрешённую мощность, Wi-Fi HaLow уходит дальше: на частоте ниже 1 ГГц сигнал затухает меньше, а чувствительность приёмника на наименьшей скорости выше. На расстояниях от 2,6 до 4</w:t>
+      </w:r>
+      <w:r>
+        <w:t>,9 км видео передаёт только Wi-Fi HaLow.</w:t>
       </w:r>
     </w:p>
     <w:p>
       <w:r>
-        <w:t>Ретранслятор составляют две платы LilyGO T-HaLow в общем корпусе, установленном на опоре или мачте: одна принимает данные с предыдущего про</w:t>
+        <w:lastRenderedPageBreak/>
+        <w:t xml:space="preserve">Ретранслятор составляют две платы LilyGO T-HaLow в общем корпусе, установленном на опоре или мачте: одна принимает данные с предыдущего пролёта, другая передаёт их на следующий на другом частотном канале. Две платы </w:t>
       </w:r>
       <w:r>
-        <w:t xml:space="preserve">лёта, другая передаёт их на следующий на другом частотном канале. Две платы нужны потому, что радиомодуль не может одновременно принимать и передавать: одна плата, пересылающая поток поочерёдно, вдвое снизила бы скорость линии. Платы соединены между собой </w:t>
+        <w:t>нужны потому, что радиомодуль не может одновременно принимать и передавать: одна плата, пересылающая поток поочерёдно, вдвое снизила бы скорость линии. Платы соединены между собой короткими проводниками внутри корпуса, а между ретрансляторами связь беспров</w:t>
       </w:r>
       <w:r>
-        <w:t>короткими проводниками внутри корпуса, а между ретрансляторами связь беспроводная. Оба радиотракта — Wi-Fi HaLow и Wi-Fi 2,4 ГГц — находятся на той же плате, поэтому ретранслятор в обоих вариантах одинаков, и варианты различаются только числом ретранслятор</w:t>
+        <w:t>одная. Оба радиотракта — Wi-Fi HaLow и Wi-Fi 2,4 ГГц — находятся на той же плате, поэтому ретранслятор в обоих вариантах одинаков, и варианты различаются только числом ретрансляторов. Состав и стоимость ретранслятора приведены в таблице 4.8 (цены — по табл</w:t>
       </w:r>
       <w:r>
-        <w:t>ов. Состав и стоимость ретранслятора приведены в таблице 4.8 (цены — по таблице 4.7).</w:t>
+        <w:t>ице 4.7).</w:t>
       </w:r>
     </w:p>
     <w:p>
@@ -9690,12 +9561,22 @@
             <w:pPr>
               <w:pStyle w:val="TableText"/>
               <w:keepNext/>
+              <w:rPr>
+                <w:lang w:val="en-US"/>
+              </w:rPr>
             </w:pPr>
             <w:r>
               <w:rPr>
                 <w:sz w:val="22"/>
               </w:rPr>
-              <w:t>Плата LilyGO T-HaLow (ESP32-S3 + TX-AH-R900P)</w:t>
+              <w:t>Плата</w:t>
+            </w:r>
+            <w:r>
+              <w:rPr>
+                <w:sz w:val="22"/>
+                <w:lang w:val="en-US"/>
+              </w:rPr>
+              <w:t xml:space="preserve"> LilyGO T-HaLow (ESP32-S3 + TX-AH-R900P)</w:t>
             </w:r>
           </w:p>
         </w:tc>
@@ -9795,13 +9676,7 @@
               <w:rPr>
                 <w:sz w:val="22"/>
               </w:rPr>
-              <w:t xml:space="preserve">Аккумулятор </w:t>
-            </w:r>
-            <w:r>
-              <w:rPr>
-                <w:sz w:val="22"/>
-              </w:rPr>
-              <w:t>Li-Ion 18650, 3000 мА·ч</w:t>
+              <w:t>Аккумулятор Li-Ion 18650, 3000 мА·ч</w:t>
             </w:r>
           </w:p>
         </w:tc>
@@ -9953,13 +9828,13 @@
         <w:keepNext/>
       </w:pPr>
       <w:r>
-        <w:t xml:space="preserve">Ретранслятор ставится в конце каждого пролёта, поэтому на маршрутах общей протяжённостью L требуется N = ⌈L/d⌉ ретрансляторов, где d — дальность пролёта. Объём применения оценён по облёту линий </w:t>
+        <w:t xml:space="preserve">Ретранслятор ставится в </w:t>
       </w:r>
       <w:r>
-        <w:t>электропередачи — одной из задач мониторинга местности, по которой есть сводные данные о протяжённости: под управлением группы «Россети» находится 2,5 млн км линий электропередачи [47]. Если каналами связи с БПЛА ежегодно оснащается 0,24 % этой сети, то ес</w:t>
+        <w:t>конце каждого пролёта, поэтому на маршрутах общей протяжённостью L требуется N = ⌈L/d⌉ ретрансляторов, где d — дальность пролёта. Объём применения оценён по облёту линий электропередачи — одной из задач мониторинга местности, по которой есть сводные данные</w:t>
       </w:r>
       <w:r>
-        <w:t>ть L = 6 000 км, потребуется ретрансляторов:</w:t>
+        <w:t xml:space="preserve"> о протяжённости: под управлением группы «Россети» находится 2,5 млн км линий электропередачи [47]. Если каналами связи с БПЛА ежегодно оснащается 0,24 % этой сети, то есть L = 6 000 км, потребуется ретрансляторов:</w:t>
       </w:r>
     </w:p>
     <w:p>
@@ -10041,7 +9916,16 @@
             <w:rPr>
               <w:rFonts w:ascii="Cambria Math" w:hAnsi="Cambria Math"/>
             </w:rPr>
-            <m:t xml:space="preserve"> = ⌈6 000/4,9⌉ = 1 225.</m:t>
+            <m:t xml:space="preserve"> = ⌈6 000</m:t>
+          </m:r>
+          <m:r>
+            <m:rPr>
+              <m:sty m:val="p"/>
+            </m:rPr>
+            <w:rPr>
+              <w:rFonts w:ascii="Cambria Math" w:hAnsi="Cambria Math"/>
+            </w:rPr>
+            <m:t>/4,9⌉ = 1 225.</m:t>
           </m:r>
         </m:oMath>
       </m:oMathPara>
@@ -10096,16 +9980,7 @@
             <w:rPr>
               <w:rFonts w:ascii="Cambria Math" w:hAnsi="Cambria Math"/>
             </w:rPr>
-            <m:t xml:space="preserve"> = 2 308·7 29</m:t>
-          </m:r>
-          <m:r>
-            <m:rPr>
-              <m:sty m:val="p"/>
-            </m:rPr>
-            <w:rPr>
-              <w:rFonts w:ascii="Cambria Math" w:hAnsi="Cambria Math"/>
-            </w:rPr>
-            <m:t>6 = 16 839 168 руб.</m:t>
+            <m:t xml:space="preserve"> = 2 308·7 296 = 16 839 168 руб.</m:t>
           </m:r>
         </m:oMath>
       </m:oMathPara>
@@ -10115,7 +9990,6 @@
         <w:keepNext/>
       </w:pPr>
       <w:r>
-        <w:lastRenderedPageBreak/>
         <w:t>Затраты нового варианта:</w:t>
       </w:r>
     </w:p>
@@ -10171,7 +10045,10 @@
         <w:keepNext/>
       </w:pPr>
       <w:r>
-        <w:t xml:space="preserve">Подставив значения в формулу (4.8) при </w:t>
+        <w:t>По</w:t>
+      </w:r>
+      <w:r>
+        <w:t xml:space="preserve">дставив значения в формулу (4.8) при </w:t>
       </w:r>
       <m:oMath>
         <m:sSub>
@@ -10308,10 +10185,11 @@
         <w:keepNext/>
       </w:pPr>
       <w:r>
-        <w:t>Эффект реализуется у предприятия,</w:t>
+        <w:lastRenderedPageBreak/>
+        <w:t>Эффект реализуется у предприятия, применяющего результаты; разработчику НИР по условиям лицензирования приходится его д</w:t>
       </w:r>
       <w:r>
-        <w:t xml:space="preserve"> применяющего результаты; разработчику НИР по условиям лицензирования приходится его доля α. По методике [42] она определяется укрупнённо, пропорционально затратам участников создания и применения НТПр:</w:t>
+        <w:t>оля α. По методике [42] она определяется укрупнённо, пропорционально затратам участников создания и применения НТПр:</w:t>
       </w:r>
     </w:p>
     <w:tbl>
@@ -10507,7 +10385,7 @@
                       <w:rPr>
                         <w:rFonts w:ascii="Cambria Math" w:hAnsi="Cambria Math"/>
                       </w:rPr>
-                      <m:t>1 087 380</m:t>
+                      <m:t>1 366 320</m:t>
                     </m:r>
                   </m:num>
                   <m:den>
@@ -10518,7 +10396,7 @@
                       <w:rPr>
                         <w:rFonts w:ascii="Cambria Math" w:hAnsi="Cambria Math"/>
                       </w:rPr>
-                      <m:t>1 087 380 + 8 937 600</m:t>
+                      <m:t>1 366 320 + 8 937 600</m:t>
                     </m:r>
                   </m:den>
                 </m:f>
@@ -10529,7 +10407,7 @@
                   <w:rPr>
                     <w:rFonts w:ascii="Cambria Math" w:hAnsi="Cambria Math"/>
                   </w:rPr>
-                  <m:t xml:space="preserve"> = 0,11.</m:t>
+                  <m:t xml:space="preserve"> = 0,13.</m:t>
                 </m:r>
               </m:oMath>
             </m:oMathPara>
@@ -10753,7 +10631,7 @@
                       <w:rPr>
                         <w:rFonts w:ascii="Cambria Math" w:hAnsi="Cambria Math"/>
                       </w:rPr>
-                      <m:t>13 458 493·0,11</m:t>
+                      <m:t>13 458 493·0,13</m:t>
                     </m:r>
                   </m:num>
                   <m:den>
@@ -10764,7 +10642,7 @@
                       <w:rPr>
                         <w:rFonts w:ascii="Cambria Math" w:hAnsi="Cambria Math"/>
                       </w:rPr>
-                      <m:t>2 392 236</m:t>
+                      <m:t>3 005 904</m:t>
                     </m:r>
                   </m:den>
                 </m:f>
@@ -10775,7 +10653,7 @@
                   <w:rPr>
                     <w:rFonts w:ascii="Cambria Math" w:hAnsi="Cambria Math"/>
                   </w:rPr>
-                  <m:t xml:space="preserve"> = 0,62,</m:t>
+                  <m:t xml:space="preserve"> = 0,58,</m:t>
                 </m:r>
               </m:oMath>
             </m:oMathPara>
@@ -10844,10 +10722,7 @@
         <w:keepNext/>
       </w:pPr>
       <w:r>
-        <w:t xml:space="preserve">Срок окупаемости как величина, обратная экономической </w:t>
-      </w:r>
-      <w:r>
-        <w:t>эффективности:</w:t>
+        <w:t>Срок окупаемости как величина, обратная экономической эффективности:</w:t>
       </w:r>
     </w:p>
     <w:tbl>
@@ -11020,7 +10895,7 @@
                       <w:rPr>
                         <w:rFonts w:ascii="Cambria Math" w:hAnsi="Cambria Math"/>
                       </w:rPr>
-                      <m:t>0,62</m:t>
+                      <m:t>0,58</m:t>
                     </m:r>
                   </m:den>
                 </m:f>
@@ -11031,7 +10906,7 @@
                   <w:rPr>
                     <w:rFonts w:ascii="Cambria Math" w:hAnsi="Cambria Math"/>
                   </w:rPr>
-                  <m:t xml:space="preserve"> = 1,61 года.</m:t>
+                  <m:t xml:space="preserve"> = 1,72 года.</m:t>
                 </m:r>
               </m:oMath>
             </m:oMathPara>
@@ -11056,10 +10931,18 @@
     </w:tbl>
     <w:p>
       <w:r>
-        <w:t xml:space="preserve">Срок окупаемости составляет около 19 месяцев. Для наукоёмкой продукции уровень эффективности должен быть не менее 0,5, то есть вложения должны окупаться в пределах двух лет [42]; полученное значение </w:t>
+        <w:t>Срок окупаемости составляет около 21 месяцев.</w:t>
       </w:r>
       <w:r>
-        <w:t>0,62 этому требованию удовлетворяет. Расчёт выполнен для одного предприятия; при передаче результатов нескольким предприятиям срок окупаемости сократится.</w:t>
+        <w:t xml:space="preserve"> Для наукоёмкой продукции уровень эффективности должен быть не ме</w:t>
+      </w:r>
+      <w:bookmarkStart w:id="0" w:name="_GoBack"/>
+      <w:bookmarkEnd w:id="0"/>
+      <w:r>
+        <w:t xml:space="preserve">нее 0,5, то есть вложения должны окупаться в пределах двух лет [42]; полученное значение 0,58 этому требованию удовлетворяет. Расчёт выполнен для одного предприятия; при передаче результатов </w:t>
+      </w:r>
+      <w:r>
+        <w:t>нескольким предприятиям срок окупаемости сократится.</w:t>
       </w:r>
     </w:p>
     <w:sectPr>
@@ -11483,7 +11366,7 @@
               <w:noProof/>
               <w:sz w:val="22"/>
             </w:rPr>
-            <w:t>47</w:t>
+            <w:t>60</w:t>
           </w:r>
           <w:r>
             <w:rPr>
@@ -23692,7 +23575,7 @@
 </file>
 
 <file path=customXml/itemProps1.xml><?xml version="1.0" encoding="utf-8"?>
-<ds:datastoreItem xmlns:ds="http://schemas.openxmlformats.org/officeDocument/2006/customXml" ds:itemID="{437D5F98-1E5C-4972-81E6-458C836859D8}">
+<ds:datastoreItem xmlns:ds="http://schemas.openxmlformats.org/officeDocument/2006/customXml" ds:itemID="{3692E4DF-BD81-4B16-B5D0-6C1F6DBCFB48}">
   <ds:schemaRefs>
     <ds:schemaRef ds:uri="http://schemas.openxmlformats.org/officeDocument/2006/bibliography"/>
   </ds:schemaRefs>

</xml_diff>

<commit_message>
Economics on the measured link boundary instead of the datasheet budget
Relay hop = measured link boundary of the same board pair at RF power limits
(table 3.10): Wi-Fi 2.4 GHz 0.87 km, Wi-Fi HaLow 1.55 km. Relays 6897 / 3871,
efficiency 0.64, payback 1.56 years. Journal row and economics slide updated;
review checklist refreshed.

Co-Authored-By: Claude Opus 5.5 <noreply@anthropic.com>
</commit_message>
<xml_diff>
--- a/docs/ekonomika/Ekonomicheskaya_chast_HaLow.docx
+++ b/docs/ekonomika/Ekonomicheskaya_chast_HaLow.docx
@@ -8675,7 +8675,7 @@
     </w:p>
     <w:p>
       <w:r>
-        <w:t>Поэтому пролёт стремятся сделать как можно длиннее. С ростом расстояния уровень сигнала падает, и канал переходит на всё более низкую скорость модуляции, пока не останется наименьшая — 1 Мбит/с у Wi-Fi 2,4 ГГц (802.11b) и 0,65 Мбит/с у Wi-Fi HaLow (канал 2 МГц). Скорость модуляции — это скорость передачи в эфире вместе со служебными заголовками и повторами; полезная скорость, то есть объём видеоданных, доходящих до приёмника, всегда ниже неё. Видео пониженного разрешения нужно немного: в экспериментах видео 240 × 176 точек передавалось при полезной скорости 120–180 кбит/с (подразделы 3.2 и 3.3), что в 3,5–5 раз меньше даже наименьшей скорости модуляции Wi-Fi HaLow. Следовательно, технологии различаются не скоростью на краю пролёта, а расстоянием, на котором эта наименьшая скорость ещё сохраняется; дальше связи нет совсем. По расчёту бюджета канала (подраздел 3.7) в свободном пространстве с запасом 10 дБ при нормах мощности Российской Федерации это расстояние составляет 2,6 км для Wi-Fi 2,4 ГГц и 4,9 км для Wi-Fi HaLow (для канала 2 МГц — по оценочной чувствительности). Несмотря на меньшую разрешённую мощность, Wi-Fi HaLow уходит дальше: на частоте ниже 1 ГГц сигнал затухает меньше, а чувствительность приёмника на наименьшей скорости выше. На расстояниях от 2,6 до 4,9 км видео передаёт только Wi-Fi HaLow.</w:t>
+        <w:t>Поэтому пролёт стремятся сделать как можно длиннее. Дальность пролёта в оценке — не расчётная, а измеренная граница связи той же пары плат T-HaLow в пересчёте на трассу прямой видимости при нормах мощности Российской Федерации (подраздел 3.6, таблица 3.10): 0,87 км для Wi-Fi 2,4 ГГц при 20 дБм и 1,55 км для Wi-Fi HaLow при 14 дБм. Несмотря на меньшую разрешённую мощность, Wi-Fi HaLow уходит дальше: допустимые потери на трассе у обеих технологий близки, а на частоте ниже 1 ГГц сигнал затухает меньше. На расстояниях от 0,87 до 1,55 км связь сохраняет только Wi-Fi HaLow.</w:t>
       </w:r>
     </w:p>
     <w:p>
@@ -9162,7 +9162,7 @@
           <w:rPr>
             <w:rFonts w:ascii="Cambria Math" w:hAnsi="Cambria Math"/>
           </w:rPr>
-          <m:t xml:space="preserve"> = ⌈6 000/2,6⌉ = 2 308;   </m:t>
+          <m:t xml:space="preserve"> = ⌈6 000/0,87⌉ = 6 897;   </m:t>
         </m:r>
         <m:sSub>
           <m:e>
@@ -9192,7 +9192,7 @@
           <w:rPr>
             <w:rFonts w:ascii="Cambria Math" w:hAnsi="Cambria Math"/>
           </w:rPr>
-          <m:t xml:space="preserve"> = ⌈6 000/4,9⌉ = 1 225.</m:t>
+          <m:t xml:space="preserve"> = ⌈6 000/1,55⌉ = 3 871.</m:t>
         </m:r>
       </m:oMath>
     </w:p>
@@ -9238,7 +9238,7 @@
           <w:rPr>
             <w:rFonts w:ascii="Cambria Math" w:hAnsi="Cambria Math"/>
           </w:rPr>
-          <m:t xml:space="preserve"> = 2 308·7 296 = 16 839 168 руб.</m:t>
+          <m:t xml:space="preserve"> = 6 897·7 296 = 50 320 512 руб.</m:t>
         </m:r>
       </m:oMath>
     </w:p>
@@ -9284,7 +9284,7 @@
           <w:rPr>
             <w:rFonts w:ascii="Cambria Math" w:hAnsi="Cambria Math"/>
           </w:rPr>
-          <m:t xml:space="preserve"> = 1 225·7 296 = 8 937 600 руб.</m:t>
+          <m:t xml:space="preserve"> = 3 871·7 296 = 28 242 816 руб.</m:t>
         </m:r>
       </m:oMath>
     </w:p>
@@ -9376,7 +9376,7 @@
               <w:rPr>
                 <w:rFonts w:ascii="Cambria Math" w:hAnsi="Cambria Math"/>
               </w:rPr>
-              <m:t xml:space="preserve">16 839 168·1,33 - 8 937 600</m:t>
+              <m:t xml:space="preserve">50 320 512·1,33 - 28 242 816</m:t>
             </m:r>
           </m:num>
           <m:den>
@@ -9398,7 +9398,7 @@
           <w:rPr>
             <w:rFonts w:ascii="Cambria Math" w:hAnsi="Cambria Math"/>
           </w:rPr>
-          <m:t xml:space="preserve"> = 13 458 493 руб./год.</m:t>
+          <m:t xml:space="preserve"> = 38 683 465 руб./год.</m:t>
         </m:r>
       </m:oMath>
     </w:p>
@@ -9575,7 +9575,7 @@
                     <w:rPr>
                       <w:rFonts w:ascii="Cambria Math" w:hAnsi="Cambria Math"/>
                     </w:rPr>
-                    <m:t xml:space="preserve">1 366 320 + 8 937 600</m:t>
+                    <m:t xml:space="preserve">1 366 320 + 28 242 816</m:t>
                   </m:r>
                 </m:den>
               </m:f>
@@ -9586,7 +9586,7 @@
                 <w:rPr>
                   <w:rFonts w:ascii="Cambria Math" w:hAnsi="Cambria Math"/>
                 </w:rPr>
-                <m:t xml:space="preserve"> = 0,13.</m:t>
+                <m:t xml:space="preserve"> = 0,05.</m:t>
               </m:r>
             </m:oMath>
           </w:p>
@@ -9770,7 +9770,7 @@
                     <w:rPr>
                       <w:rFonts w:ascii="Cambria Math" w:hAnsi="Cambria Math"/>
                     </w:rPr>
-                    <m:t xml:space="preserve">13 458 493·0,13</m:t>
+                    <m:t xml:space="preserve">38 683 465·0,05</m:t>
                   </m:r>
                 </m:num>
                 <m:den>
@@ -9792,7 +9792,7 @@
                 <w:rPr>
                   <w:rFonts w:ascii="Cambria Math" w:hAnsi="Cambria Math"/>
                 </w:rPr>
-                <m:t xml:space="preserve"> = 0,58,</m:t>
+                <m:t xml:space="preserve"> = 0,64,</m:t>
               </m:r>
             </m:oMath>
           </w:p>
@@ -9994,7 +9994,7 @@
                     <w:rPr>
                       <w:rFonts w:ascii="Cambria Math" w:hAnsi="Cambria Math"/>
                     </w:rPr>
-                    <m:t xml:space="preserve">0,58</m:t>
+                    <m:t xml:space="preserve">0,64</m:t>
                   </m:r>
                 </m:den>
               </m:f>
@@ -10005,7 +10005,7 @@
                 <w:rPr>
                   <w:rFonts w:ascii="Cambria Math" w:hAnsi="Cambria Math"/>
                 </w:rPr>
-                <m:t xml:space="preserve"> = 1,72 года.</m:t>
+                <m:t xml:space="preserve"> = 1,56 года.</m:t>
               </m:r>
             </m:oMath>
           </w:p>
@@ -10029,7 +10029,7 @@
     </w:tbl>
     <w:p>
       <w:r>
-        <w:t>Срок окупаемости составляет около 21 месяцев. Для наукоёмкой продукции уровень эффективности должен быть не менее 0,5, то есть вложения должны окупаться в пределах двух лет [42]; полученное значение 0,58 этому требованию удовлетворяет. Расчёт выполнен для одного предприятия; при передаче результатов нескольким предприятиям срок окупаемости сократится.</w:t>
+        <w:t>Срок окупаемости составляет около 19 месяцев. Для наукоёмкой продукции уровень эффективности должен быть не менее 0,5, то есть вложения должны окупаться в пределах двух лет [42]; полученное значение 0,64 этому требованию удовлетворяет. Расчёт выполнен для одного предприятия; при передаче результатов нескольким предприятиям срок окупаемости сократится.</w:t>
       </w:r>
     </w:p>
     <w:sectPr>

</xml_diff>

<commit_message>
Review pass: labour safety per remarks, economics edits, 15-sheet deck
- Labour safety: 5-6 people at once, optimal microclimate, existing 8 LED
  panels confirmed by the lighting calculation (class 2, no harmful factors),
  quieter shredder, office fire class F4.3 instead of a fire-load category,
  GOST-style dimensions on figures, workplace figure fixed
- Economics: user's edits ported; relay hop from the measured link boundary;
  wording on the research result and profitability rationale
- Thesis: criteria as in the assignment, novelty point on the measured link
  boundary, conclusion item 1 clarified; stamp code without "ПЗ" as in samples
- Slides: 17 (15 sheets per the assignment), economics slide restored,
  technical slides grouped, eight proposals; group spelled as in the assignment
- Practice journal: eight proposals, group as in the assignment

Co-Authored-By: Claude Opus 5.5 <noreply@anthropic.com>
</commit_message>
<xml_diff>
--- a/docs/ekonomika/Ekonomicheskaya_chast_HaLow.docx
+++ b/docs/ekonomika/Ekonomicheskaya_chast_HaLow.docx
@@ -59,7 +59,7 @@
     </w:p>
     <w:p>
       <w:r>
-        <w:t>В результате будет получена комплексная оценка экономической обоснованности НИР и план её выполнения с определёнными сроками и объёмом финансирования. Это позволит судить, оправдано ли проведение исследования и насколько быстро окупятся вложения в него при передаче результатов предприятиям-разработчикам. Расчёты выполнены в ценах сентября 2026 г. для работы, выполняемой в г. Москве.</w:t>
+        <w:t>В результате будет получена комплексная оценка экономической обоснованности НИР и план её выполнения с определёнными сроками и объёмом финансирования. Это позволит судить, оправдано ли проведение исследования и насколько быстро окупятся вложения в него при передаче результатов предприятиям-разработчикам.</w:t>
       </w:r>
     </w:p>
     <w:p>
@@ -72,7 +72,33 @@
     </w:p>
     <w:p>
       <w:r>
-        <w:t>Целесообразность и экономическая оправданность научного исследования определяются прежде всего значимостью и новизной знаний, получаемых в результате его проведения. Количественным показателем прогрессивности НИР служит индекс научно-технической прогрессивности, который определяется балльным сравнением НТПр с уже существующим решением — базой для сравнения [42].</w:t>
+        <w:t xml:space="preserve">Целесообразность и экономическая оправданность научного исследования определяются прежде всего значимостью и новизной знаний, получаемых в результате его проведения. Количественным показателем прогрессивности НИР служит индекс научно-технической прогрессивности </w:t>
+      </w:r>
+      <m:oMath>
+        <m:sSub>
+          <m:e>
+            <m:r>
+              <w:rPr>
+                <w:rFonts w:ascii="Cambria Math" w:hAnsi="Cambria Math"/>
+              </w:rPr>
+              <m:t xml:space="preserve">J</m:t>
+            </m:r>
+          </m:e>
+          <m:sub>
+            <m:r>
+              <m:rPr>
+                <m:sty m:val="p"/>
+              </m:rPr>
+              <w:rPr>
+                <w:rFonts w:ascii="Cambria Math" w:hAnsi="Cambria Math"/>
+              </w:rPr>
+              <m:t xml:space="preserve">НТП</m:t>
+            </m:r>
+          </m:sub>
+        </m:sSub>
+      </m:oMath>
+      <w:r>
+        <w:t>, который определяется балльным сравнением НТПр с уже существующим решением — базой для сравнения [42].</w:t>
       </w:r>
     </w:p>
     <w:p>
@@ -82,7 +108,7 @@
     </w:p>
     <w:p>
       <w:r>
-        <w:t>Канал передачи данных с борта БПЛА на удалённый наземный пункт может быть построен на одной из трёх технологий нелицензируемых диапазонов (подраздел 1.3): LoRa, Wi-Fi 2,4 ГГц (IEEE 802.11) и Wi-Fi HaLow (IEEE 802.11ah). Поэтому за базы для сравнения приняты две распространённые технологии — LoRa и Wi-Fi 2,4 ГГц, а НТПр настоящей работы — канал Wi-Fi HaLow с экспериментально определёнными характеристиками и рекомендациями по его применению для связи с БПЛА.</w:t>
+        <w:t>Канал передачи данных с борта БПЛА на удалённый наземный пункт может быть построен на одной из трёх технологий (подраздел 1.3): LoRa, Wi-Fi 2,4 ГГц (IEEE 802.11) и Wi-Fi HaLow (IEEE 802.11ah). Поэтому за базы для сравнения приняты две распространённые технологии — LoRa и Wi-Fi 2,4 ГГц, а НТПр настоящей работы — канал Wi-Fi HaLow с экспериментально определёнными характеристиками и рекомендациями по его применению для связи с БПЛА.</w:t>
       </w:r>
     </w:p>
     <w:p>
@@ -2411,7 +2437,7 @@
     </w:p>
     <w:p>
       <w:r>
-        <w:t>Так как значение коэффициента больше 0,2, НИР обладает удовлетворительной новизной и её проведение целесообразно. Результат является новым по функциональному критерию и улучшенным по технологическому. Период эффективности новых технологий 2–3 года [42] согласуется с принятым сроком применения результатов — до 3 лет.</w:t>
+        <w:t>Так как значение коэффициента больше 0,2, НИР обладает удовлетворительной новизной и её проведение целесообразно. Результат является новым по функциональному критерию и улучшенным по технологическому.</w:t>
       </w:r>
     </w:p>
     <w:p>
@@ -8162,7 +8188,7 @@
         </m:sSub>
       </m:oMath>
       <w:r>
-        <w:t xml:space="preserve"> – уровень рентабельности по отношению к оплате труда, 200–400 % [42]. Принято среднее значение 300 %: результаты работы прикладные и непосредственно используются при проектировании каналов связи, что оправдывает рентабельность выше минимальной; вместе с тем они получены на одной аппаратной платформе и на коротких трассах и требуют проверки на трассах реального применения, что не позволяет принять верхнюю границу:</w:t>
+        <w:t xml:space="preserve"> – уровень рентабельности по отношению к оплате труда, 200–400 % [42]. Принято среднее значение 300 %: результаты работы прикладные и непосредственно используются при проектировании каналов связи, что оправдывает рентабельность выше минимальной; вместе с тем они получены на одной аппаратной платформе в наземных испытаниях и ещё не проверены в полёте на борту БПЛА, что не позволяет принять верхнюю границу:</w:t>
       </w:r>
     </w:p>
     <w:p>
@@ -8337,7 +8363,7 @@
         <w:keepNext/>
       </w:pPr>
       <w:r>
-        <w:t>Результатом НИР является не изделие, которое продаётся потребителю, а знания — измеренные характеристики канала Wi-Fi HaLow и рекомендации по его применению. Выручки они сами по себе не приносят; их ценность проявляется у предприятия, которое их применяет: оно решает ту же задачу с меньшими затратами. Поэтому экономический эффект НИР определяется как экономия затрат у потребителя её результатов [42]. В настоящей работе такая экономия возникает при создании линий связи с БПЛА: результаты позволяют выбрать технологию, дающую наибольшую дальность одного пролёта, и тем самым сократить число наземных ретрансляторов. Годовой экономический эффект определяется по формуле [42]</w:t>
+        <w:t>Результатом НИР является не серийное изделие, а научно-технический результат — измеренные характеристики канала Wi-Fi HaLow и рекомендации по его применению. Непосредственно выручки он не приносит; его ценность проявляется у предприятия, которое использует результаты при проектировании каналов связи: оно решает ту же задачу с меньшими затратами. Поэтому экономический эффект НИР определяется как экономия затрат у потребителя её результатов [42]. В настоящей работе такая экономия возникает при создании линий связи с БПЛА: результаты позволяют выбрать технологию, дающую наибольшую дальность одного пролёта, и тем самым сократить число наземных ретрансляторов. Годовой экономический эффект определяется по формуле [42]</w:t>
       </w:r>
     </w:p>
     <w:tbl>
@@ -8675,7 +8701,7 @@
     </w:p>
     <w:p>
       <w:r>
-        <w:t>Поэтому пролёт стремятся сделать как можно длиннее. Дальность пролёта в оценке — не расчётная, а измеренная граница связи той же пары плат T-HaLow в пересчёте на трассу прямой видимости при нормах мощности Российской Федерации (подраздел 3.6, таблица 3.10): 0,87 км для Wi-Fi 2,4 ГГц при 20 дБм и 1,55 км для Wi-Fi HaLow при 14 дБм. Несмотря на меньшую разрешённую мощность, Wi-Fi HaLow уходит дальше: допустимые потери на трассе у обеих технологий близки, а на частоте ниже 1 ГГц сигнал затухает меньше. На расстояниях от 0,87 до 1,55 км связь сохраняет только Wi-Fi HaLow.</w:t>
+        <w:t>Поэтому пролёт стремятся сделать как можно длиннее. Дальность пролёта в оценке — не расчётная, а измеренная граница связи той же пары плат T-HaLow на трассе прямой видимости при нормах мощности Российской Федерации (подраздел 3.6, таблица 3.10): 0,87 км для Wi-Fi 2,4 ГГц при 20 дБм и 1,55 км для Wi-Fi HaLow при 14 дБм. Несмотря на меньшую разрешённую мощность, Wi-Fi HaLow уходит дальше: допустимые потери на трассе у обеих технологий близки, а на частоте ниже 1 ГГц сигнал затухает меньше. На расстояниях от 0,87 до 1,55 км связь сохраняет только Wi-Fi HaLow.</w:t>
       </w:r>
     </w:p>
     <w:p>
@@ -10224,7 +10250,7 @@
               <w:sz w:val="32"/>
               <w:szCs w:val="32"/>
             </w:rPr>
-            <w:t xml:space="preserve">МАИР.460327.001 ПЗ</w:t>
+            <w:t xml:space="preserve">МАИР.460327.001</w:t>
           </w:r>
         </w:p>
       </w:tc>

</xml_diff>

<commit_message>
Labour safety review fixes, overhead breakdown, slide 14 lighting
- Labour safety: reduced room length for the index (i = 1.50), new-panel
  illuminance ~430 lx vs 287 lx at end of service life, viewing angle <= 60,
  one window, IEK dropped (KSS from the MAI manual), humidity 50/40 % as in
  the Erofeeva sample
- Economics: overhead split (rent, electricity, heating = 20 % of wages;
  admin staff and computers = remainder); note on t_min/t_max paths
- Deck: slide 14 lighting row and notes match the thesis; slide 3 as edited live
- Viewer: light theme

Co-Authored-By: Claude Opus 5.5 <noreply@anthropic.com>
</commit_message>
<xml_diff>
--- a/docs/ekonomika/Ekonomicheskaya_chast_HaLow.docx
+++ b/docs/ekonomika/Ekonomicheskaya_chast_HaLow.docx
@@ -4421,7 +4421,7 @@
     </w:p>
     <w:p>
       <w:r>
-        <w:t>Обе ветви графика от события 2 до события 4 имеют одинаковую длительность, поэтому критическими являются пути 1–2–3–4–5–6–7 и 1–2–4–5–6–7, их длина составит 69 дней. Резервов времени у работ нет, и ни один исполнитель не простаивает в ожидании результатов другого. Максимальная возможная длительность выполнения НИР составит 87 календарных дней, что удовлетворяет требованиям на срок выполнения дипломной работы, который определён с 29.09.2026 по 25.12.2026 и составляет 88 календарных дней.</w:t>
+        <w:t>Обе ветви графика от события 2 до события 4 имеют одинаковую длительность, поэтому критическими являются пути 1–2–3–4–5–6–7 и 1–2–4–5–6–7, их длина составит 69 дней. Резервов времени у работ нет, и ни один исполнитель не простаивает в ожидании результатов другого. При минимальных оценках длиннее путь через работу 2–4 (59 дней против 57), при максимальных — через работы 2–3 и 3–4 (87 дней против 84); эти значения и приведены в итоговой строке таблицы 4.4. Максимальная возможная длительность выполнения НИР составит 87 календарных дней, что удовлетворяет требованиям на срок выполнения дипломной работы, который определён с 29.09.2026 по 25.12.2026 и составляет 88 календарных дней.</w:t>
       </w:r>
     </w:p>
     <w:p>
@@ -8083,7 +8083,28 @@
     </w:p>
     <w:p>
       <w:r>
-        <w:t>Материалы и комплектующие стоят 24 560 руб., или 1,8 % себестоимости: в НИР используются недорогие серийные отладочные платы, а не специальное оборудование. К накладным расходам отнесены оплата электроэнергии, аренды и отопления помещения, заработной платы обслуживающего персонала, содержание вычислительной техники кафедры — 41,1 % себестоимости. К прочим расходам — услуги связи, поездки на полевую площадку для натурных испытаний и доступ к стандартам и научным публикациям по тематике исследования.</w:t>
+        <w:t>Материалы и комплектующие стоят 24 560 руб., или 1,8 % себестоимости: в НИР используются недорогие серийные отладочные платы, а не специальное оборудование. Накладные расходы составляют 556 238 руб., или 41,1 % себестоимости. В них входят:</w:t>
+      </w:r>
+    </w:p>
+    <w:p>
+      <w:r>
+        <w:t xml:space="preserve">– </w:t>
+      </w:r>
+      <w:r>
+        <w:t>аренда помещения, оплата электроэнергии (освещение помещения, питание компьютеров и стенда) и отопления — 20 % от заработной платы исполнителей: 0,2·541 284 = 108 257 руб.;</w:t>
+      </w:r>
+    </w:p>
+    <w:p>
+      <w:r>
+        <w:t xml:space="preserve">– </w:t>
+      </w:r>
+      <w:r>
+        <w:t>заработная плата административного и вспомогательного персонала, не участвующего в НИР (бухгалтерия, лаборанты, уборка помещений), и содержание вычислительной техники — остальные 447 981 руб.</w:t>
+      </w:r>
+    </w:p>
+    <w:p>
+      <w:r>
+        <w:t>К прочим расходам отнесены услуги связи, поездки на полевую площадку для натурных испытаний и доступ к стандартам и научным публикациям по тематике исследования.</w:t>
       </w:r>
     </w:p>
     <w:p>

</xml_diff>

<commit_message>
Labour safety: stand EMF exposure, microclimate sources, fire category; thesis rebuilt
- New 5.2.5: RF exposure of the HaLow stand estimated per SanPiN 1.2.3685-21
  (tables 5.11, 5.12): two boards at +20 dBm, 0 dBi, 0.5 m -> 6.4 uW/cm2,
  51.2 (uW/cm2)*h per shift vs 200; row added to the class table and conclusions
- Electrostatic limit 20 kV/m per shift instead of the cancelled 15 kV/m PC norm
- Microclimate: temperature from the AC setpoint, humidity from a household
  hygrometer, air speed taken at the optimal limit; no reference to other theses
- Fire category: scope of categories per 123-FZ art. 27 and SP 12.13130 p. 1.1
- Main text review fixes from 22.10 (noise floor 25-28 dB, SNR 30-38 dB,
  2-3x daily variation, 8->4 MHz formula, wording without "niche") rebuilt in

Co-Authored-By: Claude Opus 5.5 <noreply@anthropic.com>
</commit_message>
<xml_diff>
--- a/docs/ekonomika/Ekonomicheskaya_chast_HaLow.docx
+++ b/docs/ekonomika/Ekonomicheskaya_chast_HaLow.docx
@@ -22,7 +22,7 @@
     </w:p>
     <w:p>
       <w:r>
-        <w:t>Исследование должно дать разработчикам систем связи БПЛА измеренные характеристики канала Wi-Fi HaLow — дальность, уровень сигнала, задержку, потери пакетов и скорость передачи видео. По ним разработчик выбирает технологию канала и дальность пролёта ретрансляционной линии и тем самым сокращает затраты на создание линий связи с БПЛА. При этом экономический эффект от применения результатов НИР должен перекрывать затраты на её выполнение. Необходимо убедиться в научной новизне, эффективности и окупаемости исследования, для чего по методике [43] выполняются:</w:t>
+        <w:t>Исследование должно дать разработчикам систем связи БПЛА измеренные характеристики канала Wi-Fi HaLow — дальность, уровень сигнала, задержку, потери пакетов и скорость передачи видео. По ним разработчик выбирает технологию канала и дальность пролёта ретрансляционной линии и тем самым сокращает затраты на создание линий связи с БПЛА. При этом экономический эффект от применения результатов НИР должен перекрывать затраты на её выполнение. Необходимо убедиться в научной новизне, эффективности и окупаемости исследования, для чего по методике [45] выполняются:</w:t>
       </w:r>
     </w:p>
     <w:p>
@@ -98,12 +98,12 @@
         </m:sSub>
       </m:oMath>
       <w:r>
-        <w:t>, который определяется балльным сравнением НТПр с уже существующим решением — базой для сравнения [43].</w:t>
+        <w:t>, который определяется балльным сравнением НТПр с уже существующим решением — базой для сравнения [45].</w:t>
       </w:r>
     </w:p>
     <w:p>
       <w:r>
-        <w:t>Сравнение проводится по трём признакам: научно-технический уровень (новизна), перспективность и возможность применения результатов. Баллы назначаются по ориентировочным шкалам методики [43]. Научно-технический уровень оценивается от 1–2 баллов («тривиальный») до 9–10 («превышает мировые достижения»), перспективность — от 1–4 («полезная») до 8–10 («первостепенной важности»), возможность применения — в зависимости от масштаба (предприятие, отрасль, народное хозяйство) и срока применения результатов. Значимость признаков принята по таблице 2.3 методики.</w:t>
+        <w:t>Сравнение проводится по трём признакам: научно-технический уровень (новизна), перспективность и возможность применения результатов. Баллы назначаются по ориентировочным шкалам методики [45]. Научно-технический уровень оценивается от 1–2 баллов («тривиальный») до 9–10 («превышает мировые достижения»), перспективность — от 1–4 («полезная») до 8–10 («первостепенной важности»), возможность применения — в зависимости от масштаба (предприятие, отрасль, народное хозяйство) и срока применения результатов. Значимость признаков принята по таблице 2.3 методики.</w:t>
       </w:r>
     </w:p>
     <w:p>
@@ -1613,7 +1613,7 @@
     </w:p>
     <w:p>
       <w:r>
-        <w:t>Помимо прогрессивности, целесообразность НИР характеризует новизна её результатов. Функционально результат отличается от баз тем, что канал Wi-Fi HaLow передаёт видео на расстояниях, где скорость Wi-Fi 2,4 ГГц падает ниже необходимой для видео, а LoRa видео не передаёт вовсе. Технологически — тем, что Wi-Fi HaLow и Wi-Fi 2,4 ГГц сравнены на одной аппаратной платформе. Производственный, социальный и юридический критерии остаются на существующем уровне. Новизна оценивается по ориентировочной шкале методики [43]: принципиально новое — 5 баллов, новое — 3, улучшенное — 2, существующего уровня — 1, устаревшее — 0. Оценка приведена в таблице 4.2.</w:t>
+        <w:t>Помимо прогрессивности, целесообразность НИР характеризует новизна её результатов. Функционально результат отличается от баз тем, что канал Wi-Fi HaLow передаёт видео на расстояниях, где скорость Wi-Fi 2,4 ГГц падает ниже необходимой для видео, а LoRa видео не передаёт вовсе. Технологически — тем, что Wi-Fi HaLow и Wi-Fi 2,4 ГГц сравнены на одной аппаратной платформе. Производственный, социальный и юридический критерии остаются на существующем уровне. Новизна оценивается по ориентировочной шкале методики [45]: принципиально новое — 5 баллов, новое — 3, улучшенное — 2, существующего уровня — 1, устаревшее — 0. Оценка приведена в таблице 4.2.</w:t>
       </w:r>
     </w:p>
     <w:p>
@@ -2450,7 +2450,7 @@
     </w:p>
     <w:p>
       <w:r>
-        <w:t>После подтверждения целесообразности НИР ключевым этапом её планирования становятся расчёт трудоёмкости и построение сетевого графика. Затраты труда и его оплата составляют основную часть себестоимости исследования, а сетевой график показывает, в какой последовательности выполняются работы, какие из них можно вести параллельно и укладывается ли НИР в заданный срок. По методике [43] НИР делится на четыре стадии:</w:t>
+        <w:t>После подтверждения целесообразности НИР ключевым этапом её планирования становятся расчёт трудоёмкости и построение сетевого графика. Затраты труда и его оплата составляют основную часть себестоимости исследования, а сетевой график показывает, в какой последовательности выполняются работы, какие из них можно вести параллельно и укладывается ли НИР в заданный срок. По методике [45] НИР делится на четыре стадии:</w:t>
       </w:r>
     </w:p>
     <w:p>
@@ -2954,7 +2954,7 @@
         </m:sSub>
       </m:oMath>
       <w:r>
-        <w:t xml:space="preserve"> — при наиболее неблагоприятном; ожидаемая продолжительность [43]:</w:t>
+        <w:t xml:space="preserve"> — при наиболее неблагоприятном; ожидаемая продолжительность [45]:</w:t>
       </w:r>
     </w:p>
     <w:tbl>
@@ -4434,7 +4434,7 @@
     </w:p>
     <w:p>
       <w:r>
-        <w:t>Как уже было сказано выше, основной статьёй расходов при проведении НИР является оплата труда исполнителей. Затраты на неё определяются как сумма затрат на выполнение каждой работы, которые в свою очередь являются произведением трудоёмкости работы на дневную ставку исполнителя [43].</w:t>
+        <w:t>Как уже было сказано выше, основной статьёй расходов при проведении НИР является оплата труда исполнителей. Затраты на неё определяются как сумма затрат на выполнение каждой работы, которые в свою очередь являются произведением трудоёмкости работы на дневную ставку исполнителя [45].</w:t>
       </w:r>
     </w:p>
     <w:p>
@@ -4444,7 +4444,7 @@
     </w:p>
     <w:p>
       <w:r>
-        <w:t>Месячные оклады исполнителей приняты по данным рынка труда г. Москвы для специалистов соответствующей квалификации [44]: руководитель НИР — 175 000 руб., инженер-исследователь и инженер-программист — 102 900 руб., техник — 90 000 руб. Дневная ставка равна окладу, умноженному на 12 и делённому на 247 рабочих дней 2026 г. [45].</w:t>
+        <w:t>Месячные оклады исполнителей приняты по данным рынка труда г. Москвы для специалистов соответствующей квалификации [46]: руководитель НИР — 175 000 руб., инженер-исследователь и инженер-программист — 102 900 руб., техник — 90 000 руб. Дневная ставка равна окладу, умноженному на 12 и делённому на 247 рабочих дней 2026 г. [47].</w:t>
       </w:r>
     </w:p>
     <w:p>
@@ -5713,7 +5713,7 @@
         <w:keepNext/>
       </w:pPr>
       <w:r>
-        <w:t>Помимо основных выплат исполнителям предусмотрена премия 20 % [43] за добросовестное выполнение и своевременную сдачу этапов НИР. Фонд оплаты труда, выделяемый на НИР:</w:t>
+        <w:t>Помимо основных выплат исполнителям предусмотрена премия 20 % [45] за добросовестное выполнение и своевременную сдачу этапов НИР. Фонд оплаты труда, выделяемый на НИР:</w:t>
       </w:r>
     </w:p>
     <w:p>
@@ -5756,7 +5756,7 @@
     </w:p>
     <w:p>
       <w:r>
-        <w:t>К расходам на персонал относятся также отчисления на социальные нужды. Согласно действующим нормативам их суммарный тариф составляет 30,2 % от фонда оплаты труда: единый тариф страховых взносов 30 % [46] и взносы на страхование от несчастных случаев на производстве 0,2 %. Эти средства включают:</w:t>
+        <w:t>К расходам на персонал относятся также отчисления на социальные нужды. Согласно действующим нормативам их суммарный тариф составляет 30,2 % от фонда оплаты труда: единый тариф страховых взносов 30 % [48] и взносы на страхование от несчастных случаев на производстве 0,2 %. Эти средства включают:</w:t>
       </w:r>
     </w:p>
     <w:p>
@@ -5839,7 +5839,7 @@
     </w:p>
     <w:p>
       <w:r>
-        <w:t>Затраты на материалы, полуфабрикаты и покупные комплектующие изделия определены прямым счётом (таблица 4.6). К ним отнесены платы LilyGO T-HaLow, модули камеры, микросхемы флеш-памяти и программатор, кабели, аккумуляторы с зарядным устройством, а также бумага, картриджи для принтера и канцелярские принадлежности. Цена платы LilyGO T-HaLow 37,98 долл. США [28] по курсу 84,1975 руб./долл. на 20.09.2026 [47] составляет 3 198 руб.</w:t>
+        <w:t>Затраты на материалы, полуфабрикаты и покупные комплектующие изделия определены прямым счётом (таблица 4.6). К ним отнесены платы LilyGO T-HaLow, модули камеры, микросхемы флеш-памяти и программатор, кабели, аккумуляторы с зарядным устройством, а также бумага, картриджи для принтера и канцелярские принадлежности. Цена платы LilyGO T-HaLow 37,98 долл. США [30] по курсу 84,1975 руб./долл. на 20.09.2026 [49] составляет 3 198 руб.</w:t>
       </w:r>
     </w:p>
     <w:p>
@@ -7339,7 +7339,7 @@
         </m:sSub>
       </m:oMath>
       <w:r>
-        <w:t xml:space="preserve"> в себестоимости [43]:</w:t>
+        <w:t xml:space="preserve"> в себестоимости [45]:</w:t>
       </w:r>
     </w:p>
     <w:tbl>
@@ -7497,7 +7497,7 @@
         <w:keepNext/>
       </w:pPr>
       <w:r>
-        <w:t xml:space="preserve">В типовой структуре затрат на НИР удельный вес заработной платы составляет 34 % [43]. В настоящей работе он принят выше — </w:t>
+        <w:t xml:space="preserve">В типовой структуре затрат на НИР удельный вес заработной платы составляет 34 % [45]. В настоящей работе он принят выше — </w:t>
       </w:r>
       <m:oMath>
         <m:sSub>
@@ -7608,7 +7608,7 @@
     </w:p>
     <w:p>
       <w:r>
-        <w:t>Поэлементная структура затрат на НИР приведена в таблице 4.7. Материалы и покупные комплектующие изделия взяты по прямому счёту (таблица 4.6), заработная плата — по фонду оплаты труда, расходы на социальные нужды — по тарифу 30,2 % от него, прочие расходы — 5 % себестоимости [43]. Накладные расходы составляют оставшуюся часть себестоимости.</w:t>
+        <w:t>Поэлементная структура затрат на НИР приведена в таблице 4.7. Материалы и покупные комплектующие изделия взяты по прямому счёту (таблица 4.6), заработная плата — по фонду оплаты труда, расходы на социальные нужды — по тарифу 30,2 % от него, прочие расходы — 5 % себестоимости [45]. Накладные расходы составляют оставшуюся часть себестоимости.</w:t>
       </w:r>
     </w:p>
     <w:p>
@@ -8112,7 +8112,7 @@
         <w:keepNext/>
       </w:pPr>
       <w:r>
-        <w:t>Цена НИР определяется исходя из обеспечения безубыточности организации, которая её выполняет [43]. Параметром, обеспечивающим безубыточность, служит уровень рентабельности по отношению к оплате труда:</w:t>
+        <w:t>Цена НИР определяется исходя из обеспечения безубыточности организации, которая её выполняет [45]. Параметром, обеспечивающим безубыточность, служит уровень рентабельности по отношению к оплате труда:</w:t>
       </w:r>
     </w:p>
     <w:tbl>
@@ -8344,7 +8344,7 @@
         </m:sSub>
       </m:oMath>
       <w:r>
-        <w:t xml:space="preserve"> – уровень рентабельности по отношению к оплате труда, 200–400 % [43]. Принято среднее значение 300 %: результаты работы прикладные и непосредственно используются при проектировании каналов связи, что оправдывает рентабельность выше минимальной; вместе с тем они получены на одной аппаратной платформе в наземных испытаниях и ещё не проверены в полёте на борту БПЛА, что не позволяет принять верхнюю границу:</w:t>
+        <w:t xml:space="preserve"> – уровень рентабельности по отношению к оплате труда, 200–400 % [45]. Принято среднее значение 300 %: результаты работы прикладные и непосредственно используются при проектировании каналов связи, что оправдывает рентабельность выше минимальной; вместе с тем они получены на одной аппаратной платформе в наземных испытаниях и ещё не проверены в полёте на борту БПЛА, что не позволяет принять верхнюю границу:</w:t>
       </w:r>
     </w:p>
     <w:p>
@@ -8511,7 +8511,7 @@
         </m:sSub>
       </m:oMath>
       <w:r>
-        <w:t xml:space="preserve"> [43].</w:t>
+        <w:t xml:space="preserve"> [45].</w:t>
       </w:r>
     </w:p>
     <w:p>
@@ -8519,7 +8519,7 @@
         <w:keepNext/>
       </w:pPr>
       <w:r>
-        <w:t>Результатом НИР является не серийное изделие, а научно-технический результат — измеренные характеристики канала Wi-Fi HaLow и рекомендации по его применению. Непосредственно выручки он не приносит; его ценность проявляется у предприятия, которое использует результаты при проектировании каналов связи: оно решает ту же задачу с меньшими затратами. Поэтому экономический эффект НИР определяется как экономия затрат у потребителя её результатов [43]. В настоящей работе такая экономия возникает при создании линий связи с БПЛА: результаты позволяют выбрать технологию, дающую наибольшую дальность одного пролёта, и тем самым сократить число наземных ретрансляторов. Годовой экономический эффект определяется по формуле [43]</w:t>
+        <w:t>Результатом НИР является не серийное изделие, а научно-технический результат — измеренные характеристики канала Wi-Fi HaLow и рекомендации по его применению. Непосредственно выручки он не приносит; его ценность проявляется у предприятия, которое использует результаты при проектировании каналов связи: оно решает ту же задачу с меньшими затратами. Поэтому экономический эффект НИР определяется как экономия затрат у потребителя её результатов [45]. В настоящей работе такая экономия возникает при создании линий связи с БПЛА: результаты позволяют выбрать технологию, дающую наибольшую дальность одного пролёта, и тем самым сократить число наземных ретрансляторов. Годовой экономический эффект определяется по формуле [45]</w:t>
       </w:r>
     </w:p>
     <w:tbl>
@@ -9307,7 +9307,7 @@
         <w:keepNext/>
       </w:pPr>
       <w:r>
-        <w:t>Ретранслятор ставится в конце каждого пролёта, поэтому на маршрутах общей протяжённостью L требуется N = ⌈L/d⌉ ретрансляторов, где d — дальность пролёта. Объём применения оценён по облёту линий электропередачи — одной из задач мониторинга местности, по которой есть сводные данные о протяжённости: под управлением группы «Россети» находится 2,5 млн км линий электропередачи [48]. Если каналами связи с БПЛА ежегодно оснащается 0,24 % этой сети, то есть L = 6 000 км, потребуется ретрансляторов:</w:t>
+        <w:t>Ретранслятор ставится в конце каждого пролёта, поэтому на маршрутах общей протяжённостью L требуется N = ⌈L/d⌉ ретрансляторов, где d — дальность пролёта. Объём применения оценён по облёту линий электропередачи — одной из задач мониторинга местности, по которой есть сводные данные о протяжённости: под управлением группы «Россети» находится 2,5 млн км линий электропередачи [50]. Если каналами связи с БПЛА ежегодно оснащается 0,24 % этой сети, то есть L = 6 000 км, потребуется ретрансляторов:</w:t>
       </w:r>
     </w:p>
     <w:p>
@@ -9589,7 +9589,7 @@
         <w:keepNext/>
       </w:pPr>
       <w:r>
-        <w:t>Эффект реализуется у предприятия, применяющего результаты; разработчику НИР по условиям лицензирования приходится его доля α. По методике [43] она определяется укрупнённо, пропорционально затратам участников создания и применения НТПр:</w:t>
+        <w:t>Эффект реализуется у предприятия, применяющего результаты; разработчику НИР по условиям лицензирования приходится его доля α. По методике [45] она определяется укрупнённо, пропорционально затратам участников создания и применения НТПр:</w:t>
       </w:r>
     </w:p>
     <w:tbl>
@@ -9795,7 +9795,7 @@
         <w:keepNext/>
       </w:pPr>
       <w:r>
-        <w:t>Уровень экономической эффективности затрат на НИР [43]:</w:t>
+        <w:t>Уровень экономической эффективности затрат на НИР [45]:</w:t>
       </w:r>
     </w:p>
     <w:tbl>
@@ -10211,7 +10211,7 @@
     </w:tbl>
     <w:p>
       <w:r>
-        <w:t>Срок окупаемости составляет около 18 месяцев. Для наукоёмкой продукции уровень эффективности должен быть не менее 0,5, то есть вложения должны окупаться в пределах двух лет [43]; полученное значение 0,65 этому требованию удовлетворяет. Расчёт выполнен для одного предприятия; при передаче результатов нескольким предприятиям срок окупаемости сократится.</w:t>
+        <w:t>Срок окупаемости составляет около 18 месяцев. Для наукоёмкой продукции уровень эффективности должен быть не менее 0,5, то есть вложения должны окупаться в пределах двух лет [45]; полученное значение 0,65 этому требованию удовлетворяет. Расчёт выполнен для одного предприятия; при передаче результатов нескольким предприятиям срок окупаемости сократится.</w:t>
       </w:r>
     </w:p>
     <w:p>

</xml_diff>